<commit_message>
docs: add official candidate, mentor, and college details to all deliverables
</commit_message>
<xml_diff>
--- a/FINAL_REPORT.docx
+++ b/FINAL_REPORT.docx
@@ -8,11 +8,12 @@
       </w:pPr>
       <w:r>
         <w:rPr>
-          <w:rFonts w:ascii="Helvetica" w:hAnsi="Helvetica" w:cs="Helvetica"/>
+          <w:rFonts w:ascii="Helvetica Neue" w:hAnsi="Helvetica Neue" w:cs="Helvetica Neue"/>
           <w:sz w:val="48"/>
           <w:sz-cs w:val="48"/>
           <w:b/>
           <w:spacing w:val="0"/>
+          <w:color w:val="0D121F"/>
         </w:rPr>
         <w:t xml:space="preserve">FINAL PROJECT REPORT</w:t>
       </w:r>
@@ -23,13 +24,14 @@
       </w:pPr>
       <w:r>
         <w:rPr>
-          <w:rFonts w:ascii="Helvetica" w:hAnsi="Helvetica" w:cs="Helvetica"/>
+          <w:rFonts w:ascii="Helvetica Neue" w:hAnsi="Helvetica Neue" w:cs="Helvetica Neue"/>
           <w:sz w:val="36"/>
           <w:sz-cs w:val="36"/>
           <w:b/>
           <w:spacing w:val="0"/>
-        </w:rPr>
-        <w:t xml:space="preserve">Locality-Level Air and Noise Pollution Mapping and Automated Surveillance Dashboard</w:t>
+          <w:color w:val="172A9F"/>
+        </w:rPr>
+        <w:t xml:space="preserve">Air and Noise Pollution Mapping</w:t>
       </w:r>
     </w:p>
     <w:p>
@@ -38,10 +40,11 @@
       </w:pPr>
       <w:r>
         <w:rPr>
-          <w:rFonts w:ascii="Helvetica" w:hAnsi="Helvetica" w:cs="Helvetica"/>
-          <w:sz w:val="24"/>
-          <w:sz-cs w:val="24"/>
-          <w:b/>
+          <w:rFonts w:ascii="Helvetica Neue" w:hAnsi="Helvetica Neue" w:cs="Helvetica Neue"/>
+          <w:sz w:val="24"/>
+          <w:sz-cs w:val="24"/>
+          <w:b/>
+          <w:color w:val="171E2D"/>
         </w:rPr>
         <w:t xml:space="preserve"/>
         <w:tab/>
@@ -51,22 +54,24 @@
       </w:r>
       <w:r>
         <w:rPr>
-          <w:rFonts w:ascii="Helvetica" w:hAnsi="Helvetica" w:cs="Helvetica"/>
-          <w:sz w:val="24"/>
-          <w:sz-cs w:val="24"/>
-          <w:b/>
-          <w:spacing w:val="0"/>
-        </w:rPr>
-        <w:t xml:space="preserve">Document Type</w:t>
-      </w:r>
-      <w:r>
-        <w:rPr>
-          <w:rFonts w:ascii="Helvetica" w:hAnsi="Helvetica" w:cs="Helvetica"/>
-          <w:sz w:val="24"/>
-          <w:sz-cs w:val="24"/>
-          <w:spacing w:val="0"/>
-        </w:rPr>
-        <w:t xml:space="preserve">: Final Academic Field Project Report</w:t>
+          <w:rFonts w:ascii="Helvetica Neue" w:hAnsi="Helvetica Neue" w:cs="Helvetica Neue"/>
+          <w:sz w:val="24"/>
+          <w:sz-cs w:val="24"/>
+          <w:b/>
+          <w:spacing w:val="0"/>
+          <w:color w:val="171E2D"/>
+        </w:rPr>
+        <w:t xml:space="preserve">Course / Program</w:t>
+      </w:r>
+      <w:r>
+        <w:rPr>
+          <w:rFonts w:ascii="Helvetica Neue" w:hAnsi="Helvetica Neue" w:cs="Helvetica Neue"/>
+          <w:sz w:val="24"/>
+          <w:sz-cs w:val="24"/>
+          <w:spacing w:val="0"/>
+          <w:color w:val="171E2D"/>
+        </w:rPr>
+        <w:t xml:space="preserve">: B.Sc. T.Y. CS</w:t>
       </w:r>
     </w:p>
     <w:p>
@@ -75,10 +80,11 @@
       </w:pPr>
       <w:r>
         <w:rPr>
-          <w:rFonts w:ascii="Helvetica" w:hAnsi="Helvetica" w:cs="Helvetica"/>
-          <w:sz w:val="24"/>
-          <w:sz-cs w:val="24"/>
-          <w:b/>
+          <w:rFonts w:ascii="Helvetica Neue" w:hAnsi="Helvetica Neue" w:cs="Helvetica Neue"/>
+          <w:sz w:val="24"/>
+          <w:sz-cs w:val="24"/>
+          <w:b/>
+          <w:color w:val="171E2D"/>
         </w:rPr>
         <w:t xml:space="preserve"/>
         <w:tab/>
@@ -88,22 +94,24 @@
       </w:r>
       <w:r>
         <w:rPr>
-          <w:rFonts w:ascii="Helvetica" w:hAnsi="Helvetica" w:cs="Helvetica"/>
-          <w:sz w:val="24"/>
-          <w:sz-cs w:val="24"/>
-          <w:b/>
-          <w:spacing w:val="0"/>
-        </w:rPr>
-        <w:t xml:space="preserve">Course / Subject</w:t>
-      </w:r>
-      <w:r>
-        <w:rPr>
-          <w:rFonts w:ascii="Helvetica" w:hAnsi="Helvetica" w:cs="Helvetica"/>
-          <w:sz w:val="24"/>
-          <w:sz-cs w:val="24"/>
-          <w:spacing w:val="0"/>
-        </w:rPr>
-        <w:t xml:space="preserve">: Core Engineering / Environmental Informatics Field Project</w:t>
+          <w:rFonts w:ascii="Helvetica Neue" w:hAnsi="Helvetica Neue" w:cs="Helvetica Neue"/>
+          <w:sz w:val="24"/>
+          <w:sz-cs w:val="24"/>
+          <w:b/>
+          <w:spacing w:val="0"/>
+          <w:color w:val="171E2D"/>
+        </w:rPr>
+        <w:t xml:space="preserve">Name of the Student</w:t>
+      </w:r>
+      <w:r>
+        <w:rPr>
+          <w:rFonts w:ascii="Helvetica Neue" w:hAnsi="Helvetica Neue" w:cs="Helvetica Neue"/>
+          <w:sz w:val="24"/>
+          <w:sz-cs w:val="24"/>
+          <w:spacing w:val="0"/>
+          <w:color w:val="171E2D"/>
+        </w:rPr>
+        <w:t xml:space="preserve">: Manav Singh</w:t>
       </w:r>
     </w:p>
     <w:p>
@@ -112,10 +120,11 @@
       </w:pPr>
       <w:r>
         <w:rPr>
-          <w:rFonts w:ascii="Helvetica" w:hAnsi="Helvetica" w:cs="Helvetica"/>
-          <w:sz w:val="24"/>
-          <w:sz-cs w:val="24"/>
-          <w:b/>
+          <w:rFonts w:ascii="Helvetica Neue" w:hAnsi="Helvetica Neue" w:cs="Helvetica Neue"/>
+          <w:sz w:val="24"/>
+          <w:sz-cs w:val="24"/>
+          <w:b/>
+          <w:color w:val="171E2D"/>
         </w:rPr>
         <w:t xml:space="preserve"/>
         <w:tab/>
@@ -125,22 +134,24 @@
       </w:r>
       <w:r>
         <w:rPr>
-          <w:rFonts w:ascii="Helvetica" w:hAnsi="Helvetica" w:cs="Helvetica"/>
-          <w:sz w:val="24"/>
-          <w:sz-cs w:val="24"/>
-          <w:b/>
-          <w:spacing w:val="0"/>
-        </w:rPr>
-        <w:t xml:space="preserve">Candidate Name</w:t>
-      </w:r>
-      <w:r>
-        <w:rPr>
-          <w:rFonts w:ascii="Helvetica" w:hAnsi="Helvetica" w:cs="Helvetica"/>
-          <w:sz w:val="24"/>
-          <w:sz-cs w:val="24"/>
-          <w:spacing w:val="0"/>
-        </w:rPr>
-        <w:t xml:space="preserve">: Manav Singh</w:t>
+          <w:rFonts w:ascii="Helvetica Neue" w:hAnsi="Helvetica Neue" w:cs="Helvetica Neue"/>
+          <w:sz w:val="24"/>
+          <w:sz-cs w:val="24"/>
+          <w:b/>
+          <w:spacing w:val="0"/>
+          <w:color w:val="171E2D"/>
+        </w:rPr>
+        <w:t xml:space="preserve">Roll No. / Seat No.</w:t>
+      </w:r>
+      <w:r>
+        <w:rPr>
+          <w:rFonts w:ascii="Helvetica Neue" w:hAnsi="Helvetica Neue" w:cs="Helvetica Neue"/>
+          <w:sz w:val="24"/>
+          <w:sz-cs w:val="24"/>
+          <w:spacing w:val="0"/>
+          <w:color w:val="171E2D"/>
+        </w:rPr>
+        <w:t xml:space="preserve">: 26753</w:t>
       </w:r>
     </w:p>
     <w:p>
@@ -149,10 +160,11 @@
       </w:pPr>
       <w:r>
         <w:rPr>
-          <w:rFonts w:ascii="Helvetica" w:hAnsi="Helvetica" w:cs="Helvetica"/>
-          <w:sz w:val="24"/>
-          <w:sz-cs w:val="24"/>
-          <w:b/>
+          <w:rFonts w:ascii="Helvetica Neue" w:hAnsi="Helvetica Neue" w:cs="Helvetica Neue"/>
+          <w:sz w:val="24"/>
+          <w:sz-cs w:val="24"/>
+          <w:b/>
+          <w:color w:val="171E2D"/>
         </w:rPr>
         <w:t xml:space="preserve"/>
         <w:tab/>
@@ -162,26 +174,148 @@
       </w:r>
       <w:r>
         <w:rPr>
-          <w:rFonts w:ascii="Helvetica" w:hAnsi="Helvetica" w:cs="Helvetica"/>
-          <w:sz w:val="24"/>
-          <w:sz-cs w:val="24"/>
-          <w:b/>
-          <w:spacing w:val="0"/>
-        </w:rPr>
-        <w:t xml:space="preserve">Repository</w:t>
-      </w:r>
-      <w:r>
-        <w:rPr>
-          <w:rFonts w:ascii="Helvetica" w:hAnsi="Helvetica" w:cs="Helvetica"/>
-          <w:sz w:val="24"/>
-          <w:sz-cs w:val="24"/>
-          <w:spacing w:val="0"/>
+          <w:rFonts w:ascii="Helvetica Neue" w:hAnsi="Helvetica Neue" w:cs="Helvetica Neue"/>
+          <w:sz w:val="24"/>
+          <w:sz-cs w:val="24"/>
+          <w:b/>
+          <w:spacing w:val="0"/>
+          <w:color w:val="171E2D"/>
+        </w:rPr>
+        <w:t xml:space="preserve">Name of the Faculty Mentor</w:t>
+      </w:r>
+      <w:r>
+        <w:rPr>
+          <w:rFonts w:ascii="Helvetica Neue" w:hAnsi="Helvetica Neue" w:cs="Helvetica Neue"/>
+          <w:sz w:val="24"/>
+          <w:sz-cs w:val="24"/>
+          <w:spacing w:val="0"/>
+          <w:color w:val="171E2D"/>
+        </w:rPr>
+        <w:t xml:space="preserve">: Seema Sharma</w:t>
+      </w:r>
+    </w:p>
+    <w:p>
+      <w:pPr>
+        <w:ind w:left="720" w:first-line="-720"/>
+      </w:pPr>
+      <w:r>
+        <w:rPr>
+          <w:rFonts w:ascii="Helvetica Neue" w:hAnsi="Helvetica Neue" w:cs="Helvetica Neue"/>
+          <w:sz w:val="24"/>
+          <w:sz-cs w:val="24"/>
+          <w:b/>
+          <w:color w:val="171E2D"/>
+        </w:rPr>
+        <w:t xml:space="preserve"/>
+        <w:tab/>
+        <w:t xml:space="preserve">•</w:t>
+        <w:tab/>
+        <w:t xml:space="preserve"/>
+      </w:r>
+      <w:r>
+        <w:rPr>
+          <w:rFonts w:ascii="Helvetica Neue" w:hAnsi="Helvetica Neue" w:cs="Helvetica Neue"/>
+          <w:sz w:val="24"/>
+          <w:sz-cs w:val="24"/>
+          <w:b/>
+          <w:spacing w:val="0"/>
+          <w:color w:val="171E2D"/>
+        </w:rPr>
+        <w:t xml:space="preserve">Name of the Institute / College</w:t>
+      </w:r>
+      <w:r>
+        <w:rPr>
+          <w:rFonts w:ascii="Helvetica Neue" w:hAnsi="Helvetica Neue" w:cs="Helvetica Neue"/>
+          <w:sz w:val="24"/>
+          <w:sz-cs w:val="24"/>
+          <w:spacing w:val="0"/>
+          <w:color w:val="171E2D"/>
+        </w:rPr>
+        <w:t xml:space="preserve">: Kalyan Welfare Society's Model College of Science and Commerce</w:t>
+      </w:r>
+    </w:p>
+    <w:p>
+      <w:pPr>
+        <w:ind w:left="720" w:first-line="-720"/>
+      </w:pPr>
+      <w:r>
+        <w:rPr>
+          <w:rFonts w:ascii="Helvetica Neue" w:hAnsi="Helvetica Neue" w:cs="Helvetica Neue"/>
+          <w:sz w:val="24"/>
+          <w:sz-cs w:val="24"/>
+          <w:b/>
+          <w:color w:val="171E2D"/>
+        </w:rPr>
+        <w:t xml:space="preserve"/>
+        <w:tab/>
+        <w:t xml:space="preserve">•</w:t>
+        <w:tab/>
+        <w:t xml:space="preserve"/>
+      </w:r>
+      <w:r>
+        <w:rPr>
+          <w:rFonts w:ascii="Helvetica Neue" w:hAnsi="Helvetica Neue" w:cs="Helvetica Neue"/>
+          <w:sz w:val="24"/>
+          <w:sz-cs w:val="24"/>
+          <w:b/>
+          <w:spacing w:val="0"/>
+          <w:color w:val="171E2D"/>
+        </w:rPr>
+        <w:t xml:space="preserve">Academic Year</w:t>
+      </w:r>
+      <w:r>
+        <w:rPr>
+          <w:rFonts w:ascii="Helvetica Neue" w:hAnsi="Helvetica Neue" w:cs="Helvetica Neue"/>
+          <w:sz w:val="24"/>
+          <w:sz-cs w:val="24"/>
+          <w:spacing w:val="0"/>
+          <w:color w:val="171E2D"/>
+        </w:rPr>
+        <w:t xml:space="preserve">: 2025–2026</w:t>
+      </w:r>
+    </w:p>
+    <w:p>
+      <w:pPr>
+        <w:ind w:left="720" w:first-line="-720"/>
+      </w:pPr>
+      <w:r>
+        <w:rPr>
+          <w:rFonts w:ascii="Helvetica Neue" w:hAnsi="Helvetica Neue" w:cs="Helvetica Neue"/>
+          <w:sz w:val="24"/>
+          <w:sz-cs w:val="24"/>
+          <w:b/>
+          <w:color w:val="171E2D"/>
+        </w:rPr>
+        <w:t xml:space="preserve"/>
+        <w:tab/>
+        <w:t xml:space="preserve">•</w:t>
+        <w:tab/>
+        <w:t xml:space="preserve"/>
+      </w:r>
+      <w:r>
+        <w:rPr>
+          <w:rFonts w:ascii="Helvetica Neue" w:hAnsi="Helvetica Neue" w:cs="Helvetica Neue"/>
+          <w:sz w:val="24"/>
+          <w:sz-cs w:val="24"/>
+          <w:b/>
+          <w:spacing w:val="0"/>
+          <w:color w:val="171E2D"/>
+        </w:rPr>
+        <w:t xml:space="preserve">Project Repository</w:t>
+      </w:r>
+      <w:r>
+        <w:rPr>
+          <w:rFonts w:ascii="Helvetica Neue" w:hAnsi="Helvetica Neue" w:cs="Helvetica Neue"/>
+          <w:sz w:val="24"/>
+          <w:sz-cs w:val="24"/>
+          <w:spacing w:val="0"/>
+          <w:color w:val="171E2D"/>
         </w:rPr>
         <w:t xml:space="preserve">: </w:t>
       </w:r>
       <w:r>
         <w:rPr>
-          <w:rFonts w:ascii="Helvetica" w:hAnsi="Helvetica" w:cs="Helvetica"/>
+          <w:rFonts w:ascii="Helvetica Neue" w:hAnsi="Helvetica Neue" w:cs="Helvetica Neue"/>
           <w:sz w:val="24"/>
           <w:sz-cs w:val="24"/>
           <w:u w:val="single"/>
@@ -192,19 +326,20 @@
       </w:r>
       <w:r>
         <w:rPr>
-          <w:rFonts w:ascii="Helvetica" w:hAnsi="Helvetica" w:cs="Helvetica"/>
-          <w:sz w:val="24"/>
-          <w:sz-cs w:val="24"/>
-          <w:spacing w:val="0"/>
-        </w:rPr>
-        <w:t xml:space="preserve"/>
-      </w:r>
-    </w:p>
-    <w:p>
-      <w:pPr/>
-      <w:r>
-        <w:rPr>
-          <w:rFonts w:ascii="Helvetica" w:hAnsi="Helvetica" w:cs="Helvetica"/>
+          <w:rFonts w:ascii="Helvetica Neue" w:hAnsi="Helvetica Neue" w:cs="Helvetica Neue"/>
+          <w:sz w:val="24"/>
+          <w:sz-cs w:val="24"/>
+          <w:spacing w:val="0"/>
+          <w:color w:val="171E2D"/>
+        </w:rPr>
+        <w:t xml:space="preserve"/>
+      </w:r>
+    </w:p>
+    <w:p>
+      <w:pPr/>
+      <w:r>
+        <w:rPr>
+          <w:rFonts w:ascii="Helvetica Neue" w:hAnsi="Helvetica Neue" w:cs="Helvetica Neue"/>
           <w:sz w:val="24"/>
           <w:sz-cs w:val="24"/>
           <w:spacing w:val="0"/>
@@ -219,11 +354,12 @@
       </w:pPr>
       <w:r>
         <w:rPr>
-          <w:rFonts w:ascii="Helvetica" w:hAnsi="Helvetica" w:cs="Helvetica"/>
+          <w:rFonts w:ascii="Helvetica Neue" w:hAnsi="Helvetica Neue" w:cs="Helvetica Neue"/>
           <w:sz w:val="36"/>
           <w:sz-cs w:val="36"/>
           <w:b/>
           <w:spacing w:val="0"/>
+          <w:color w:val="172A9F"/>
         </w:rPr>
         <w:t xml:space="preserve">TABLE OF CONTENTS</w:t>
       </w:r>
@@ -234,7 +370,7 @@
       </w:pPr>
       <w:r>
         <w:rPr>
-          <w:rFonts w:ascii="Helvetica" w:hAnsi="Helvetica" w:cs="Helvetica"/>
+          <w:rFonts w:ascii="Helvetica Neue" w:hAnsi="Helvetica Neue" w:cs="Helvetica Neue"/>
           <w:sz w:val="24"/>
           <w:sz-cs w:val="24"/>
           <w:color w:val="0000E9"/>
@@ -247,7 +383,7 @@
       </w:r>
       <w:r>
         <w:rPr>
-          <w:rFonts w:ascii="Helvetica" w:hAnsi="Helvetica" w:cs="Helvetica"/>
+          <w:rFonts w:ascii="Helvetica Neue" w:hAnsi="Helvetica Neue" w:cs="Helvetica Neue"/>
           <w:sz w:val="24"/>
           <w:sz-cs w:val="24"/>
           <w:u w:val="single"/>
@@ -258,10 +394,11 @@
       </w:r>
       <w:r>
         <w:rPr>
-          <w:rFonts w:ascii="Helvetica" w:hAnsi="Helvetica" w:cs="Helvetica"/>
-          <w:sz w:val="24"/>
-          <w:sz-cs w:val="24"/>
-          <w:spacing w:val="0"/>
+          <w:rFonts w:ascii="Helvetica Neue" w:hAnsi="Helvetica Neue" w:cs="Helvetica Neue"/>
+          <w:sz w:val="24"/>
+          <w:sz-cs w:val="24"/>
+          <w:spacing w:val="0"/>
+          <w:color w:val="171E2D"/>
         </w:rPr>
         <w:t xml:space="preserve"/>
       </w:r>
@@ -272,7 +409,7 @@
       </w:pPr>
       <w:r>
         <w:rPr>
-          <w:rFonts w:ascii="Helvetica" w:hAnsi="Helvetica" w:cs="Helvetica"/>
+          <w:rFonts w:ascii="Helvetica Neue" w:hAnsi="Helvetica Neue" w:cs="Helvetica Neue"/>
           <w:sz w:val="24"/>
           <w:sz-cs w:val="24"/>
           <w:color w:val="0000E9"/>
@@ -285,7 +422,7 @@
       </w:r>
       <w:r>
         <w:rPr>
-          <w:rFonts w:ascii="Helvetica" w:hAnsi="Helvetica" w:cs="Helvetica"/>
+          <w:rFonts w:ascii="Helvetica Neue" w:hAnsi="Helvetica Neue" w:cs="Helvetica Neue"/>
           <w:sz w:val="24"/>
           <w:sz-cs w:val="24"/>
           <w:u w:val="single"/>
@@ -296,10 +433,11 @@
       </w:r>
       <w:r>
         <w:rPr>
-          <w:rFonts w:ascii="Helvetica" w:hAnsi="Helvetica" w:cs="Helvetica"/>
-          <w:sz w:val="24"/>
-          <w:sz-cs w:val="24"/>
-          <w:spacing w:val="0"/>
+          <w:rFonts w:ascii="Helvetica Neue" w:hAnsi="Helvetica Neue" w:cs="Helvetica Neue"/>
+          <w:sz w:val="24"/>
+          <w:sz-cs w:val="24"/>
+          <w:spacing w:val="0"/>
+          <w:color w:val="171E2D"/>
         </w:rPr>
         <w:t xml:space="preserve"/>
       </w:r>
@@ -310,7 +448,7 @@
       </w:pPr>
       <w:r>
         <w:rPr>
-          <w:rFonts w:ascii="Helvetica" w:hAnsi="Helvetica" w:cs="Helvetica"/>
+          <w:rFonts w:ascii="Helvetica Neue" w:hAnsi="Helvetica Neue" w:cs="Helvetica Neue"/>
           <w:sz w:val="24"/>
           <w:sz-cs w:val="24"/>
           <w:color w:val="0000E9"/>
@@ -323,7 +461,7 @@
       </w:r>
       <w:r>
         <w:rPr>
-          <w:rFonts w:ascii="Helvetica" w:hAnsi="Helvetica" w:cs="Helvetica"/>
+          <w:rFonts w:ascii="Helvetica Neue" w:hAnsi="Helvetica Neue" w:cs="Helvetica Neue"/>
           <w:sz w:val="24"/>
           <w:sz-cs w:val="24"/>
           <w:u w:val="single"/>
@@ -334,10 +472,11 @@
       </w:r>
       <w:r>
         <w:rPr>
-          <w:rFonts w:ascii="Helvetica" w:hAnsi="Helvetica" w:cs="Helvetica"/>
-          <w:sz w:val="24"/>
-          <w:sz-cs w:val="24"/>
-          <w:spacing w:val="0"/>
+          <w:rFonts w:ascii="Helvetica Neue" w:hAnsi="Helvetica Neue" w:cs="Helvetica Neue"/>
+          <w:sz w:val="24"/>
+          <w:sz-cs w:val="24"/>
+          <w:spacing w:val="0"/>
+          <w:color w:val="171E2D"/>
         </w:rPr>
         <w:t xml:space="preserve"/>
       </w:r>
@@ -348,7 +487,7 @@
       </w:pPr>
       <w:r>
         <w:rPr>
-          <w:rFonts w:ascii="Helvetica" w:hAnsi="Helvetica" w:cs="Helvetica"/>
+          <w:rFonts w:ascii="Helvetica Neue" w:hAnsi="Helvetica Neue" w:cs="Helvetica Neue"/>
           <w:sz w:val="24"/>
           <w:sz-cs w:val="24"/>
           <w:color w:val="0000E9"/>
@@ -361,7 +500,7 @@
       </w:r>
       <w:r>
         <w:rPr>
-          <w:rFonts w:ascii="Helvetica" w:hAnsi="Helvetica" w:cs="Helvetica"/>
+          <w:rFonts w:ascii="Helvetica Neue" w:hAnsi="Helvetica Neue" w:cs="Helvetica Neue"/>
           <w:sz w:val="24"/>
           <w:sz-cs w:val="24"/>
           <w:u w:val="single"/>
@@ -372,10 +511,11 @@
       </w:r>
       <w:r>
         <w:rPr>
-          <w:rFonts w:ascii="Helvetica" w:hAnsi="Helvetica" w:cs="Helvetica"/>
-          <w:sz w:val="24"/>
-          <w:sz-cs w:val="24"/>
-          <w:spacing w:val="0"/>
+          <w:rFonts w:ascii="Helvetica Neue" w:hAnsi="Helvetica Neue" w:cs="Helvetica Neue"/>
+          <w:sz w:val="24"/>
+          <w:sz-cs w:val="24"/>
+          <w:spacing w:val="0"/>
+          <w:color w:val="171E2D"/>
         </w:rPr>
         <w:t xml:space="preserve"/>
       </w:r>
@@ -386,7 +526,7 @@
       </w:pPr>
       <w:r>
         <w:rPr>
-          <w:rFonts w:ascii="Helvetica" w:hAnsi="Helvetica" w:cs="Helvetica"/>
+          <w:rFonts w:ascii="Helvetica Neue" w:hAnsi="Helvetica Neue" w:cs="Helvetica Neue"/>
           <w:sz w:val="24"/>
           <w:sz-cs w:val="24"/>
           <w:color w:val="0000E9"/>
@@ -399,7 +539,7 @@
       </w:r>
       <w:r>
         <w:rPr>
-          <w:rFonts w:ascii="Helvetica" w:hAnsi="Helvetica" w:cs="Helvetica"/>
+          <w:rFonts w:ascii="Helvetica Neue" w:hAnsi="Helvetica Neue" w:cs="Helvetica Neue"/>
           <w:sz w:val="24"/>
           <w:sz-cs w:val="24"/>
           <w:u w:val="single"/>
@@ -410,10 +550,11 @@
       </w:r>
       <w:r>
         <w:rPr>
-          <w:rFonts w:ascii="Helvetica" w:hAnsi="Helvetica" w:cs="Helvetica"/>
-          <w:sz w:val="24"/>
-          <w:sz-cs w:val="24"/>
-          <w:spacing w:val="0"/>
+          <w:rFonts w:ascii="Helvetica Neue" w:hAnsi="Helvetica Neue" w:cs="Helvetica Neue"/>
+          <w:sz w:val="24"/>
+          <w:sz-cs w:val="24"/>
+          <w:spacing w:val="0"/>
+          <w:color w:val="171E2D"/>
         </w:rPr>
         <w:t xml:space="preserve"/>
       </w:r>
@@ -424,7 +565,7 @@
       </w:pPr>
       <w:r>
         <w:rPr>
-          <w:rFonts w:ascii="Helvetica" w:hAnsi="Helvetica" w:cs="Helvetica"/>
+          <w:rFonts w:ascii="Helvetica Neue" w:hAnsi="Helvetica Neue" w:cs="Helvetica Neue"/>
           <w:sz w:val="24"/>
           <w:sz-cs w:val="24"/>
           <w:color w:val="0000E9"/>
@@ -437,7 +578,7 @@
       </w:r>
       <w:r>
         <w:rPr>
-          <w:rFonts w:ascii="Helvetica" w:hAnsi="Helvetica" w:cs="Helvetica"/>
+          <w:rFonts w:ascii="Helvetica Neue" w:hAnsi="Helvetica Neue" w:cs="Helvetica Neue"/>
           <w:sz w:val="24"/>
           <w:sz-cs w:val="24"/>
           <w:u w:val="single"/>
@@ -448,10 +589,11 @@
       </w:r>
       <w:r>
         <w:rPr>
-          <w:rFonts w:ascii="Helvetica" w:hAnsi="Helvetica" w:cs="Helvetica"/>
-          <w:sz w:val="24"/>
-          <w:sz-cs w:val="24"/>
-          <w:spacing w:val="0"/>
+          <w:rFonts w:ascii="Helvetica Neue" w:hAnsi="Helvetica Neue" w:cs="Helvetica Neue"/>
+          <w:sz w:val="24"/>
+          <w:sz-cs w:val="24"/>
+          <w:spacing w:val="0"/>
+          <w:color w:val="171E2D"/>
         </w:rPr>
         <w:t xml:space="preserve"/>
       </w:r>
@@ -462,7 +604,7 @@
       </w:pPr>
       <w:r>
         <w:rPr>
-          <w:rFonts w:ascii="Helvetica" w:hAnsi="Helvetica" w:cs="Helvetica"/>
+          <w:rFonts w:ascii="Helvetica Neue" w:hAnsi="Helvetica Neue" w:cs="Helvetica Neue"/>
           <w:sz w:val="24"/>
           <w:sz-cs w:val="24"/>
           <w:color w:val="0000E9"/>
@@ -475,7 +617,7 @@
       </w:r>
       <w:r>
         <w:rPr>
-          <w:rFonts w:ascii="Helvetica" w:hAnsi="Helvetica" w:cs="Helvetica"/>
+          <w:rFonts w:ascii="Helvetica Neue" w:hAnsi="Helvetica Neue" w:cs="Helvetica Neue"/>
           <w:sz w:val="24"/>
           <w:sz-cs w:val="24"/>
           <w:u w:val="single"/>
@@ -486,10 +628,11 @@
       </w:r>
       <w:r>
         <w:rPr>
-          <w:rFonts w:ascii="Helvetica" w:hAnsi="Helvetica" w:cs="Helvetica"/>
-          <w:sz w:val="24"/>
-          <w:sz-cs w:val="24"/>
-          <w:spacing w:val="0"/>
+          <w:rFonts w:ascii="Helvetica Neue" w:hAnsi="Helvetica Neue" w:cs="Helvetica Neue"/>
+          <w:sz w:val="24"/>
+          <w:sz-cs w:val="24"/>
+          <w:spacing w:val="0"/>
+          <w:color w:val="171E2D"/>
         </w:rPr>
         <w:t xml:space="preserve"/>
       </w:r>
@@ -500,7 +643,7 @@
       </w:pPr>
       <w:r>
         <w:rPr>
-          <w:rFonts w:ascii="Helvetica" w:hAnsi="Helvetica" w:cs="Helvetica"/>
+          <w:rFonts w:ascii="Helvetica Neue" w:hAnsi="Helvetica Neue" w:cs="Helvetica Neue"/>
           <w:sz w:val="24"/>
           <w:sz-cs w:val="24"/>
           <w:color w:val="0000E9"/>
@@ -513,7 +656,7 @@
       </w:r>
       <w:r>
         <w:rPr>
-          <w:rFonts w:ascii="Helvetica" w:hAnsi="Helvetica" w:cs="Helvetica"/>
+          <w:rFonts w:ascii="Helvetica Neue" w:hAnsi="Helvetica Neue" w:cs="Helvetica Neue"/>
           <w:sz w:val="24"/>
           <w:sz-cs w:val="24"/>
           <w:u w:val="single"/>
@@ -524,19 +667,20 @@
       </w:r>
       <w:r>
         <w:rPr>
-          <w:rFonts w:ascii="Helvetica" w:hAnsi="Helvetica" w:cs="Helvetica"/>
-          <w:sz w:val="24"/>
-          <w:sz-cs w:val="24"/>
-          <w:spacing w:val="0"/>
-        </w:rPr>
-        <w:t xml:space="preserve"/>
-      </w:r>
-    </w:p>
-    <w:p>
-      <w:pPr/>
-      <w:r>
-        <w:rPr>
-          <w:rFonts w:ascii="Helvetica" w:hAnsi="Helvetica" w:cs="Helvetica"/>
+          <w:rFonts w:ascii="Helvetica Neue" w:hAnsi="Helvetica Neue" w:cs="Helvetica Neue"/>
+          <w:sz w:val="24"/>
+          <w:sz-cs w:val="24"/>
+          <w:spacing w:val="0"/>
+          <w:color w:val="171E2D"/>
+        </w:rPr>
+        <w:t xml:space="preserve"/>
+      </w:r>
+    </w:p>
+    <w:p>
+      <w:pPr/>
+      <w:r>
+        <w:rPr>
+          <w:rFonts w:ascii="Helvetica Neue" w:hAnsi="Helvetica Neue" w:cs="Helvetica Neue"/>
           <w:sz w:val="24"/>
           <w:sz-cs w:val="24"/>
           <w:spacing w:val="0"/>
@@ -551,11 +695,12 @@
       </w:pPr>
       <w:r>
         <w:rPr>
-          <w:rFonts w:ascii="Helvetica" w:hAnsi="Helvetica" w:cs="Helvetica"/>
+          <w:rFonts w:ascii="Helvetica Neue" w:hAnsi="Helvetica Neue" w:cs="Helvetica Neue"/>
           <w:sz w:val="36"/>
           <w:sz-cs w:val="36"/>
           <w:b/>
           <w:spacing w:val="0"/>
+          <w:color w:val="172A9F"/>
         </w:rPr>
         <w:t xml:space="preserve">ABSTRACT</w:t>
       </w:r>
@@ -566,10 +711,11 @@
       </w:pPr>
       <w:r>
         <w:rPr>
-          <w:rFonts w:ascii="Helvetica" w:hAnsi="Helvetica" w:cs="Helvetica"/>
-          <w:sz w:val="24"/>
-          <w:sz-cs w:val="24"/>
-          <w:spacing w:val="0"/>
+          <w:rFonts w:ascii="Helvetica Neue" w:hAnsi="Helvetica Neue" w:cs="Helvetica Neue"/>
+          <w:sz w:val="24"/>
+          <w:sz-cs w:val="24"/>
+          <w:spacing w:val="0"/>
+          <w:color w:val="171E2D"/>
         </w:rPr>
         <w:t xml:space="preserve">Urban atmospheric pollution and environmental acoustic noise represent two of the most critical anthropogenic threats to human health in modern developing metropolises. While atmospheric particulate matter ($PM_{2.5}, PM_{10}$) directly impairs cardiopulmonary function, excessive acoustic noise exposure ($&gt; 55\text{ dB}$) causes chronic sleep disturbance, cognitive impairment, neuro-endocrine stress, and cardiovascular diseases.</w:t>
       </w:r>
@@ -580,48 +726,53 @@
       </w:pPr>
       <w:r>
         <w:rPr>
-          <w:rFonts w:ascii="Helvetica" w:hAnsi="Helvetica" w:cs="Helvetica"/>
-          <w:sz w:val="24"/>
-          <w:sz-cs w:val="24"/>
-          <w:spacing w:val="0"/>
+          <w:rFonts w:ascii="Helvetica Neue" w:hAnsi="Helvetica Neue" w:cs="Helvetica Neue"/>
+          <w:sz w:val="24"/>
+          <w:sz-cs w:val="24"/>
+          <w:spacing w:val="0"/>
+          <w:color w:val="171E2D"/>
         </w:rPr>
         <w:t xml:space="preserve">This final report presents the design, field implementation, and analytical findings of </w:t>
       </w:r>
       <w:r>
         <w:rPr>
-          <w:rFonts w:ascii="Helvetica" w:hAnsi="Helvetica" w:cs="Helvetica"/>
-          <w:sz w:val="24"/>
-          <w:sz-cs w:val="24"/>
-          <w:b/>
-          <w:spacing w:val="0"/>
+          <w:rFonts w:ascii="Helvetica Neue" w:hAnsi="Helvetica Neue" w:cs="Helvetica Neue"/>
+          <w:sz w:val="24"/>
+          <w:sz-cs w:val="24"/>
+          <w:b/>
+          <w:spacing w:val="0"/>
+          <w:color w:val="171E2D"/>
         </w:rPr>
         <w:t xml:space="preserve">Pollution-Mapper</w:t>
       </w:r>
       <w:r>
         <w:rPr>
-          <w:rFonts w:ascii="Helvetica" w:hAnsi="Helvetica" w:cs="Helvetica"/>
-          <w:sz w:val="24"/>
-          <w:sz-cs w:val="24"/>
-          <w:spacing w:val="0"/>
+          <w:rFonts w:ascii="Helvetica Neue" w:hAnsi="Helvetica Neue" w:cs="Helvetica Neue"/>
+          <w:sz w:val="24"/>
+          <w:sz-cs w:val="24"/>
+          <w:spacing w:val="0"/>
+          <w:color w:val="171E2D"/>
         </w:rPr>
         <w:t xml:space="preserve">, a serverless, locality-level multi-pollutant surveillance dashboard. Addressing the lack of open public APIs for street noise, the study deployed a </w:t>
       </w:r>
       <w:r>
         <w:rPr>
-          <w:rFonts w:ascii="Helvetica" w:hAnsi="Helvetica" w:cs="Helvetica"/>
-          <w:sz w:val="24"/>
-          <w:sz-cs w:val="24"/>
-          <w:b/>
-          <w:spacing w:val="0"/>
+          <w:rFonts w:ascii="Helvetica Neue" w:hAnsi="Helvetica Neue" w:cs="Helvetica Neue"/>
+          <w:sz w:val="24"/>
+          <w:sz-cs w:val="24"/>
+          <w:b/>
+          <w:spacing w:val="0"/>
+          <w:color w:val="171E2D"/>
         </w:rPr>
         <w:t xml:space="preserve">hybrid data methodology</w:t>
       </w:r>
       <w:r>
         <w:rPr>
-          <w:rFonts w:ascii="Helvetica" w:hAnsi="Helvetica" w:cs="Helvetica"/>
-          <w:sz w:val="24"/>
-          <w:sz-cs w:val="24"/>
-          <w:spacing w:val="0"/>
+          <w:rFonts w:ascii="Helvetica Neue" w:hAnsi="Helvetica Neue" w:cs="Helvetica Neue"/>
+          <w:sz w:val="24"/>
+          <w:sz-cs w:val="24"/>
+          <w:spacing w:val="0"/>
+          <w:color w:val="171E2D"/>
         </w:rPr>
         <w:t xml:space="preserve">: combining primary, on-site decibel meter measurements ($L_{\text{Aeq}}$) across six diverse urban land-use typologies with automated, secondary air quality monitoring feeds (WAQI and Open-Meteo REST APIs). The platform features dynamic global geocoding, simultaneous dual-pollutant GIS mapping, an autonomous daily GitHub Actions CI/CD data pipeline, and empirical Pearson correlation analysis ($r = +0.68$), proving the co-location of severe acoustic and particulate exposure along major transit corridors.</w:t>
       </w:r>
@@ -630,7 +781,7 @@
       <w:pPr/>
       <w:r>
         <w:rPr>
-          <w:rFonts w:ascii="Helvetica" w:hAnsi="Helvetica" w:cs="Helvetica"/>
+          <w:rFonts w:ascii="Helvetica Neue" w:hAnsi="Helvetica Neue" w:cs="Helvetica Neue"/>
           <w:sz w:val="24"/>
           <w:sz-cs w:val="24"/>
           <w:spacing w:val="0"/>
@@ -645,11 +796,12 @@
       </w:pPr>
       <w:r>
         <w:rPr>
-          <w:rFonts w:ascii="Helvetica" w:hAnsi="Helvetica" w:cs="Helvetica"/>
+          <w:rFonts w:ascii="Helvetica Neue" w:hAnsi="Helvetica Neue" w:cs="Helvetica Neue"/>
           <w:sz w:val="36"/>
           <w:sz-cs w:val="36"/>
           <w:b/>
           <w:spacing w:val="0"/>
+          <w:color w:val="172A9F"/>
         </w:rPr>
         <w:t xml:space="preserve">CHAPTER 1: PROBLEM STATEMENT &amp; MOTIVATION</w:t>
       </w:r>
@@ -660,11 +812,12 @@
       </w:pPr>
       <w:r>
         <w:rPr>
-          <w:rFonts w:ascii="Helvetica" w:hAnsi="Helvetica" w:cs="Helvetica"/>
+          <w:rFonts w:ascii="Helvetica Neue" w:hAnsi="Helvetica Neue" w:cs="Helvetica Neue"/>
           <w:sz w:val="28"/>
           <w:sz-cs w:val="28"/>
           <w:b/>
           <w:spacing w:val="0"/>
+          <w:color w:val="171E2D"/>
         </w:rPr>
         <w:t xml:space="preserve">1.1 Problem Statement</w:t>
       </w:r>
@@ -675,67 +828,74 @@
       </w:pPr>
       <w:r>
         <w:rPr>
-          <w:rFonts w:ascii="Helvetica" w:hAnsi="Helvetica" w:cs="Helvetica"/>
-          <w:sz w:val="24"/>
-          <w:sz-cs w:val="24"/>
-          <w:spacing w:val="0"/>
+          <w:rFonts w:ascii="Helvetica Neue" w:hAnsi="Helvetica Neue" w:cs="Helvetica Neue"/>
+          <w:sz w:val="24"/>
+          <w:sz-cs w:val="24"/>
+          <w:spacing w:val="0"/>
+          <w:color w:val="171E2D"/>
         </w:rPr>
         <w:t xml:space="preserve">Conventional municipal environmental surveillance systems suffer from three fundamental deficiencies: 1. </w:t>
       </w:r>
       <w:r>
         <w:rPr>
-          <w:rFonts w:ascii="Helvetica" w:hAnsi="Helvetica" w:cs="Helvetica"/>
-          <w:sz w:val="24"/>
-          <w:sz-cs w:val="24"/>
-          <w:b/>
-          <w:spacing w:val="0"/>
+          <w:rFonts w:ascii="Helvetica Neue" w:hAnsi="Helvetica Neue" w:cs="Helvetica Neue"/>
+          <w:sz w:val="24"/>
+          <w:sz-cs w:val="24"/>
+          <w:b/>
+          <w:spacing w:val="0"/>
+          <w:color w:val="171E2D"/>
         </w:rPr>
         <w:t xml:space="preserve">The Spatial Granularity Gap</w:t>
       </w:r>
       <w:r>
         <w:rPr>
-          <w:rFonts w:ascii="Helvetica" w:hAnsi="Helvetica" w:cs="Helvetica"/>
-          <w:sz w:val="24"/>
-          <w:sz-cs w:val="24"/>
-          <w:spacing w:val="0"/>
+          <w:rFonts w:ascii="Helvetica Neue" w:hAnsi="Helvetica Neue" w:cs="Helvetica Neue"/>
+          <w:sz w:val="24"/>
+          <w:sz-cs w:val="24"/>
+          <w:spacing w:val="0"/>
+          <w:color w:val="171E2D"/>
         </w:rPr>
         <w:t xml:space="preserve">: State and national monitoring towers are spaced miles apart, providing macroscopic regional averages that conceal extreme microclimatic exposure disparities between congested transit junctions and adjacent residential buffers. 2. </w:t>
       </w:r>
       <w:r>
         <w:rPr>
-          <w:rFonts w:ascii="Helvetica" w:hAnsi="Helvetica" w:cs="Helvetica"/>
-          <w:sz w:val="24"/>
-          <w:sz-cs w:val="24"/>
-          <w:b/>
-          <w:spacing w:val="0"/>
+          <w:rFonts w:ascii="Helvetica Neue" w:hAnsi="Helvetica Neue" w:cs="Helvetica Neue"/>
+          <w:sz w:val="24"/>
+          <w:sz-cs w:val="24"/>
+          <w:b/>
+          <w:spacing w:val="0"/>
+          <w:color w:val="171E2D"/>
         </w:rPr>
         <w:t xml:space="preserve">The Acoustic Monitoring Blindspot</w:t>
       </w:r>
       <w:r>
         <w:rPr>
-          <w:rFonts w:ascii="Helvetica" w:hAnsi="Helvetica" w:cs="Helvetica"/>
-          <w:sz w:val="24"/>
-          <w:sz-cs w:val="24"/>
-          <w:spacing w:val="0"/>
+          <w:rFonts w:ascii="Helvetica Neue" w:hAnsi="Helvetica Neue" w:cs="Helvetica Neue"/>
+          <w:sz w:val="24"/>
+          <w:sz-cs w:val="24"/>
+          <w:spacing w:val="0"/>
+          <w:color w:val="171E2D"/>
         </w:rPr>
         <w:t xml:space="preserve">: Unlike ambient air pollution, continuous urban acoustic data is completely absent from open public internet APIs due to privacy concerns surrounding live street microphones and high sensor deployment costs. 3. </w:t>
       </w:r>
       <w:r>
         <w:rPr>
-          <w:rFonts w:ascii="Helvetica" w:hAnsi="Helvetica" w:cs="Helvetica"/>
-          <w:sz w:val="24"/>
-          <w:sz-cs w:val="24"/>
-          <w:b/>
-          <w:spacing w:val="0"/>
+          <w:rFonts w:ascii="Helvetica Neue" w:hAnsi="Helvetica Neue" w:cs="Helvetica Neue"/>
+          <w:sz w:val="24"/>
+          <w:sz-cs w:val="24"/>
+          <w:b/>
+          <w:spacing w:val="0"/>
+          <w:color w:val="171E2D"/>
         </w:rPr>
         <w:t xml:space="preserve">Data Siloing</w:t>
       </w:r>
       <w:r>
         <w:rPr>
-          <w:rFonts w:ascii="Helvetica" w:hAnsi="Helvetica" w:cs="Helvetica"/>
-          <w:sz w:val="24"/>
-          <w:sz-cs w:val="24"/>
-          <w:spacing w:val="0"/>
+          <w:rFonts w:ascii="Helvetica Neue" w:hAnsi="Helvetica Neue" w:cs="Helvetica Neue"/>
+          <w:sz w:val="24"/>
+          <w:sz-cs w:val="24"/>
+          <w:spacing w:val="0"/>
+          <w:color w:val="171E2D"/>
         </w:rPr>
         <w:t xml:space="preserve">: Atmospheric pollution and acoustic noise are treated as independent phenomena by public health agencies, despite sharing common vehicular and industrial origins.</w:t>
       </w:r>
@@ -746,11 +906,12 @@
       </w:pPr>
       <w:r>
         <w:rPr>
-          <w:rFonts w:ascii="Helvetica" w:hAnsi="Helvetica" w:cs="Helvetica"/>
+          <w:rFonts w:ascii="Helvetica Neue" w:hAnsi="Helvetica Neue" w:cs="Helvetica Neue"/>
           <w:sz w:val="28"/>
           <w:sz-cs w:val="28"/>
           <w:b/>
           <w:spacing w:val="0"/>
+          <w:color w:val="171E2D"/>
         </w:rPr>
         <w:t xml:space="preserve">1.2 Motivation &amp; Objectives</w:t>
       </w:r>
@@ -761,105 +922,116 @@
       </w:pPr>
       <w:r>
         <w:rPr>
-          <w:rFonts w:ascii="Helvetica" w:hAnsi="Helvetica" w:cs="Helvetica"/>
-          <w:sz w:val="24"/>
-          <w:sz-cs w:val="24"/>
-          <w:spacing w:val="0"/>
+          <w:rFonts w:ascii="Helvetica Neue" w:hAnsi="Helvetica Neue" w:cs="Helvetica Neue"/>
+          <w:sz w:val="24"/>
+          <w:sz-cs w:val="24"/>
+          <w:spacing w:val="0"/>
+          <w:color w:val="171E2D"/>
         </w:rPr>
         <w:t xml:space="preserve">The core motivation of this field project is to build an open-access, zero-cost, serverless platform enabling citizens, researchers, and urban administrators to visualize, map, and correlate hyper-local air and noise pollution levels. * </w:t>
       </w:r>
       <w:r>
         <w:rPr>
-          <w:rFonts w:ascii="Helvetica" w:hAnsi="Helvetica" w:cs="Helvetica"/>
-          <w:sz w:val="24"/>
-          <w:sz-cs w:val="24"/>
-          <w:b/>
-          <w:spacing w:val="0"/>
+          <w:rFonts w:ascii="Helvetica Neue" w:hAnsi="Helvetica Neue" w:cs="Helvetica Neue"/>
+          <w:sz w:val="24"/>
+          <w:sz-cs w:val="24"/>
+          <w:b/>
+          <w:spacing w:val="0"/>
+          <w:color w:val="171E2D"/>
         </w:rPr>
         <w:t xml:space="preserve">Objective 1</w:t>
       </w:r>
       <w:r>
         <w:rPr>
-          <w:rFonts w:ascii="Helvetica" w:hAnsi="Helvetica" w:cs="Helvetica"/>
-          <w:sz w:val="24"/>
-          <w:sz-cs w:val="24"/>
-          <w:spacing w:val="0"/>
+          <w:rFonts w:ascii="Helvetica Neue" w:hAnsi="Helvetica Neue" w:cs="Helvetica Neue"/>
+          <w:sz w:val="24"/>
+          <w:sz-cs w:val="24"/>
+          <w:spacing w:val="0"/>
+          <w:color w:val="171E2D"/>
         </w:rPr>
         <w:t xml:space="preserve">: Conduct on-site empirical acoustic surveys across representative urban land-use categories. * </w:t>
       </w:r>
       <w:r>
         <w:rPr>
-          <w:rFonts w:ascii="Helvetica" w:hAnsi="Helvetica" w:cs="Helvetica"/>
-          <w:sz w:val="24"/>
-          <w:sz-cs w:val="24"/>
-          <w:b/>
-          <w:spacing w:val="0"/>
+          <w:rFonts w:ascii="Helvetica Neue" w:hAnsi="Helvetica Neue" w:cs="Helvetica Neue"/>
+          <w:sz w:val="24"/>
+          <w:sz-cs w:val="24"/>
+          <w:b/>
+          <w:spacing w:val="0"/>
+          <w:color w:val="171E2D"/>
         </w:rPr>
         <w:t xml:space="preserve">Objective 2</w:t>
       </w:r>
       <w:r>
         <w:rPr>
-          <w:rFonts w:ascii="Helvetica" w:hAnsi="Helvetica" w:cs="Helvetica"/>
-          <w:sz w:val="24"/>
-          <w:sz-cs w:val="24"/>
-          <w:spacing w:val="0"/>
+          <w:rFonts w:ascii="Helvetica Neue" w:hAnsi="Helvetica Neue" w:cs="Helvetica Neue"/>
+          <w:sz w:val="24"/>
+          <w:sz-cs w:val="24"/>
+          <w:spacing w:val="0"/>
+          <w:color w:val="171E2D"/>
         </w:rPr>
         <w:t xml:space="preserve">: Automate real-time secondary air quality data ingestion from global station networks. * </w:t>
       </w:r>
       <w:r>
         <w:rPr>
-          <w:rFonts w:ascii="Helvetica" w:hAnsi="Helvetica" w:cs="Helvetica"/>
-          <w:sz w:val="24"/>
-          <w:sz-cs w:val="24"/>
-          <w:b/>
-          <w:spacing w:val="0"/>
+          <w:rFonts w:ascii="Helvetica Neue" w:hAnsi="Helvetica Neue" w:cs="Helvetica Neue"/>
+          <w:sz w:val="24"/>
+          <w:sz-cs w:val="24"/>
+          <w:b/>
+          <w:spacing w:val="0"/>
+          <w:color w:val="171E2D"/>
         </w:rPr>
         <w:t xml:space="preserve">Objective 3</w:t>
       </w:r>
       <w:r>
         <w:rPr>
-          <w:rFonts w:ascii="Helvetica" w:hAnsi="Helvetica" w:cs="Helvetica"/>
-          <w:sz w:val="24"/>
-          <w:sz-cs w:val="24"/>
-          <w:spacing w:val="0"/>
+          <w:rFonts w:ascii="Helvetica Neue" w:hAnsi="Helvetica Neue" w:cs="Helvetica Neue"/>
+          <w:sz w:val="24"/>
+          <w:sz-cs w:val="24"/>
+          <w:spacing w:val="0"/>
+          <w:color w:val="171E2D"/>
         </w:rPr>
         <w:t xml:space="preserve">: Engineer an interactive GIS web interface using Streamlit and Plotly MapLibre. * </w:t>
       </w:r>
       <w:r>
         <w:rPr>
-          <w:rFonts w:ascii="Helvetica" w:hAnsi="Helvetica" w:cs="Helvetica"/>
-          <w:sz w:val="24"/>
-          <w:sz-cs w:val="24"/>
-          <w:b/>
-          <w:spacing w:val="0"/>
+          <w:rFonts w:ascii="Helvetica Neue" w:hAnsi="Helvetica Neue" w:cs="Helvetica Neue"/>
+          <w:sz w:val="24"/>
+          <w:sz-cs w:val="24"/>
+          <w:b/>
+          <w:spacing w:val="0"/>
+          <w:color w:val="171E2D"/>
         </w:rPr>
         <w:t xml:space="preserve">Objective 4</w:t>
       </w:r>
       <w:r>
         <w:rPr>
-          <w:rFonts w:ascii="Helvetica" w:hAnsi="Helvetica" w:cs="Helvetica"/>
-          <w:sz w:val="24"/>
-          <w:sz-cs w:val="24"/>
-          <w:spacing w:val="0"/>
+          <w:rFonts w:ascii="Helvetica Neue" w:hAnsi="Helvetica Neue" w:cs="Helvetica Neue"/>
+          <w:sz w:val="24"/>
+          <w:sz-cs w:val="24"/>
+          <w:spacing w:val="0"/>
+          <w:color w:val="171E2D"/>
         </w:rPr>
         <w:t xml:space="preserve">: Establish an autonomous, serverless cloud data pipeline via GitHub Actions to accumulate historical trend data without operational expenditure. * </w:t>
       </w:r>
       <w:r>
         <w:rPr>
-          <w:rFonts w:ascii="Helvetica" w:hAnsi="Helvetica" w:cs="Helvetica"/>
-          <w:sz w:val="24"/>
-          <w:sz-cs w:val="24"/>
-          <w:b/>
-          <w:spacing w:val="0"/>
+          <w:rFonts w:ascii="Helvetica Neue" w:hAnsi="Helvetica Neue" w:cs="Helvetica Neue"/>
+          <w:sz w:val="24"/>
+          <w:sz-cs w:val="24"/>
+          <w:b/>
+          <w:spacing w:val="0"/>
+          <w:color w:val="171E2D"/>
         </w:rPr>
         <w:t xml:space="preserve">Objective 5</w:t>
       </w:r>
       <w:r>
         <w:rPr>
-          <w:rFonts w:ascii="Helvetica" w:hAnsi="Helvetica" w:cs="Helvetica"/>
-          <w:sz w:val="24"/>
-          <w:sz-cs w:val="24"/>
-          <w:spacing w:val="0"/>
+          <w:rFonts w:ascii="Helvetica Neue" w:hAnsi="Helvetica Neue" w:cs="Helvetica Neue"/>
+          <w:sz w:val="24"/>
+          <w:sz-cs w:val="24"/>
+          <w:spacing w:val="0"/>
+          <w:color w:val="171E2D"/>
         </w:rPr>
         <w:t xml:space="preserve">: Statistically evaluate the co-location of vehicular noise and particulate concentrations.</w:t>
       </w:r>
@@ -868,7 +1040,7 @@
       <w:pPr/>
       <w:r>
         <w:rPr>
-          <w:rFonts w:ascii="Helvetica" w:hAnsi="Helvetica" w:cs="Helvetica"/>
+          <w:rFonts w:ascii="Helvetica Neue" w:hAnsi="Helvetica Neue" w:cs="Helvetica Neue"/>
           <w:sz w:val="24"/>
           <w:sz-cs w:val="24"/>
           <w:spacing w:val="0"/>
@@ -883,11 +1055,12 @@
       </w:pPr>
       <w:r>
         <w:rPr>
-          <w:rFonts w:ascii="Helvetica" w:hAnsi="Helvetica" w:cs="Helvetica"/>
+          <w:rFonts w:ascii="Helvetica Neue" w:hAnsi="Helvetica Neue" w:cs="Helvetica Neue"/>
           <w:sz w:val="36"/>
           <w:sz-cs w:val="36"/>
           <w:b/>
           <w:spacing w:val="0"/>
+          <w:color w:val="172A9F"/>
         </w:rPr>
         <w:t xml:space="preserve">CHAPTER 2: LITERATURE REVIEW</w:t>
       </w:r>
@@ -898,11 +1071,12 @@
       </w:pPr>
       <w:r>
         <w:rPr>
-          <w:rFonts w:ascii="Helvetica" w:hAnsi="Helvetica" w:cs="Helvetica"/>
+          <w:rFonts w:ascii="Helvetica Neue" w:hAnsi="Helvetica Neue" w:cs="Helvetica Neue"/>
           <w:sz w:val="28"/>
           <w:sz-cs w:val="28"/>
           <w:b/>
           <w:spacing w:val="0"/>
+          <w:color w:val="171E2D"/>
         </w:rPr>
         <w:t xml:space="preserve">2.1 Environmental Health Frameworks</w:t>
       </w:r>
@@ -913,10 +1087,11 @@
       </w:pPr>
       <w:r>
         <w:rPr>
-          <w:rFonts w:ascii="Helvetica" w:hAnsi="Helvetica" w:cs="Helvetica"/>
-          <w:sz w:val="24"/>
-          <w:sz-cs w:val="24"/>
-          <w:b/>
+          <w:rFonts w:ascii="Helvetica Neue" w:hAnsi="Helvetica Neue" w:cs="Helvetica Neue"/>
+          <w:sz w:val="24"/>
+          <w:sz-cs w:val="24"/>
+          <w:b/>
+          <w:color w:val="171E2D"/>
         </w:rPr>
         <w:t xml:space="preserve"/>
         <w:tab/>
@@ -926,20 +1101,22 @@
       </w:r>
       <w:r>
         <w:rPr>
-          <w:rFonts w:ascii="Helvetica" w:hAnsi="Helvetica" w:cs="Helvetica"/>
-          <w:sz w:val="24"/>
-          <w:sz-cs w:val="24"/>
-          <w:b/>
-          <w:spacing w:val="0"/>
+          <w:rFonts w:ascii="Helvetica Neue" w:hAnsi="Helvetica Neue" w:cs="Helvetica Neue"/>
+          <w:sz w:val="24"/>
+          <w:sz-cs w:val="24"/>
+          <w:b/>
+          <w:spacing w:val="0"/>
+          <w:color w:val="171E2D"/>
         </w:rPr>
         <w:t xml:space="preserve">World Health Organization (WHO) Noise Guidelines (2018)</w:t>
       </w:r>
       <w:r>
         <w:rPr>
-          <w:rFonts w:ascii="Helvetica" w:hAnsi="Helvetica" w:cs="Helvetica"/>
-          <w:sz w:val="24"/>
-          <w:sz-cs w:val="24"/>
-          <w:spacing w:val="0"/>
+          <w:rFonts w:ascii="Helvetica Neue" w:hAnsi="Helvetica Neue" w:cs="Helvetica Neue"/>
+          <w:sz w:val="24"/>
+          <w:sz-cs w:val="24"/>
+          <w:spacing w:val="0"/>
+          <w:color w:val="171E2D"/>
         </w:rPr>
         <w:t xml:space="preserve">: Establishes a conditional recommendation that daytime outdoor residential noise should not exceed $55\text{ dBA}$ $L_{\text{den}}$, and nighttime noise should remain below $40\text{ dBA}$ to prevent ischemic heart disease and severe sleep disturbance.</w:t>
       </w:r>
@@ -950,10 +1127,11 @@
       </w:pPr>
       <w:r>
         <w:rPr>
-          <w:rFonts w:ascii="Helvetica" w:hAnsi="Helvetica" w:cs="Helvetica"/>
-          <w:sz w:val="24"/>
-          <w:sz-cs w:val="24"/>
-          <w:b/>
+          <w:rFonts w:ascii="Helvetica Neue" w:hAnsi="Helvetica Neue" w:cs="Helvetica Neue"/>
+          <w:sz w:val="24"/>
+          <w:sz-cs w:val="24"/>
+          <w:b/>
+          <w:color w:val="171E2D"/>
         </w:rPr>
         <w:t xml:space="preserve"/>
         <w:tab/>
@@ -963,20 +1141,22 @@
       </w:r>
       <w:r>
         <w:rPr>
-          <w:rFonts w:ascii="Helvetica" w:hAnsi="Helvetica" w:cs="Helvetica"/>
-          <w:sz w:val="24"/>
-          <w:sz-cs w:val="24"/>
-          <w:b/>
-          <w:spacing w:val="0"/>
+          <w:rFonts w:ascii="Helvetica Neue" w:hAnsi="Helvetica Neue" w:cs="Helvetica Neue"/>
+          <w:sz w:val="24"/>
+          <w:sz-cs w:val="24"/>
+          <w:b/>
+          <w:spacing w:val="0"/>
+          <w:color w:val="171E2D"/>
         </w:rPr>
         <w:t xml:space="preserve">US-EPA Air Quality Index Standard (2018)</w:t>
       </w:r>
       <w:r>
         <w:rPr>
-          <w:rFonts w:ascii="Helvetica" w:hAnsi="Helvetica" w:cs="Helvetica"/>
-          <w:sz w:val="24"/>
-          <w:sz-cs w:val="24"/>
-          <w:spacing w:val="0"/>
+          <w:rFonts w:ascii="Helvetica Neue" w:hAnsi="Helvetica Neue" w:cs="Helvetica Neue"/>
+          <w:sz w:val="24"/>
+          <w:sz-cs w:val="24"/>
+          <w:spacing w:val="0"/>
+          <w:color w:val="171E2D"/>
         </w:rPr>
         <w:t xml:space="preserve">: Categorizes particulate matter ($PM_{2.5}$) into health-based color tiers: Good (0–50), Moderate (51–100), Unhealthy for Sensitive Groups (101–150), Unhealthy (151–200), Very Unhealthy (201–300), and Hazardous (301+).</w:t>
       </w:r>
@@ -987,11 +1167,12 @@
       </w:pPr>
       <w:r>
         <w:rPr>
-          <w:rFonts w:ascii="Helvetica" w:hAnsi="Helvetica" w:cs="Helvetica"/>
+          <w:rFonts w:ascii="Helvetica Neue" w:hAnsi="Helvetica Neue" w:cs="Helvetica Neue"/>
           <w:sz w:val="28"/>
           <w:sz-cs w:val="28"/>
           <w:b/>
           <w:spacing w:val="0"/>
+          <w:color w:val="171E2D"/>
         </w:rPr>
         <w:t xml:space="preserve">2.2 Existing Systems Comparative Analysis</w:t>
       </w:r>
@@ -1000,11 +1181,12 @@
       <w:pPr/>
       <w:r>
         <w:rPr>
-          <w:rFonts w:ascii="Helvetica" w:hAnsi="Helvetica" w:cs="Helvetica"/>
-          <w:sz w:val="24"/>
-          <w:sz-cs w:val="24"/>
-          <w:b/>
-          <w:spacing w:val="0"/>
+          <w:rFonts w:ascii="Helvetica Neue" w:hAnsi="Helvetica Neue" w:cs="Helvetica Neue"/>
+          <w:sz w:val="26"/>
+          <w:sz-cs w:val="26"/>
+          <w:b/>
+          <w:spacing w:val="0"/>
+          <w:color w:val="0D121F"/>
         </w:rPr>
         <w:t xml:space="preserve">Platform</w:t>
       </w:r>
@@ -1013,11 +1195,12 @@
       <w:pPr/>
       <w:r>
         <w:rPr>
-          <w:rFonts w:ascii="Helvetica" w:hAnsi="Helvetica" w:cs="Helvetica"/>
-          <w:sz w:val="24"/>
-          <w:sz-cs w:val="24"/>
-          <w:b/>
-          <w:spacing w:val="0"/>
+          <w:rFonts w:ascii="Helvetica Neue" w:hAnsi="Helvetica Neue" w:cs="Helvetica Neue"/>
+          <w:sz w:val="26"/>
+          <w:sz-cs w:val="26"/>
+          <w:b/>
+          <w:spacing w:val="0"/>
+          <w:color w:val="0D121F"/>
         </w:rPr>
         <w:t xml:space="preserve">Spatial Resolution</w:t>
       </w:r>
@@ -1026,11 +1209,12 @@
       <w:pPr/>
       <w:r>
         <w:rPr>
-          <w:rFonts w:ascii="Helvetica" w:hAnsi="Helvetica" w:cs="Helvetica"/>
-          <w:sz w:val="24"/>
-          <w:sz-cs w:val="24"/>
-          <w:b/>
-          <w:spacing w:val="0"/>
+          <w:rFonts w:ascii="Helvetica Neue" w:hAnsi="Helvetica Neue" w:cs="Helvetica Neue"/>
+          <w:sz w:val="26"/>
+          <w:sz-cs w:val="26"/>
+          <w:b/>
+          <w:spacing w:val="0"/>
+          <w:color w:val="0D121F"/>
         </w:rPr>
         <w:t xml:space="preserve">Pollutants Covered</w:t>
       </w:r>
@@ -1041,11 +1225,12 @@
       </w:pPr>
       <w:r>
         <w:rPr>
-          <w:rFonts w:ascii="Helvetica" w:hAnsi="Helvetica" w:cs="Helvetica"/>
-          <w:sz w:val="24"/>
-          <w:sz-cs w:val="24"/>
-          <w:b/>
-          <w:spacing w:val="0"/>
+          <w:rFonts w:ascii="Helvetica Neue" w:hAnsi="Helvetica Neue" w:cs="Helvetica Neue"/>
+          <w:sz w:val="26"/>
+          <w:sz-cs w:val="26"/>
+          <w:b/>
+          <w:spacing w:val="0"/>
+          <w:color w:val="0D121F"/>
         </w:rPr>
         <w:t xml:space="preserve">Acoustic Integration</w:t>
       </w:r>
@@ -1054,11 +1239,12 @@
       <w:pPr/>
       <w:r>
         <w:rPr>
-          <w:rFonts w:ascii="Helvetica" w:hAnsi="Helvetica" w:cs="Helvetica"/>
-          <w:sz w:val="24"/>
-          <w:sz-cs w:val="24"/>
-          <w:b/>
-          <w:spacing w:val="0"/>
+          <w:rFonts w:ascii="Helvetica Neue" w:hAnsi="Helvetica Neue" w:cs="Helvetica Neue"/>
+          <w:sz w:val="26"/>
+          <w:sz-cs w:val="26"/>
+          <w:b/>
+          <w:spacing w:val="0"/>
+          <w:color w:val="0D121F"/>
         </w:rPr>
         <w:t xml:space="preserve">Cloud Architecture</w:t>
       </w:r>
@@ -1067,11 +1253,12 @@
       <w:pPr/>
       <w:r>
         <w:rPr>
-          <w:rFonts w:ascii="Helvetica" w:hAnsi="Helvetica" w:cs="Helvetica"/>
-          <w:sz w:val="24"/>
-          <w:sz-cs w:val="24"/>
-          <w:b/>
-          <w:spacing w:val="0"/>
+          <w:rFonts w:ascii="Helvetica Neue" w:hAnsi="Helvetica Neue" w:cs="Helvetica Neue"/>
+          <w:sz w:val="26"/>
+          <w:sz-cs w:val="26"/>
+          <w:b/>
+          <w:spacing w:val="0"/>
+          <w:color w:val="0D121F"/>
         </w:rPr>
         <w:t xml:space="preserve">Maintenance Cost</w:t>
       </w:r>
@@ -1080,32 +1267,35 @@
       <w:pPr/>
       <w:r>
         <w:rPr>
-          <w:rFonts w:ascii="Helvetica" w:hAnsi="Helvetica" w:cs="Helvetica"/>
-          <w:sz w:val="24"/>
-          <w:sz-cs w:val="24"/>
-          <w:b/>
-          <w:spacing w:val="0"/>
+          <w:rFonts w:ascii="Helvetica Neue" w:hAnsi="Helvetica Neue" w:cs="Helvetica Neue"/>
+          <w:sz w:val="26"/>
+          <w:sz-cs w:val="26"/>
+          <w:b/>
+          <w:spacing w:val="0"/>
+          <w:color w:val="171E2D"/>
         </w:rPr>
         <w:t xml:space="preserve">Government CPCB / EPA</w:t>
       </w:r>
       <w:r>
         <w:rPr>
-          <w:rFonts w:ascii="Helvetica" w:hAnsi="Helvetica" w:cs="Helvetica"/>
-          <w:sz w:val="24"/>
-          <w:sz-cs w:val="24"/>
-          <w:spacing w:val="0"/>
-        </w:rPr>
-        <w:t xml:space="preserve"/>
-      </w:r>
-    </w:p>
-    <w:p>
-      <w:pPr/>
-      <w:r>
-        <w:rPr>
-          <w:rFonts w:ascii="Helvetica" w:hAnsi="Helvetica" w:cs="Helvetica"/>
-          <w:sz w:val="24"/>
-          <w:sz-cs w:val="24"/>
-          <w:spacing w:val="0"/>
+          <w:rFonts w:ascii="Helvetica Neue" w:hAnsi="Helvetica Neue" w:cs="Helvetica Neue"/>
+          <w:sz w:val="26"/>
+          <w:sz-cs w:val="26"/>
+          <w:spacing w:val="0"/>
+          <w:color w:val="171E2D"/>
+        </w:rPr>
+        <w:t xml:space="preserve"/>
+      </w:r>
+    </w:p>
+    <w:p>
+      <w:pPr/>
+      <w:r>
+        <w:rPr>
+          <w:rFonts w:ascii="Helvetica Neue" w:hAnsi="Helvetica Neue" w:cs="Helvetica Neue"/>
+          <w:sz w:val="26"/>
+          <w:sz-cs w:val="26"/>
+          <w:spacing w:val="0"/>
+          <w:color w:val="171E2D"/>
         </w:rPr>
         <w:t xml:space="preserve">Macroscopic / Regional</w:t>
       </w:r>
@@ -1114,10 +1304,11 @@
       <w:pPr/>
       <w:r>
         <w:rPr>
-          <w:rFonts w:ascii="Helvetica" w:hAnsi="Helvetica" w:cs="Helvetica"/>
-          <w:sz w:val="24"/>
-          <w:sz-cs w:val="24"/>
-          <w:spacing w:val="0"/>
+          <w:rFonts w:ascii="Helvetica Neue" w:hAnsi="Helvetica Neue" w:cs="Helvetica Neue"/>
+          <w:sz w:val="26"/>
+          <w:sz-cs w:val="26"/>
+          <w:spacing w:val="0"/>
+          <w:color w:val="171E2D"/>
         </w:rPr>
         <w:t xml:space="preserve">$PM_{2.5}, PM_{10}, SO_2$</w:t>
       </w:r>
@@ -1128,10 +1319,11 @@
       </w:pPr>
       <w:r>
         <w:rPr>
-          <w:rFonts w:ascii="Helvetica" w:hAnsi="Helvetica" w:cs="Helvetica"/>
-          <w:sz w:val="24"/>
-          <w:sz-cs w:val="24"/>
-          <w:spacing w:val="0"/>
+          <w:rFonts w:ascii="Helvetica Neue" w:hAnsi="Helvetica Neue" w:cs="Helvetica Neue"/>
+          <w:sz w:val="26"/>
+          <w:sz-cs w:val="26"/>
+          <w:spacing w:val="0"/>
+          <w:color w:val="171E2D"/>
         </w:rPr>
         <w:t xml:space="preserve">❌ None</w:t>
       </w:r>
@@ -1140,10 +1332,11 @@
       <w:pPr/>
       <w:r>
         <w:rPr>
-          <w:rFonts w:ascii="Helvetica" w:hAnsi="Helvetica" w:cs="Helvetica"/>
-          <w:sz w:val="24"/>
-          <w:sz-cs w:val="24"/>
-          <w:spacing w:val="0"/>
+          <w:rFonts w:ascii="Helvetica Neue" w:hAnsi="Helvetica Neue" w:cs="Helvetica Neue"/>
+          <w:sz w:val="26"/>
+          <w:sz-cs w:val="26"/>
+          <w:spacing w:val="0"/>
+          <w:color w:val="171E2D"/>
         </w:rPr>
         <w:t xml:space="preserve">Dedicated Government Servers</w:t>
       </w:r>
@@ -1152,10 +1345,11 @@
       <w:pPr/>
       <w:r>
         <w:rPr>
-          <w:rFonts w:ascii="Helvetica" w:hAnsi="Helvetica" w:cs="Helvetica"/>
-          <w:sz w:val="24"/>
-          <w:sz-cs w:val="24"/>
-          <w:spacing w:val="0"/>
+          <w:rFonts w:ascii="Helvetica Neue" w:hAnsi="Helvetica Neue" w:cs="Helvetica Neue"/>
+          <w:sz w:val="26"/>
+          <w:sz-cs w:val="26"/>
+          <w:spacing w:val="0"/>
+          <w:color w:val="171E2D"/>
         </w:rPr>
         <w:t xml:space="preserve">High ($&gt;\$50,000/\text{station}$)</w:t>
       </w:r>
@@ -1164,32 +1358,35 @@
       <w:pPr/>
       <w:r>
         <w:rPr>
-          <w:rFonts w:ascii="Helvetica" w:hAnsi="Helvetica" w:cs="Helvetica"/>
-          <w:sz w:val="24"/>
-          <w:sz-cs w:val="24"/>
-          <w:b/>
-          <w:spacing w:val="0"/>
+          <w:rFonts w:ascii="Helvetica Neue" w:hAnsi="Helvetica Neue" w:cs="Helvetica Neue"/>
+          <w:sz w:val="26"/>
+          <w:sz-cs w:val="26"/>
+          <w:b/>
+          <w:spacing w:val="0"/>
+          <w:color w:val="171E2D"/>
         </w:rPr>
         <w:t xml:space="preserve">WAQI / IQAir Portals</w:t>
       </w:r>
       <w:r>
         <w:rPr>
-          <w:rFonts w:ascii="Helvetica" w:hAnsi="Helvetica" w:cs="Helvetica"/>
-          <w:sz w:val="24"/>
-          <w:sz-cs w:val="24"/>
-          <w:spacing w:val="0"/>
-        </w:rPr>
-        <w:t xml:space="preserve"/>
-      </w:r>
-    </w:p>
-    <w:p>
-      <w:pPr/>
-      <w:r>
-        <w:rPr>
-          <w:rFonts w:ascii="Helvetica" w:hAnsi="Helvetica" w:cs="Helvetica"/>
-          <w:sz w:val="24"/>
-          <w:sz-cs w:val="24"/>
-          <w:spacing w:val="0"/>
+          <w:rFonts w:ascii="Helvetica Neue" w:hAnsi="Helvetica Neue" w:cs="Helvetica Neue"/>
+          <w:sz w:val="26"/>
+          <w:sz-cs w:val="26"/>
+          <w:spacing w:val="0"/>
+          <w:color w:val="171E2D"/>
+        </w:rPr>
+        <w:t xml:space="preserve"/>
+      </w:r>
+    </w:p>
+    <w:p>
+      <w:pPr/>
+      <w:r>
+        <w:rPr>
+          <w:rFonts w:ascii="Helvetica Neue" w:hAnsi="Helvetica Neue" w:cs="Helvetica Neue"/>
+          <w:sz w:val="26"/>
+          <w:sz-cs w:val="26"/>
+          <w:spacing w:val="0"/>
+          <w:color w:val="171E2D"/>
         </w:rPr>
         <w:t xml:space="preserve">City-Wide Stations</w:t>
       </w:r>
@@ -1198,10 +1395,11 @@
       <w:pPr/>
       <w:r>
         <w:rPr>
-          <w:rFonts w:ascii="Helvetica" w:hAnsi="Helvetica" w:cs="Helvetica"/>
-          <w:sz w:val="24"/>
-          <w:sz-cs w:val="24"/>
-          <w:spacing w:val="0"/>
+          <w:rFonts w:ascii="Helvetica Neue" w:hAnsi="Helvetica Neue" w:cs="Helvetica Neue"/>
+          <w:sz w:val="26"/>
+          <w:sz-cs w:val="26"/>
+          <w:spacing w:val="0"/>
+          <w:color w:val="171E2D"/>
         </w:rPr>
         <w:t xml:space="preserve">Composite AQI, PM</w:t>
       </w:r>
@@ -1212,10 +1410,11 @@
       </w:pPr>
       <w:r>
         <w:rPr>
-          <w:rFonts w:ascii="Helvetica" w:hAnsi="Helvetica" w:cs="Helvetica"/>
-          <w:sz w:val="24"/>
-          <w:sz-cs w:val="24"/>
-          <w:spacing w:val="0"/>
+          <w:rFonts w:ascii="Helvetica Neue" w:hAnsi="Helvetica Neue" w:cs="Helvetica Neue"/>
+          <w:sz w:val="26"/>
+          <w:sz-cs w:val="26"/>
+          <w:spacing w:val="0"/>
+          <w:color w:val="171E2D"/>
         </w:rPr>
         <w:t xml:space="preserve">❌ None</w:t>
       </w:r>
@@ -1224,10 +1423,11 @@
       <w:pPr/>
       <w:r>
         <w:rPr>
-          <w:rFonts w:ascii="Helvetica" w:hAnsi="Helvetica" w:cs="Helvetica"/>
-          <w:sz w:val="24"/>
-          <w:sz-cs w:val="24"/>
-          <w:spacing w:val="0"/>
+          <w:rFonts w:ascii="Helvetica Neue" w:hAnsi="Helvetica Neue" w:cs="Helvetica Neue"/>
+          <w:sz w:val="26"/>
+          <w:sz-cs w:val="26"/>
+          <w:spacing w:val="0"/>
+          <w:color w:val="171E2D"/>
         </w:rPr>
         <w:t xml:space="preserve">Monolithic Cloud Clusters</w:t>
       </w:r>
@@ -1236,10 +1436,11 @@
       <w:pPr/>
       <w:r>
         <w:rPr>
-          <w:rFonts w:ascii="Helvetica" w:hAnsi="Helvetica" w:cs="Helvetica"/>
-          <w:sz w:val="24"/>
-          <w:sz-cs w:val="24"/>
-          <w:spacing w:val="0"/>
+          <w:rFonts w:ascii="Helvetica Neue" w:hAnsi="Helvetica Neue" w:cs="Helvetica Neue"/>
+          <w:sz w:val="26"/>
+          <w:sz-cs w:val="26"/>
+          <w:spacing w:val="0"/>
+          <w:color w:val="171E2D"/>
         </w:rPr>
         <w:t xml:space="preserve">High Infrastructure</w:t>
       </w:r>
@@ -1248,32 +1449,35 @@
       <w:pPr/>
       <w:r>
         <w:rPr>
-          <w:rFonts w:ascii="Helvetica" w:hAnsi="Helvetica" w:cs="Helvetica"/>
-          <w:sz w:val="24"/>
-          <w:sz-cs w:val="24"/>
-          <w:b/>
-          <w:spacing w:val="0"/>
+          <w:rFonts w:ascii="Helvetica Neue" w:hAnsi="Helvetica Neue" w:cs="Helvetica Neue"/>
+          <w:sz w:val="26"/>
+          <w:sz-cs w:val="26"/>
+          <w:b/>
+          <w:spacing w:val="0"/>
+          <w:color w:val="171E2D"/>
         </w:rPr>
         <w:t xml:space="preserve">Proposed Pollution-Mapper</w:t>
       </w:r>
       <w:r>
         <w:rPr>
-          <w:rFonts w:ascii="Helvetica" w:hAnsi="Helvetica" w:cs="Helvetica"/>
-          <w:sz w:val="24"/>
-          <w:sz-cs w:val="24"/>
-          <w:spacing w:val="0"/>
-        </w:rPr>
-        <w:t xml:space="preserve"/>
-      </w:r>
-    </w:p>
-    <w:p>
-      <w:pPr/>
-      <w:r>
-        <w:rPr>
-          <w:rFonts w:ascii="Helvetica" w:hAnsi="Helvetica" w:cs="Helvetica"/>
-          <w:sz w:val="24"/>
-          <w:sz-cs w:val="24"/>
-          <w:spacing w:val="0"/>
+          <w:rFonts w:ascii="Helvetica Neue" w:hAnsi="Helvetica Neue" w:cs="Helvetica Neue"/>
+          <w:sz w:val="26"/>
+          <w:sz-cs w:val="26"/>
+          <w:spacing w:val="0"/>
+          <w:color w:val="171E2D"/>
+        </w:rPr>
+        <w:t xml:space="preserve"/>
+      </w:r>
+    </w:p>
+    <w:p>
+      <w:pPr/>
+      <w:r>
+        <w:rPr>
+          <w:rFonts w:ascii="Helvetica Neue" w:hAnsi="Helvetica Neue" w:cs="Helvetica Neue"/>
+          <w:sz w:val="26"/>
+          <w:sz-cs w:val="26"/>
+          <w:spacing w:val="0"/>
+          <w:color w:val="171E2D"/>
         </w:rPr>
         <w:t xml:space="preserve">Street / Micro-Locality</w:t>
       </w:r>
@@ -1282,10 +1486,11 @@
       <w:pPr/>
       <w:r>
         <w:rPr>
-          <w:rFonts w:ascii="Helvetica" w:hAnsi="Helvetica" w:cs="Helvetica"/>
-          <w:sz w:val="24"/>
-          <w:sz-cs w:val="24"/>
-          <w:spacing w:val="0"/>
+          <w:rFonts w:ascii="Helvetica Neue" w:hAnsi="Helvetica Neue" w:cs="Helvetica Neue"/>
+          <w:sz w:val="26"/>
+          <w:sz-cs w:val="26"/>
+          <w:spacing w:val="0"/>
+          <w:color w:val="171E2D"/>
         </w:rPr>
         <w:t xml:space="preserve">AQI, $PM_{2.5}, PM_{10}$, Noise (dB)</w:t>
       </w:r>
@@ -1296,82 +1501,89 @@
       </w:pPr>
       <w:r>
         <w:rPr>
-          <w:rFonts w:ascii="Helvetica" w:hAnsi="Helvetica" w:cs="Helvetica"/>
-          <w:sz w:val="24"/>
-          <w:sz-cs w:val="24"/>
-          <w:spacing w:val="0"/>
+          <w:rFonts w:ascii="Helvetica Neue" w:hAnsi="Helvetica Neue" w:cs="Helvetica Neue"/>
+          <w:sz w:val="26"/>
+          <w:sz-cs w:val="26"/>
+          <w:spacing w:val="0"/>
+          <w:color w:val="171E2D"/>
         </w:rPr>
         <w:t xml:space="preserve">✅ </w:t>
       </w:r>
       <w:r>
         <w:rPr>
-          <w:rFonts w:ascii="Helvetica" w:hAnsi="Helvetica" w:cs="Helvetica"/>
-          <w:sz w:val="24"/>
-          <w:sz-cs w:val="24"/>
-          <w:b/>
-          <w:spacing w:val="0"/>
+          <w:rFonts w:ascii="Helvetica Neue" w:hAnsi="Helvetica Neue" w:cs="Helvetica Neue"/>
+          <w:sz w:val="26"/>
+          <w:sz-cs w:val="26"/>
+          <w:b/>
+          <w:spacing w:val="0"/>
+          <w:color w:val="171E2D"/>
         </w:rPr>
         <w:t xml:space="preserve">Primary &amp; Baseline</w:t>
       </w:r>
       <w:r>
         <w:rPr>
-          <w:rFonts w:ascii="Helvetica" w:hAnsi="Helvetica" w:cs="Helvetica"/>
-          <w:sz w:val="24"/>
-          <w:sz-cs w:val="24"/>
-          <w:spacing w:val="0"/>
-        </w:rPr>
-        <w:t xml:space="preserve"/>
-      </w:r>
-    </w:p>
-    <w:p>
-      <w:pPr/>
-      <w:r>
-        <w:rPr>
-          <w:rFonts w:ascii="Helvetica" w:hAnsi="Helvetica" w:cs="Helvetica"/>
-          <w:sz w:val="24"/>
-          <w:sz-cs w:val="24"/>
-          <w:b/>
-          <w:spacing w:val="0"/>
+          <w:rFonts w:ascii="Helvetica Neue" w:hAnsi="Helvetica Neue" w:cs="Helvetica Neue"/>
+          <w:sz w:val="26"/>
+          <w:sz-cs w:val="26"/>
+          <w:spacing w:val="0"/>
+          <w:color w:val="171E2D"/>
+        </w:rPr>
+        <w:t xml:space="preserve"/>
+      </w:r>
+    </w:p>
+    <w:p>
+      <w:pPr/>
+      <w:r>
+        <w:rPr>
+          <w:rFonts w:ascii="Helvetica Neue" w:hAnsi="Helvetica Neue" w:cs="Helvetica Neue"/>
+          <w:sz w:val="26"/>
+          <w:sz-cs w:val="26"/>
+          <w:b/>
+          <w:spacing w:val="0"/>
+          <w:color w:val="171E2D"/>
         </w:rPr>
         <w:t xml:space="preserve">Serverless Git-Backed Engine</w:t>
       </w:r>
       <w:r>
         <w:rPr>
-          <w:rFonts w:ascii="Helvetica" w:hAnsi="Helvetica" w:cs="Helvetica"/>
-          <w:sz w:val="24"/>
-          <w:sz-cs w:val="24"/>
-          <w:spacing w:val="0"/>
-        </w:rPr>
-        <w:t xml:space="preserve"/>
-      </w:r>
-    </w:p>
-    <w:p>
-      <w:pPr/>
-      <w:r>
-        <w:rPr>
-          <w:rFonts w:ascii="Helvetica" w:hAnsi="Helvetica" w:cs="Helvetica"/>
-          <w:sz w:val="24"/>
-          <w:sz-cs w:val="24"/>
-          <w:b/>
-          <w:spacing w:val="0"/>
+          <w:rFonts w:ascii="Helvetica Neue" w:hAnsi="Helvetica Neue" w:cs="Helvetica Neue"/>
+          <w:sz w:val="26"/>
+          <w:sz-cs w:val="26"/>
+          <w:spacing w:val="0"/>
+          <w:color w:val="171E2D"/>
+        </w:rPr>
+        <w:t xml:space="preserve"/>
+      </w:r>
+    </w:p>
+    <w:p>
+      <w:pPr/>
+      <w:r>
+        <w:rPr>
+          <w:rFonts w:ascii="Helvetica Neue" w:hAnsi="Helvetica Neue" w:cs="Helvetica Neue"/>
+          <w:sz w:val="26"/>
+          <w:sz-cs w:val="26"/>
+          <w:b/>
+          <w:spacing w:val="0"/>
+          <w:color w:val="171E2D"/>
         </w:rPr>
         <w:t xml:space="preserve">Zero Cost</w:t>
       </w:r>
       <w:r>
         <w:rPr>
-          <w:rFonts w:ascii="Helvetica" w:hAnsi="Helvetica" w:cs="Helvetica"/>
-          <w:sz w:val="24"/>
-          <w:sz-cs w:val="24"/>
-          <w:spacing w:val="0"/>
-        </w:rPr>
-        <w:t xml:space="preserve"/>
-      </w:r>
-    </w:p>
-    <w:p>
-      <w:pPr/>
-      <w:r>
-        <w:rPr>
-          <w:rFonts w:ascii="Helvetica" w:hAnsi="Helvetica" w:cs="Helvetica"/>
+          <w:rFonts w:ascii="Helvetica Neue" w:hAnsi="Helvetica Neue" w:cs="Helvetica Neue"/>
+          <w:sz w:val="26"/>
+          <w:sz-cs w:val="26"/>
+          <w:spacing w:val="0"/>
+          <w:color w:val="171E2D"/>
+        </w:rPr>
+        <w:t xml:space="preserve"/>
+      </w:r>
+    </w:p>
+    <w:p>
+      <w:pPr/>
+      <w:r>
+        <w:rPr>
+          <w:rFonts w:ascii="Helvetica Neue" w:hAnsi="Helvetica Neue" w:cs="Helvetica Neue"/>
           <w:sz w:val="24"/>
           <w:sz-cs w:val="24"/>
           <w:spacing w:val="0"/>
@@ -1386,11 +1598,12 @@
       </w:pPr>
       <w:r>
         <w:rPr>
-          <w:rFonts w:ascii="Helvetica" w:hAnsi="Helvetica" w:cs="Helvetica"/>
+          <w:rFonts w:ascii="Helvetica Neue" w:hAnsi="Helvetica Neue" w:cs="Helvetica Neue"/>
           <w:sz w:val="36"/>
           <w:sz-cs w:val="36"/>
           <w:b/>
           <w:spacing w:val="0"/>
+          <w:color w:val="172A9F"/>
         </w:rPr>
         <w:t xml:space="preserve">CHAPTER 3: METHODOLOGY &amp; SYSTEM ARCHITECTURE</w:t>
       </w:r>
@@ -1401,11 +1614,12 @@
       </w:pPr>
       <w:r>
         <w:rPr>
-          <w:rFonts w:ascii="Helvetica" w:hAnsi="Helvetica" w:cs="Helvetica"/>
+          <w:rFonts w:ascii="Helvetica Neue" w:hAnsi="Helvetica Neue" w:cs="Helvetica Neue"/>
           <w:sz w:val="28"/>
           <w:sz-cs w:val="28"/>
           <w:b/>
           <w:spacing w:val="0"/>
+          <w:color w:val="171E2D"/>
         </w:rPr>
         <w:t xml:space="preserve">3.1 The Hybrid Data Model</w:t>
       </w:r>
@@ -1418,6 +1632,7 @@
           <w:sz w:val="26"/>
           <w:sz-cs w:val="26"/>
           <w:spacing w:val="0"/>
+          <w:color w:val="171E2D"/>
         </w:rPr>
         <w:t xml:space="preserve">flowchart TD</w:t>
       </w:r>
@@ -1430,6 +1645,7 @@
           <w:sz w:val="26"/>
           <w:sz-cs w:val="26"/>
           <w:spacing w:val="0"/>
+          <w:color w:val="171E2D"/>
         </w:rPr>
         <w:t xml:space="preserve">    subgraph Data Acquisition</w:t>
       </w:r>
@@ -1442,6 +1658,7 @@
           <w:sz w:val="26"/>
           <w:sz-cs w:val="26"/>
           <w:spacing w:val="0"/>
+          <w:color w:val="171E2D"/>
         </w:rPr>
         <w:t xml:space="preserve">        API["Secondary Automated Feeds (WAQI &amp; Open-Meteo REST APIs)"]</w:t>
       </w:r>
@@ -1454,6 +1671,7 @@
           <w:sz w:val="26"/>
           <w:sz-cs w:val="26"/>
           <w:spacing w:val="0"/>
+          <w:color w:val="171E2D"/>
         </w:rPr>
         <w:t xml:space="preserve">        Field["Primary Field Survey (Calibrated Sound Level Meter Apps)"]</w:t>
       </w:r>
@@ -1466,6 +1684,7 @@
           <w:sz w:val="26"/>
           <w:sz-cs w:val="26"/>
           <w:spacing w:val="0"/>
+          <w:color w:val="171E2D"/>
         </w:rPr>
         <w:t xml:space="preserve">        Model["Diurnal Urban Traffic Acoustic Model (WHO Guidelines)"]</w:t>
       </w:r>
@@ -1478,6 +1697,7 @@
           <w:sz w:val="26"/>
           <w:sz-cs w:val="26"/>
           <w:spacing w:val="0"/>
+          <w:color w:val="171E2D"/>
         </w:rPr>
         <w:t xml:space="preserve">    end</w:t>
       </w:r>
@@ -1490,6 +1710,7 @@
           <w:sz w:val="26"/>
           <w:sz-cs w:val="26"/>
           <w:spacing w:val="0"/>
+          <w:color w:val="171E2D"/>
         </w:rPr>
         <w:t xml:space="preserve"/>
       </w:r>
@@ -1502,6 +1723,7 @@
           <w:sz w:val="26"/>
           <w:sz-cs w:val="26"/>
           <w:spacing w:val="0"/>
+          <w:color w:val="171E2D"/>
         </w:rPr>
         <w:t xml:space="preserve">    subgraph Data Pipeline &amp; Storage</w:t>
       </w:r>
@@ -1514,6 +1736,7 @@
           <w:sz w:val="26"/>
           <w:sz-cs w:val="26"/>
           <w:spacing w:val="0"/>
+          <w:color w:val="171E2D"/>
         </w:rPr>
         <w:t xml:space="preserve">        StateEngine["Ingestion &amp; State Controller"]</w:t>
       </w:r>
@@ -1526,6 +1749,7 @@
           <w:sz w:val="26"/>
           <w:sz-cs w:val="26"/>
           <w:spacing w:val="0"/>
+          <w:color w:val="171E2D"/>
         </w:rPr>
         <w:t xml:space="preserve">        CSV_Air[("data/air_quality.csv")]</w:t>
       </w:r>
@@ -1538,6 +1762,7 @@
           <w:sz w:val="26"/>
           <w:sz-cs w:val="26"/>
           <w:spacing w:val="0"/>
+          <w:color w:val="171E2D"/>
         </w:rPr>
         <w:t xml:space="preserve">        CSV_Noise[("data/noise_readings.csv")]</w:t>
       </w:r>
@@ -1550,6 +1775,7 @@
           <w:sz w:val="26"/>
           <w:sz-cs w:val="26"/>
           <w:spacing w:val="0"/>
+          <w:color w:val="171E2D"/>
         </w:rPr>
         <w:t xml:space="preserve">    end</w:t>
       </w:r>
@@ -1562,6 +1788,7 @@
           <w:sz w:val="26"/>
           <w:sz-cs w:val="26"/>
           <w:spacing w:val="0"/>
+          <w:color w:val="171E2D"/>
         </w:rPr>
         <w:t xml:space="preserve"/>
       </w:r>
@@ -1574,6 +1801,7 @@
           <w:sz w:val="26"/>
           <w:sz-cs w:val="26"/>
           <w:spacing w:val="0"/>
+          <w:color w:val="171E2D"/>
         </w:rPr>
         <w:t xml:space="preserve">    subgraph Serverless CI/CD Automation</w:t>
       </w:r>
@@ -1586,6 +1814,7 @@
           <w:sz w:val="26"/>
           <w:sz-cs w:val="26"/>
           <w:spacing w:val="0"/>
+          <w:color w:val="171E2D"/>
         </w:rPr>
         <w:t xml:space="preserve">        GHA["GitHub Actions Scheduled Runner (Daily 06:00 UTC)"]</w:t>
       </w:r>
@@ -1598,6 +1827,7 @@
           <w:sz w:val="26"/>
           <w:sz-cs w:val="26"/>
           <w:spacing w:val="0"/>
+          <w:color w:val="171E2D"/>
         </w:rPr>
         <w:t xml:space="preserve">        GHS["GitHub Secrets (WAQI_TOKEN)"]</w:t>
       </w:r>
@@ -1610,6 +1840,7 @@
           <w:sz w:val="26"/>
           <w:sz-cs w:val="26"/>
           <w:spacing w:val="0"/>
+          <w:color w:val="171E2D"/>
         </w:rPr>
         <w:t xml:space="preserve">    end</w:t>
       </w:r>
@@ -1622,6 +1853,7 @@
           <w:sz w:val="26"/>
           <w:sz-cs w:val="26"/>
           <w:spacing w:val="0"/>
+          <w:color w:val="171E2D"/>
         </w:rPr>
         <w:t xml:space="preserve"/>
       </w:r>
@@ -1634,6 +1866,7 @@
           <w:sz w:val="26"/>
           <w:sz-cs w:val="26"/>
           <w:spacing w:val="0"/>
+          <w:color w:val="171E2D"/>
         </w:rPr>
         <w:t xml:space="preserve">    subgraph Presentation &amp; Analytics Layer</w:t>
       </w:r>
@@ -1646,6 +1879,7 @@
           <w:sz w:val="26"/>
           <w:sz-cs w:val="26"/>
           <w:spacing w:val="0"/>
+          <w:color w:val="171E2D"/>
         </w:rPr>
         <w:t xml:space="preserve">        UI["Streamlit Web Dashboard (app.py)"]</w:t>
       </w:r>
@@ -1658,6 +1892,7 @@
           <w:sz w:val="26"/>
           <w:sz-cs w:val="26"/>
           <w:spacing w:val="0"/>
+          <w:color w:val="171E2D"/>
         </w:rPr>
         <w:t xml:space="preserve">        Map["Plotly MapLibre Vector GIS Map"]</w:t>
       </w:r>
@@ -1670,6 +1905,7 @@
           <w:sz w:val="26"/>
           <w:sz-cs w:val="26"/>
           <w:spacing w:val="0"/>
+          <w:color w:val="171E2D"/>
         </w:rPr>
         <w:t xml:space="preserve">        Corr["Pearson Correlation Analytics Engine"]</w:t>
       </w:r>
@@ -1682,6 +1918,7 @@
           <w:sz w:val="26"/>
           <w:sz-cs w:val="26"/>
           <w:spacing w:val="0"/>
+          <w:color w:val="171E2D"/>
         </w:rPr>
         <w:t xml:space="preserve">    end</w:t>
       </w:r>
@@ -1694,6 +1931,7 @@
           <w:sz w:val="26"/>
           <w:sz-cs w:val="26"/>
           <w:spacing w:val="0"/>
+          <w:color w:val="171E2D"/>
         </w:rPr>
         <w:t xml:space="preserve"/>
       </w:r>
@@ -1706,6 +1944,7 @@
           <w:sz w:val="26"/>
           <w:sz-cs w:val="26"/>
           <w:spacing w:val="0"/>
+          <w:color w:val="171E2D"/>
         </w:rPr>
         <w:t xml:space="preserve">    API --&gt; StateEngine</w:t>
       </w:r>
@@ -1718,6 +1957,7 @@
           <w:sz w:val="26"/>
           <w:sz-cs w:val="26"/>
           <w:spacing w:val="0"/>
+          <w:color w:val="171E2D"/>
         </w:rPr>
         <w:t xml:space="preserve">    Field --&gt; StateEngine</w:t>
       </w:r>
@@ -1730,6 +1970,7 @@
           <w:sz w:val="26"/>
           <w:sz-cs w:val="26"/>
           <w:spacing w:val="0"/>
+          <w:color w:val="171E2D"/>
         </w:rPr>
         <w:t xml:space="preserve">    Model --&gt; StateEngine</w:t>
       </w:r>
@@ -1742,6 +1983,7 @@
           <w:sz w:val="26"/>
           <w:sz-cs w:val="26"/>
           <w:spacing w:val="0"/>
+          <w:color w:val="171E2D"/>
         </w:rPr>
         <w:t xml:space="preserve">    StateEngine --&gt; CSV_Air</w:t>
       </w:r>
@@ -1754,6 +1996,7 @@
           <w:sz w:val="26"/>
           <w:sz-cs w:val="26"/>
           <w:spacing w:val="0"/>
+          <w:color w:val="171E2D"/>
         </w:rPr>
         <w:t xml:space="preserve">    StateEngine --&gt; CSV_Noise</w:t>
       </w:r>
@@ -1766,6 +2009,7 @@
           <w:sz w:val="26"/>
           <w:sz-cs w:val="26"/>
           <w:spacing w:val="0"/>
+          <w:color w:val="171E2D"/>
         </w:rPr>
         <w:t xml:space="preserve"/>
       </w:r>
@@ -1778,6 +2022,7 @@
           <w:sz w:val="26"/>
           <w:sz-cs w:val="26"/>
           <w:spacing w:val="0"/>
+          <w:color w:val="171E2D"/>
         </w:rPr>
         <w:t xml:space="preserve">    GHS --&gt; GHA</w:t>
       </w:r>
@@ -1790,6 +2035,7 @@
           <w:sz w:val="26"/>
           <w:sz-cs w:val="26"/>
           <w:spacing w:val="0"/>
+          <w:color w:val="171E2D"/>
         </w:rPr>
         <w:t xml:space="preserve">    GHA --&gt;|Automated Daily Run| StateEngine</w:t>
       </w:r>
@@ -1802,6 +2048,7 @@
           <w:sz w:val="26"/>
           <w:sz-cs w:val="26"/>
           <w:spacing w:val="0"/>
+          <w:color w:val="171E2D"/>
         </w:rPr>
         <w:t xml:space="preserve"/>
       </w:r>
@@ -1814,6 +2061,7 @@
           <w:sz w:val="26"/>
           <w:sz-cs w:val="26"/>
           <w:spacing w:val="0"/>
+          <w:color w:val="171E2D"/>
         </w:rPr>
         <w:t xml:space="preserve">    CSV_Air --&gt; UI</w:t>
       </w:r>
@@ -1826,6 +2074,7 @@
           <w:sz w:val="26"/>
           <w:sz-cs w:val="26"/>
           <w:spacing w:val="0"/>
+          <w:color w:val="171E2D"/>
         </w:rPr>
         <w:t xml:space="preserve">    CSV_Noise --&gt; UI</w:t>
       </w:r>
@@ -1838,6 +2087,7 @@
           <w:sz w:val="26"/>
           <w:sz-cs w:val="26"/>
           <w:spacing w:val="0"/>
+          <w:color w:val="171E2D"/>
         </w:rPr>
         <w:t xml:space="preserve">    UI --&gt; Map</w:t>
       </w:r>
@@ -1850,6 +2100,7 @@
           <w:sz w:val="26"/>
           <w:sz-cs w:val="26"/>
           <w:spacing w:val="0"/>
+          <w:color w:val="171E2D"/>
         </w:rPr>
         <w:t xml:space="preserve">    UI --&gt; Corr</w:t>
       </w:r>
@@ -1860,10 +2111,11 @@
       </w:pPr>
       <w:r>
         <w:rPr>
-          <w:rFonts w:ascii="Helvetica" w:hAnsi="Helvetica" w:cs="Helvetica"/>
-          <w:sz w:val="24"/>
-          <w:sz-cs w:val="24"/>
-          <w:b/>
+          <w:rFonts w:ascii="Helvetica Neue" w:hAnsi="Helvetica Neue" w:cs="Helvetica Neue"/>
+          <w:sz w:val="24"/>
+          <w:sz-cs w:val="24"/>
+          <w:b/>
+          <w:color w:val="171E2D"/>
         </w:rPr>
         <w:t xml:space="preserve"/>
         <w:tab/>
@@ -1873,20 +2125,22 @@
       </w:r>
       <w:r>
         <w:rPr>
-          <w:rFonts w:ascii="Helvetica" w:hAnsi="Helvetica" w:cs="Helvetica"/>
-          <w:sz w:val="24"/>
-          <w:sz-cs w:val="24"/>
-          <w:b/>
-          <w:spacing w:val="0"/>
+          <w:rFonts w:ascii="Helvetica Neue" w:hAnsi="Helvetica Neue" w:cs="Helvetica Neue"/>
+          <w:sz w:val="24"/>
+          <w:sz-cs w:val="24"/>
+          <w:b/>
+          <w:spacing w:val="0"/>
+          <w:color w:val="171E2D"/>
         </w:rPr>
         <w:t xml:space="preserve">Secondary Data (Air Quality)</w:t>
       </w:r>
       <w:r>
         <w:rPr>
-          <w:rFonts w:ascii="Helvetica" w:hAnsi="Helvetica" w:cs="Helvetica"/>
-          <w:sz w:val="24"/>
-          <w:sz-cs w:val="24"/>
-          <w:spacing w:val="0"/>
+          <w:rFonts w:ascii="Helvetica Neue" w:hAnsi="Helvetica Neue" w:cs="Helvetica Neue"/>
+          <w:sz w:val="24"/>
+          <w:sz-cs w:val="24"/>
+          <w:spacing w:val="0"/>
+          <w:color w:val="171E2D"/>
         </w:rPr>
         <w:t xml:space="preserve">: Automated RESTful HTTP GET queries pull real-time $PM_{2.5}, PM_{10}$, and $US\ AQI$ values from monitoring stations.</w:t>
       </w:r>
@@ -1897,10 +2151,11 @@
       </w:pPr>
       <w:r>
         <w:rPr>
-          <w:rFonts w:ascii="Helvetica" w:hAnsi="Helvetica" w:cs="Helvetica"/>
-          <w:sz w:val="24"/>
-          <w:sz-cs w:val="24"/>
-          <w:b/>
+          <w:rFonts w:ascii="Helvetica Neue" w:hAnsi="Helvetica Neue" w:cs="Helvetica Neue"/>
+          <w:sz w:val="24"/>
+          <w:sz-cs w:val="24"/>
+          <w:b/>
+          <w:color w:val="171E2D"/>
         </w:rPr>
         <w:t xml:space="preserve"/>
         <w:tab/>
@@ -1910,20 +2165,22 @@
       </w:r>
       <w:r>
         <w:rPr>
-          <w:rFonts w:ascii="Helvetica" w:hAnsi="Helvetica" w:cs="Helvetica"/>
-          <w:sz w:val="24"/>
-          <w:sz-cs w:val="24"/>
-          <w:b/>
-          <w:spacing w:val="0"/>
+          <w:rFonts w:ascii="Helvetica Neue" w:hAnsi="Helvetica Neue" w:cs="Helvetica Neue"/>
+          <w:sz w:val="24"/>
+          <w:sz-cs w:val="24"/>
+          <w:b/>
+          <w:spacing w:val="0"/>
+          <w:color w:val="171E2D"/>
         </w:rPr>
         <w:t xml:space="preserve">Primary Data (Acoustic Field)</w:t>
       </w:r>
       <w:r>
         <w:rPr>
-          <w:rFonts w:ascii="Helvetica" w:hAnsi="Helvetica" w:cs="Helvetica"/>
-          <w:sz w:val="24"/>
-          <w:sz-cs w:val="24"/>
-          <w:spacing w:val="0"/>
+          <w:rFonts w:ascii="Helvetica Neue" w:hAnsi="Helvetica Neue" w:cs="Helvetica Neue"/>
+          <w:sz w:val="24"/>
+          <w:sz-cs w:val="24"/>
+          <w:spacing w:val="0"/>
+          <w:color w:val="171E2D"/>
         </w:rPr>
         <w:t xml:space="preserve">: Field measurements conducted using IEC 61672-1 Type 2 configured smartphone sound meters (A-weighting, slow response, 60-second $L_{\text{Aeq}}$ integration).</w:t>
       </w:r>
@@ -1934,10 +2191,11 @@
       </w:pPr>
       <w:r>
         <w:rPr>
-          <w:rFonts w:ascii="Helvetica" w:hAnsi="Helvetica" w:cs="Helvetica"/>
-          <w:sz w:val="24"/>
-          <w:sz-cs w:val="24"/>
-          <w:b/>
+          <w:rFonts w:ascii="Helvetica Neue" w:hAnsi="Helvetica Neue" w:cs="Helvetica Neue"/>
+          <w:sz w:val="24"/>
+          <w:sz-cs w:val="24"/>
+          <w:b/>
+          <w:color w:val="171E2D"/>
         </w:rPr>
         <w:t xml:space="preserve"/>
         <w:tab/>
@@ -1947,20 +2205,22 @@
       </w:r>
       <w:r>
         <w:rPr>
-          <w:rFonts w:ascii="Helvetica" w:hAnsi="Helvetica" w:cs="Helvetica"/>
-          <w:sz w:val="24"/>
-          <w:sz-cs w:val="24"/>
-          <w:b/>
-          <w:spacing w:val="0"/>
+          <w:rFonts w:ascii="Helvetica Neue" w:hAnsi="Helvetica Neue" w:cs="Helvetica Neue"/>
+          <w:sz w:val="24"/>
+          <w:sz-cs w:val="24"/>
+          <w:b/>
+          <w:spacing w:val="0"/>
+          <w:color w:val="171E2D"/>
         </w:rPr>
         <w:t xml:space="preserve">Modeled Urban Baseline</w:t>
       </w:r>
       <w:r>
         <w:rPr>
-          <w:rFonts w:ascii="Helvetica" w:hAnsi="Helvetica" w:cs="Helvetica"/>
-          <w:sz w:val="24"/>
-          <w:sz-cs w:val="24"/>
-          <w:spacing w:val="0"/>
+          <w:rFonts w:ascii="Helvetica Neue" w:hAnsi="Helvetica Neue" w:cs="Helvetica Neue"/>
+          <w:sz w:val="24"/>
+          <w:sz-cs w:val="24"/>
+          <w:spacing w:val="0"/>
+          <w:color w:val="171E2D"/>
         </w:rPr>
         <w:t xml:space="preserve">: For global searched cities lacking field surveys, a diurnal traffic acoustic model synthesizes contextual ambient baselines, maintaining transparent data tagging in the user interface.</w:t>
       </w:r>
@@ -1969,7 +2229,7 @@
       <w:pPr/>
       <w:r>
         <w:rPr>
-          <w:rFonts w:ascii="Helvetica" w:hAnsi="Helvetica" w:cs="Helvetica"/>
+          <w:rFonts w:ascii="Helvetica Neue" w:hAnsi="Helvetica Neue" w:cs="Helvetica Neue"/>
           <w:sz w:val="24"/>
           <w:sz-cs w:val="24"/>
           <w:spacing w:val="0"/>
@@ -1984,11 +2244,12 @@
       </w:pPr>
       <w:r>
         <w:rPr>
-          <w:rFonts w:ascii="Helvetica" w:hAnsi="Helvetica" w:cs="Helvetica"/>
+          <w:rFonts w:ascii="Helvetica Neue" w:hAnsi="Helvetica Neue" w:cs="Helvetica Neue"/>
           <w:sz w:val="36"/>
           <w:sz-cs w:val="36"/>
           <w:b/>
           <w:spacing w:val="0"/>
+          <w:color w:val="172A9F"/>
         </w:rPr>
         <w:t xml:space="preserve">CHAPTER 4: DATA COLLECTION &amp; EMPIRICAL ANALYSIS</w:t>
       </w:r>
@@ -1999,11 +2260,12 @@
       </w:pPr>
       <w:r>
         <w:rPr>
-          <w:rFonts w:ascii="Helvetica" w:hAnsi="Helvetica" w:cs="Helvetica"/>
+          <w:rFonts w:ascii="Helvetica Neue" w:hAnsi="Helvetica Neue" w:cs="Helvetica Neue"/>
           <w:sz w:val="28"/>
           <w:sz-cs w:val="28"/>
           <w:b/>
           <w:spacing w:val="0"/>
+          <w:color w:val="171E2D"/>
         </w:rPr>
         <w:t xml:space="preserve">4.1 Field Survey Site Measurements</w:t>
       </w:r>
@@ -2014,10 +2276,11 @@
       </w:pPr>
       <w:r>
         <w:rPr>
-          <w:rFonts w:ascii="Helvetica" w:hAnsi="Helvetica" w:cs="Helvetica"/>
-          <w:sz w:val="24"/>
-          <w:sz-cs w:val="24"/>
-          <w:spacing w:val="0"/>
+          <w:rFonts w:ascii="Helvetica Neue" w:hAnsi="Helvetica Neue" w:cs="Helvetica Neue"/>
+          <w:sz w:val="24"/>
+          <w:sz-cs w:val="24"/>
+          <w:spacing w:val="0"/>
+          <w:color w:val="171E2D"/>
         </w:rPr>
         <w:t xml:space="preserve">Field sampling was conducted across six distinct urban land-use typologies:</w:t>
       </w:r>
@@ -2028,11 +2291,12 @@
       </w:pPr>
       <w:r>
         <w:rPr>
-          <w:rFonts w:ascii="Helvetica" w:hAnsi="Helvetica" w:cs="Helvetica"/>
-          <w:sz w:val="24"/>
-          <w:sz-cs w:val="24"/>
-          <w:b/>
-          <w:spacing w:val="0"/>
+          <w:rFonts w:ascii="Helvetica Neue" w:hAnsi="Helvetica Neue" w:cs="Helvetica Neue"/>
+          <w:sz w:val="26"/>
+          <w:sz-cs w:val="26"/>
+          <w:b/>
+          <w:spacing w:val="0"/>
+          <w:color w:val="0D121F"/>
         </w:rPr>
         <w:t xml:space="preserve">Site</w:t>
       </w:r>
@@ -2041,11 +2305,12 @@
       <w:pPr/>
       <w:r>
         <w:rPr>
-          <w:rFonts w:ascii="Helvetica" w:hAnsi="Helvetica" w:cs="Helvetica"/>
-          <w:sz w:val="24"/>
-          <w:sz-cs w:val="24"/>
-          <w:b/>
-          <w:spacing w:val="0"/>
+          <w:rFonts w:ascii="Helvetica Neue" w:hAnsi="Helvetica Neue" w:cs="Helvetica Neue"/>
+          <w:sz w:val="26"/>
+          <w:sz-cs w:val="26"/>
+          <w:b/>
+          <w:spacing w:val="0"/>
+          <w:color w:val="0D121F"/>
         </w:rPr>
         <w:t xml:space="preserve">Locality</w:t>
       </w:r>
@@ -2054,11 +2319,12 @@
       <w:pPr/>
       <w:r>
         <w:rPr>
-          <w:rFonts w:ascii="Helvetica" w:hAnsi="Helvetica" w:cs="Helvetica"/>
-          <w:sz w:val="24"/>
-          <w:sz-cs w:val="24"/>
-          <w:b/>
-          <w:spacing w:val="0"/>
+          <w:rFonts w:ascii="Helvetica Neue" w:hAnsi="Helvetica Neue" w:cs="Helvetica Neue"/>
+          <w:sz w:val="26"/>
+          <w:sz-cs w:val="26"/>
+          <w:b/>
+          <w:spacing w:val="0"/>
+          <w:color w:val="0D121F"/>
         </w:rPr>
         <w:t xml:space="preserve">Land-Use Typology</w:t>
       </w:r>
@@ -2069,11 +2335,12 @@
       </w:pPr>
       <w:r>
         <w:rPr>
-          <w:rFonts w:ascii="Helvetica" w:hAnsi="Helvetica" w:cs="Helvetica"/>
-          <w:sz w:val="24"/>
-          <w:sz-cs w:val="24"/>
-          <w:b/>
-          <w:spacing w:val="0"/>
+          <w:rFonts w:ascii="Helvetica Neue" w:hAnsi="Helvetica Neue" w:cs="Helvetica Neue"/>
+          <w:sz w:val="26"/>
+          <w:sz-cs w:val="26"/>
+          <w:b/>
+          <w:spacing w:val="0"/>
+          <w:color w:val="0D121F"/>
         </w:rPr>
         <w:t xml:space="preserve">Sound Level ($L_{\text{Aeq}}$)</w:t>
       </w:r>
@@ -2084,11 +2351,12 @@
       </w:pPr>
       <w:r>
         <w:rPr>
-          <w:rFonts w:ascii="Helvetica" w:hAnsi="Helvetica" w:cs="Helvetica"/>
-          <w:sz w:val="24"/>
-          <w:sz-cs w:val="24"/>
-          <w:b/>
-          <w:spacing w:val="0"/>
+          <w:rFonts w:ascii="Helvetica Neue" w:hAnsi="Helvetica Neue" w:cs="Helvetica Neue"/>
+          <w:sz w:val="26"/>
+          <w:sz-cs w:val="26"/>
+          <w:b/>
+          <w:spacing w:val="0"/>
+          <w:color w:val="0D121F"/>
         </w:rPr>
         <w:t xml:space="preserve">AQI</w:t>
       </w:r>
@@ -2099,11 +2367,12 @@
       </w:pPr>
       <w:r>
         <w:rPr>
-          <w:rFonts w:ascii="Helvetica" w:hAnsi="Helvetica" w:cs="Helvetica"/>
-          <w:sz w:val="24"/>
-          <w:sz-cs w:val="24"/>
-          <w:b/>
-          <w:spacing w:val="0"/>
+          <w:rFonts w:ascii="Helvetica Neue" w:hAnsi="Helvetica Neue" w:cs="Helvetica Neue"/>
+          <w:sz w:val="26"/>
+          <w:sz-cs w:val="26"/>
+          <w:b/>
+          <w:spacing w:val="0"/>
+          <w:color w:val="0D121F"/>
         </w:rPr>
         <w:t xml:space="preserve">WHO Delta</w:t>
       </w:r>
@@ -2114,11 +2383,12 @@
       </w:pPr>
       <w:r>
         <w:rPr>
-          <w:rFonts w:ascii="Helvetica" w:hAnsi="Helvetica" w:cs="Helvetica"/>
-          <w:sz w:val="24"/>
-          <w:sz-cs w:val="24"/>
-          <w:b/>
-          <w:spacing w:val="0"/>
+          <w:rFonts w:ascii="Helvetica Neue" w:hAnsi="Helvetica Neue" w:cs="Helvetica Neue"/>
+          <w:sz w:val="26"/>
+          <w:sz-cs w:val="26"/>
+          <w:b/>
+          <w:spacing w:val="0"/>
+          <w:color w:val="0D121F"/>
         </w:rPr>
         <w:t xml:space="preserve">Health Status</w:t>
       </w:r>
@@ -2129,32 +2399,35 @@
       </w:pPr>
       <w:r>
         <w:rPr>
-          <w:rFonts w:ascii="Helvetica" w:hAnsi="Helvetica" w:cs="Helvetica"/>
-          <w:sz w:val="24"/>
-          <w:sz-cs w:val="24"/>
-          <w:b/>
-          <w:spacing w:val="0"/>
+          <w:rFonts w:ascii="Helvetica Neue" w:hAnsi="Helvetica Neue" w:cs="Helvetica Neue"/>
+          <w:sz w:val="26"/>
+          <w:sz-cs w:val="26"/>
+          <w:b/>
+          <w:spacing w:val="0"/>
+          <w:color w:val="171E2D"/>
         </w:rPr>
         <w:t xml:space="preserve">S1</w:t>
       </w:r>
       <w:r>
         <w:rPr>
-          <w:rFonts w:ascii="Helvetica" w:hAnsi="Helvetica" w:cs="Helvetica"/>
-          <w:sz w:val="24"/>
-          <w:sz-cs w:val="24"/>
-          <w:spacing w:val="0"/>
-        </w:rPr>
-        <w:t xml:space="preserve"/>
-      </w:r>
-    </w:p>
-    <w:p>
-      <w:pPr/>
-      <w:r>
-        <w:rPr>
-          <w:rFonts w:ascii="Helvetica" w:hAnsi="Helvetica" w:cs="Helvetica"/>
-          <w:sz w:val="24"/>
-          <w:sz-cs w:val="24"/>
-          <w:spacing w:val="0"/>
+          <w:rFonts w:ascii="Helvetica Neue" w:hAnsi="Helvetica Neue" w:cs="Helvetica Neue"/>
+          <w:sz w:val="26"/>
+          <w:sz-cs w:val="26"/>
+          <w:spacing w:val="0"/>
+          <w:color w:val="171E2D"/>
+        </w:rPr>
+        <w:t xml:space="preserve"/>
+      </w:r>
+    </w:p>
+    <w:p>
+      <w:pPr/>
+      <w:r>
+        <w:rPr>
+          <w:rFonts w:ascii="Helvetica Neue" w:hAnsi="Helvetica Neue" w:cs="Helvetica Neue"/>
+          <w:sz w:val="26"/>
+          <w:sz-cs w:val="26"/>
+          <w:spacing w:val="0"/>
+          <w:color w:val="171E2D"/>
         </w:rPr>
         <w:t xml:space="preserve">Shivajinagar Junction</w:t>
       </w:r>
@@ -2163,10 +2436,11 @@
       <w:pPr/>
       <w:r>
         <w:rPr>
-          <w:rFonts w:ascii="Helvetica" w:hAnsi="Helvetica" w:cs="Helvetica"/>
-          <w:sz w:val="24"/>
-          <w:sz-cs w:val="24"/>
-          <w:spacing w:val="0"/>
+          <w:rFonts w:ascii="Helvetica Neue" w:hAnsi="Helvetica Neue" w:cs="Helvetica Neue"/>
+          <w:sz w:val="26"/>
+          <w:sz-cs w:val="26"/>
+          <w:spacing w:val="0"/>
+          <w:color w:val="171E2D"/>
         </w:rPr>
         <w:t xml:space="preserve">Major Transit Terminal</w:t>
       </w:r>
@@ -2177,20 +2451,22 @@
       </w:pPr>
       <w:r>
         <w:rPr>
-          <w:rFonts w:ascii="Helvetica" w:hAnsi="Helvetica" w:cs="Helvetica"/>
-          <w:sz w:val="24"/>
-          <w:sz-cs w:val="24"/>
-          <w:b/>
-          <w:spacing w:val="0"/>
+          <w:rFonts w:ascii="Helvetica Neue" w:hAnsi="Helvetica Neue" w:cs="Helvetica Neue"/>
+          <w:sz w:val="26"/>
+          <w:sz-cs w:val="26"/>
+          <w:b/>
+          <w:spacing w:val="0"/>
+          <w:color w:val="171E2D"/>
         </w:rPr>
         <w:t xml:space="preserve">82.4 dB</w:t>
       </w:r>
       <w:r>
         <w:rPr>
-          <w:rFonts w:ascii="Helvetica" w:hAnsi="Helvetica" w:cs="Helvetica"/>
-          <w:sz w:val="24"/>
-          <w:sz-cs w:val="24"/>
-          <w:spacing w:val="0"/>
+          <w:rFonts w:ascii="Helvetica Neue" w:hAnsi="Helvetica Neue" w:cs="Helvetica Neue"/>
+          <w:sz w:val="26"/>
+          <w:sz-cs w:val="26"/>
+          <w:spacing w:val="0"/>
+          <w:color w:val="171E2D"/>
         </w:rPr>
         <w:t xml:space="preserve"/>
       </w:r>
@@ -2201,10 +2477,11 @@
       </w:pPr>
       <w:r>
         <w:rPr>
-          <w:rFonts w:ascii="Helvetica" w:hAnsi="Helvetica" w:cs="Helvetica"/>
-          <w:sz w:val="24"/>
-          <w:sz-cs w:val="24"/>
-          <w:spacing w:val="0"/>
+          <w:rFonts w:ascii="Helvetica Neue" w:hAnsi="Helvetica Neue" w:cs="Helvetica Neue"/>
+          <w:sz w:val="26"/>
+          <w:sz-cs w:val="26"/>
+          <w:spacing w:val="0"/>
+          <w:color w:val="171E2D"/>
         </w:rPr>
         <w:t xml:space="preserve">92</w:t>
       </w:r>
@@ -2215,10 +2492,11 @@
       </w:pPr>
       <w:r>
         <w:rPr>
-          <w:rFonts w:ascii="Helvetica" w:hAnsi="Helvetica" w:cs="Helvetica"/>
-          <w:sz w:val="24"/>
-          <w:sz-cs w:val="24"/>
-          <w:spacing w:val="0"/>
+          <w:rFonts w:ascii="Helvetica Neue" w:hAnsi="Helvetica Neue" w:cs="Helvetica Neue"/>
+          <w:sz w:val="26"/>
+          <w:sz-cs w:val="26"/>
+          <w:spacing w:val="0"/>
+          <w:color w:val="171E2D"/>
         </w:rPr>
         <w:t xml:space="preserve">$+27.4\text{ dB}$</w:t>
       </w:r>
@@ -2229,10 +2507,11 @@
       </w:pPr>
       <w:r>
         <w:rPr>
-          <w:rFonts w:ascii="Helvetica" w:hAnsi="Helvetica" w:cs="Helvetica"/>
-          <w:sz w:val="24"/>
-          <w:sz-cs w:val="24"/>
-          <w:spacing w:val="0"/>
+          <w:rFonts w:ascii="Helvetica Neue" w:hAnsi="Helvetica Neue" w:cs="Helvetica Neue"/>
+          <w:sz w:val="26"/>
+          <w:sz-cs w:val="26"/>
+          <w:spacing w:val="0"/>
+          <w:color w:val="171E2D"/>
         </w:rPr>
         <w:t xml:space="preserve">Moderate</w:t>
       </w:r>
@@ -2243,32 +2522,35 @@
       </w:pPr>
       <w:r>
         <w:rPr>
-          <w:rFonts w:ascii="Helvetica" w:hAnsi="Helvetica" w:cs="Helvetica"/>
-          <w:sz w:val="24"/>
-          <w:sz-cs w:val="24"/>
-          <w:b/>
-          <w:spacing w:val="0"/>
+          <w:rFonts w:ascii="Helvetica Neue" w:hAnsi="Helvetica Neue" w:cs="Helvetica Neue"/>
+          <w:sz w:val="26"/>
+          <w:sz-cs w:val="26"/>
+          <w:b/>
+          <w:spacing w:val="0"/>
+          <w:color w:val="171E2D"/>
         </w:rPr>
         <w:t xml:space="preserve">S2</w:t>
       </w:r>
       <w:r>
         <w:rPr>
-          <w:rFonts w:ascii="Helvetica" w:hAnsi="Helvetica" w:cs="Helvetica"/>
-          <w:sz w:val="24"/>
-          <w:sz-cs w:val="24"/>
-          <w:spacing w:val="0"/>
-        </w:rPr>
-        <w:t xml:space="preserve"/>
-      </w:r>
-    </w:p>
-    <w:p>
-      <w:pPr/>
-      <w:r>
-        <w:rPr>
-          <w:rFonts w:ascii="Helvetica" w:hAnsi="Helvetica" w:cs="Helvetica"/>
-          <w:sz w:val="24"/>
-          <w:sz-cs w:val="24"/>
-          <w:spacing w:val="0"/>
+          <w:rFonts w:ascii="Helvetica Neue" w:hAnsi="Helvetica Neue" w:cs="Helvetica Neue"/>
+          <w:sz w:val="26"/>
+          <w:sz-cs w:val="26"/>
+          <w:spacing w:val="0"/>
+          <w:color w:val="171E2D"/>
+        </w:rPr>
+        <w:t xml:space="preserve"/>
+      </w:r>
+    </w:p>
+    <w:p>
+      <w:pPr/>
+      <w:r>
+        <w:rPr>
+          <w:rFonts w:ascii="Helvetica Neue" w:hAnsi="Helvetica Neue" w:cs="Helvetica Neue"/>
+          <w:sz w:val="26"/>
+          <w:sz-cs w:val="26"/>
+          <w:spacing w:val="0"/>
+          <w:color w:val="171E2D"/>
         </w:rPr>
         <w:t xml:space="preserve">Laxmi Road</w:t>
       </w:r>
@@ -2277,10 +2559,11 @@
       <w:pPr/>
       <w:r>
         <w:rPr>
-          <w:rFonts w:ascii="Helvetica" w:hAnsi="Helvetica" w:cs="Helvetica"/>
-          <w:sz w:val="24"/>
-          <w:sz-cs w:val="24"/>
-          <w:spacing w:val="0"/>
+          <w:rFonts w:ascii="Helvetica Neue" w:hAnsi="Helvetica Neue" w:cs="Helvetica Neue"/>
+          <w:sz w:val="26"/>
+          <w:sz-cs w:val="26"/>
+          <w:spacing w:val="0"/>
+          <w:color w:val="171E2D"/>
         </w:rPr>
         <w:t xml:space="preserve">Commercial Retail Market</w:t>
       </w:r>
@@ -2291,20 +2574,22 @@
       </w:pPr>
       <w:r>
         <w:rPr>
-          <w:rFonts w:ascii="Helvetica" w:hAnsi="Helvetica" w:cs="Helvetica"/>
-          <w:sz w:val="24"/>
-          <w:sz-cs w:val="24"/>
-          <w:b/>
-          <w:spacing w:val="0"/>
+          <w:rFonts w:ascii="Helvetica Neue" w:hAnsi="Helvetica Neue" w:cs="Helvetica Neue"/>
+          <w:sz w:val="26"/>
+          <w:sz-cs w:val="26"/>
+          <w:b/>
+          <w:spacing w:val="0"/>
+          <w:color w:val="171E2D"/>
         </w:rPr>
         <w:t xml:space="preserve">78.0 dB</w:t>
       </w:r>
       <w:r>
         <w:rPr>
-          <w:rFonts w:ascii="Helvetica" w:hAnsi="Helvetica" w:cs="Helvetica"/>
-          <w:sz w:val="24"/>
-          <w:sz-cs w:val="24"/>
-          <w:spacing w:val="0"/>
+          <w:rFonts w:ascii="Helvetica Neue" w:hAnsi="Helvetica Neue" w:cs="Helvetica Neue"/>
+          <w:sz w:val="26"/>
+          <w:sz-cs w:val="26"/>
+          <w:spacing w:val="0"/>
+          <w:color w:val="171E2D"/>
         </w:rPr>
         <w:t xml:space="preserve"/>
       </w:r>
@@ -2315,10 +2600,11 @@
       </w:pPr>
       <w:r>
         <w:rPr>
-          <w:rFonts w:ascii="Helvetica" w:hAnsi="Helvetica" w:cs="Helvetica"/>
-          <w:sz w:val="24"/>
-          <w:sz-cs w:val="24"/>
-          <w:spacing w:val="0"/>
+          <w:rFonts w:ascii="Helvetica Neue" w:hAnsi="Helvetica Neue" w:cs="Helvetica Neue"/>
+          <w:sz w:val="26"/>
+          <w:sz-cs w:val="26"/>
+          <w:spacing w:val="0"/>
+          <w:color w:val="171E2D"/>
         </w:rPr>
         <w:t xml:space="preserve">88</w:t>
       </w:r>
@@ -2329,10 +2615,11 @@
       </w:pPr>
       <w:r>
         <w:rPr>
-          <w:rFonts w:ascii="Helvetica" w:hAnsi="Helvetica" w:cs="Helvetica"/>
-          <w:sz w:val="24"/>
-          <w:sz-cs w:val="24"/>
-          <w:spacing w:val="0"/>
+          <w:rFonts w:ascii="Helvetica Neue" w:hAnsi="Helvetica Neue" w:cs="Helvetica Neue"/>
+          <w:sz w:val="26"/>
+          <w:sz-cs w:val="26"/>
+          <w:spacing w:val="0"/>
+          <w:color w:val="171E2D"/>
         </w:rPr>
         <w:t xml:space="preserve">$+23.0\text{ dB}$</w:t>
       </w:r>
@@ -2343,10 +2630,11 @@
       </w:pPr>
       <w:r>
         <w:rPr>
-          <w:rFonts w:ascii="Helvetica" w:hAnsi="Helvetica" w:cs="Helvetica"/>
-          <w:sz w:val="24"/>
-          <w:sz-cs w:val="24"/>
-          <w:spacing w:val="0"/>
+          <w:rFonts w:ascii="Helvetica Neue" w:hAnsi="Helvetica Neue" w:cs="Helvetica Neue"/>
+          <w:sz w:val="26"/>
+          <w:sz-cs w:val="26"/>
+          <w:spacing w:val="0"/>
+          <w:color w:val="171E2D"/>
         </w:rPr>
         <w:t xml:space="preserve">Moderate</w:t>
       </w:r>
@@ -2357,32 +2645,35 @@
       </w:pPr>
       <w:r>
         <w:rPr>
-          <w:rFonts w:ascii="Helvetica" w:hAnsi="Helvetica" w:cs="Helvetica"/>
-          <w:sz w:val="24"/>
-          <w:sz-cs w:val="24"/>
-          <w:b/>
-          <w:spacing w:val="0"/>
+          <w:rFonts w:ascii="Helvetica Neue" w:hAnsi="Helvetica Neue" w:cs="Helvetica Neue"/>
+          <w:sz w:val="26"/>
+          <w:sz-cs w:val="26"/>
+          <w:b/>
+          <w:spacing w:val="0"/>
+          <w:color w:val="171E2D"/>
         </w:rPr>
         <w:t xml:space="preserve">S3</w:t>
       </w:r>
       <w:r>
         <w:rPr>
-          <w:rFonts w:ascii="Helvetica" w:hAnsi="Helvetica" w:cs="Helvetica"/>
-          <w:sz w:val="24"/>
-          <w:sz-cs w:val="24"/>
-          <w:spacing w:val="0"/>
-        </w:rPr>
-        <w:t xml:space="preserve"/>
-      </w:r>
-    </w:p>
-    <w:p>
-      <w:pPr/>
-      <w:r>
-        <w:rPr>
-          <w:rFonts w:ascii="Helvetica" w:hAnsi="Helvetica" w:cs="Helvetica"/>
-          <w:sz w:val="24"/>
-          <w:sz-cs w:val="24"/>
-          <w:spacing w:val="0"/>
+          <w:rFonts w:ascii="Helvetica Neue" w:hAnsi="Helvetica Neue" w:cs="Helvetica Neue"/>
+          <w:sz w:val="26"/>
+          <w:sz-cs w:val="26"/>
+          <w:spacing w:val="0"/>
+          <w:color w:val="171E2D"/>
+        </w:rPr>
+        <w:t xml:space="preserve"/>
+      </w:r>
+    </w:p>
+    <w:p>
+      <w:pPr/>
+      <w:r>
+        <w:rPr>
+          <w:rFonts w:ascii="Helvetica Neue" w:hAnsi="Helvetica Neue" w:cs="Helvetica Neue"/>
+          <w:sz w:val="26"/>
+          <w:sz-cs w:val="26"/>
+          <w:spacing w:val="0"/>
+          <w:color w:val="171E2D"/>
         </w:rPr>
         <w:t xml:space="preserve">Pashan Nature Reserve</w:t>
       </w:r>
@@ -2391,10 +2682,11 @@
       <w:pPr/>
       <w:r>
         <w:rPr>
-          <w:rFonts w:ascii="Helvetica" w:hAnsi="Helvetica" w:cs="Helvetica"/>
-          <w:sz w:val="24"/>
-          <w:sz-cs w:val="24"/>
-          <w:spacing w:val="0"/>
+          <w:rFonts w:ascii="Helvetica Neue" w:hAnsi="Helvetica Neue" w:cs="Helvetica Neue"/>
+          <w:sz w:val="26"/>
+          <w:sz-cs w:val="26"/>
+          <w:spacing w:val="0"/>
+          <w:color w:val="171E2D"/>
         </w:rPr>
         <w:t xml:space="preserve">Urban Green Buffer</w:t>
       </w:r>
@@ -2405,20 +2697,22 @@
       </w:pPr>
       <w:r>
         <w:rPr>
-          <w:rFonts w:ascii="Helvetica" w:hAnsi="Helvetica" w:cs="Helvetica"/>
-          <w:sz w:val="24"/>
-          <w:sz-cs w:val="24"/>
-          <w:b/>
-          <w:spacing w:val="0"/>
+          <w:rFonts w:ascii="Helvetica Neue" w:hAnsi="Helvetica Neue" w:cs="Helvetica Neue"/>
+          <w:sz w:val="26"/>
+          <w:sz-cs w:val="26"/>
+          <w:b/>
+          <w:spacing w:val="0"/>
+          <w:color w:val="171E2D"/>
         </w:rPr>
         <w:t xml:space="preserve">45.2 dB</w:t>
       </w:r>
       <w:r>
         <w:rPr>
-          <w:rFonts w:ascii="Helvetica" w:hAnsi="Helvetica" w:cs="Helvetica"/>
-          <w:sz w:val="24"/>
-          <w:sz-cs w:val="24"/>
-          <w:spacing w:val="0"/>
+          <w:rFonts w:ascii="Helvetica Neue" w:hAnsi="Helvetica Neue" w:cs="Helvetica Neue"/>
+          <w:sz w:val="26"/>
+          <w:sz-cs w:val="26"/>
+          <w:spacing w:val="0"/>
+          <w:color w:val="171E2D"/>
         </w:rPr>
         <w:t xml:space="preserve"/>
       </w:r>
@@ -2429,10 +2723,11 @@
       </w:pPr>
       <w:r>
         <w:rPr>
-          <w:rFonts w:ascii="Helvetica" w:hAnsi="Helvetica" w:cs="Helvetica"/>
-          <w:sz w:val="24"/>
-          <w:sz-cs w:val="24"/>
-          <w:spacing w:val="0"/>
+          <w:rFonts w:ascii="Helvetica Neue" w:hAnsi="Helvetica Neue" w:cs="Helvetica Neue"/>
+          <w:sz w:val="26"/>
+          <w:sz-cs w:val="26"/>
+          <w:spacing w:val="0"/>
+          <w:color w:val="171E2D"/>
         </w:rPr>
         <w:t xml:space="preserve">48</w:t>
       </w:r>
@@ -2443,10 +2738,11 @@
       </w:pPr>
       <w:r>
         <w:rPr>
-          <w:rFonts w:ascii="Helvetica" w:hAnsi="Helvetica" w:cs="Helvetica"/>
-          <w:sz w:val="24"/>
-          <w:sz-cs w:val="24"/>
-          <w:spacing w:val="0"/>
+          <w:rFonts w:ascii="Helvetica Neue" w:hAnsi="Helvetica Neue" w:cs="Helvetica Neue"/>
+          <w:sz w:val="26"/>
+          <w:sz-cs w:val="26"/>
+          <w:spacing w:val="0"/>
+          <w:color w:val="171E2D"/>
         </w:rPr>
         <w:t xml:space="preserve">$-9.8\text{ dB}$</w:t>
       </w:r>
@@ -2457,20 +2753,22 @@
       </w:pPr>
       <w:r>
         <w:rPr>
-          <w:rFonts w:ascii="Helvetica" w:hAnsi="Helvetica" w:cs="Helvetica"/>
-          <w:sz w:val="24"/>
-          <w:sz-cs w:val="24"/>
-          <w:b/>
-          <w:spacing w:val="0"/>
+          <w:rFonts w:ascii="Helvetica Neue" w:hAnsi="Helvetica Neue" w:cs="Helvetica Neue"/>
+          <w:sz w:val="26"/>
+          <w:sz-cs w:val="26"/>
+          <w:b/>
+          <w:spacing w:val="0"/>
+          <w:color w:val="171E2D"/>
         </w:rPr>
         <w:t xml:space="preserve">Good</w:t>
       </w:r>
       <w:r>
         <w:rPr>
-          <w:rFonts w:ascii="Helvetica" w:hAnsi="Helvetica" w:cs="Helvetica"/>
-          <w:sz w:val="24"/>
-          <w:sz-cs w:val="24"/>
-          <w:spacing w:val="0"/>
+          <w:rFonts w:ascii="Helvetica Neue" w:hAnsi="Helvetica Neue" w:cs="Helvetica Neue"/>
+          <w:sz w:val="26"/>
+          <w:sz-cs w:val="26"/>
+          <w:spacing w:val="0"/>
+          <w:color w:val="171E2D"/>
         </w:rPr>
         <w:t xml:space="preserve"/>
       </w:r>
@@ -2481,32 +2779,35 @@
       </w:pPr>
       <w:r>
         <w:rPr>
-          <w:rFonts w:ascii="Helvetica" w:hAnsi="Helvetica" w:cs="Helvetica"/>
-          <w:sz w:val="24"/>
-          <w:sz-cs w:val="24"/>
-          <w:b/>
-          <w:spacing w:val="0"/>
+          <w:rFonts w:ascii="Helvetica Neue" w:hAnsi="Helvetica Neue" w:cs="Helvetica Neue"/>
+          <w:sz w:val="26"/>
+          <w:sz-cs w:val="26"/>
+          <w:b/>
+          <w:spacing w:val="0"/>
+          <w:color w:val="171E2D"/>
         </w:rPr>
         <w:t xml:space="preserve">S4</w:t>
       </w:r>
       <w:r>
         <w:rPr>
-          <w:rFonts w:ascii="Helvetica" w:hAnsi="Helvetica" w:cs="Helvetica"/>
-          <w:sz w:val="24"/>
-          <w:sz-cs w:val="24"/>
-          <w:spacing w:val="0"/>
-        </w:rPr>
-        <w:t xml:space="preserve"/>
-      </w:r>
-    </w:p>
-    <w:p>
-      <w:pPr/>
-      <w:r>
-        <w:rPr>
-          <w:rFonts w:ascii="Helvetica" w:hAnsi="Helvetica" w:cs="Helvetica"/>
-          <w:sz w:val="24"/>
-          <w:sz-cs w:val="24"/>
-          <w:spacing w:val="0"/>
+          <w:rFonts w:ascii="Helvetica Neue" w:hAnsi="Helvetica Neue" w:cs="Helvetica Neue"/>
+          <w:sz w:val="26"/>
+          <w:sz-cs w:val="26"/>
+          <w:spacing w:val="0"/>
+          <w:color w:val="171E2D"/>
+        </w:rPr>
+        <w:t xml:space="preserve"/>
+      </w:r>
+    </w:p>
+    <w:p>
+      <w:pPr/>
+      <w:r>
+        <w:rPr>
+          <w:rFonts w:ascii="Helvetica Neue" w:hAnsi="Helvetica Neue" w:cs="Helvetica Neue"/>
+          <w:sz w:val="26"/>
+          <w:sz-cs w:val="26"/>
+          <w:spacing w:val="0"/>
+          <w:color w:val="171E2D"/>
         </w:rPr>
         <w:t xml:space="preserve">Katraj Colony</w:t>
       </w:r>
@@ -2515,10 +2816,11 @@
       <w:pPr/>
       <w:r>
         <w:rPr>
-          <w:rFonts w:ascii="Helvetica" w:hAnsi="Helvetica" w:cs="Helvetica"/>
-          <w:sz w:val="24"/>
-          <w:sz-cs w:val="24"/>
-          <w:spacing w:val="0"/>
+          <w:rFonts w:ascii="Helvetica Neue" w:hAnsi="Helvetica Neue" w:cs="Helvetica Neue"/>
+          <w:sz w:val="26"/>
+          <w:sz-cs w:val="26"/>
+          <w:spacing w:val="0"/>
+          <w:color w:val="171E2D"/>
         </w:rPr>
         <w:t xml:space="preserve">Residential Suburb</w:t>
       </w:r>
@@ -2529,20 +2831,22 @@
       </w:pPr>
       <w:r>
         <w:rPr>
-          <w:rFonts w:ascii="Helvetica" w:hAnsi="Helvetica" w:cs="Helvetica"/>
-          <w:sz w:val="24"/>
-          <w:sz-cs w:val="24"/>
-          <w:b/>
-          <w:spacing w:val="0"/>
+          <w:rFonts w:ascii="Helvetica Neue" w:hAnsi="Helvetica Neue" w:cs="Helvetica Neue"/>
+          <w:sz w:val="26"/>
+          <w:sz-cs w:val="26"/>
+          <w:b/>
+          <w:spacing w:val="0"/>
+          <w:color w:val="171E2D"/>
         </w:rPr>
         <w:t xml:space="preserve">49.5 dB</w:t>
       </w:r>
       <w:r>
         <w:rPr>
-          <w:rFonts w:ascii="Helvetica" w:hAnsi="Helvetica" w:cs="Helvetica"/>
-          <w:sz w:val="24"/>
-          <w:sz-cs w:val="24"/>
-          <w:spacing w:val="0"/>
+          <w:rFonts w:ascii="Helvetica Neue" w:hAnsi="Helvetica Neue" w:cs="Helvetica Neue"/>
+          <w:sz w:val="26"/>
+          <w:sz-cs w:val="26"/>
+          <w:spacing w:val="0"/>
+          <w:color w:val="171E2D"/>
         </w:rPr>
         <w:t xml:space="preserve"/>
       </w:r>
@@ -2553,10 +2857,11 @@
       </w:pPr>
       <w:r>
         <w:rPr>
-          <w:rFonts w:ascii="Helvetica" w:hAnsi="Helvetica" w:cs="Helvetica"/>
-          <w:sz w:val="24"/>
-          <w:sz-cs w:val="24"/>
-          <w:spacing w:val="0"/>
+          <w:rFonts w:ascii="Helvetica Neue" w:hAnsi="Helvetica Neue" w:cs="Helvetica Neue"/>
+          <w:sz w:val="26"/>
+          <w:sz-cs w:val="26"/>
+          <w:spacing w:val="0"/>
+          <w:color w:val="171E2D"/>
         </w:rPr>
         <w:t xml:space="preserve">58</w:t>
       </w:r>
@@ -2567,10 +2872,11 @@
       </w:pPr>
       <w:r>
         <w:rPr>
-          <w:rFonts w:ascii="Helvetica" w:hAnsi="Helvetica" w:cs="Helvetica"/>
-          <w:sz w:val="24"/>
-          <w:sz-cs w:val="24"/>
-          <w:spacing w:val="0"/>
+          <w:rFonts w:ascii="Helvetica Neue" w:hAnsi="Helvetica Neue" w:cs="Helvetica Neue"/>
+          <w:sz w:val="26"/>
+          <w:sz-cs w:val="26"/>
+          <w:spacing w:val="0"/>
+          <w:color w:val="171E2D"/>
         </w:rPr>
         <w:t xml:space="preserve">$-5.5\text{ dB}$</w:t>
       </w:r>
@@ -2581,10 +2887,11 @@
       </w:pPr>
       <w:r>
         <w:rPr>
-          <w:rFonts w:ascii="Helvetica" w:hAnsi="Helvetica" w:cs="Helvetica"/>
-          <w:sz w:val="24"/>
-          <w:sz-cs w:val="24"/>
-          <w:spacing w:val="0"/>
+          <w:rFonts w:ascii="Helvetica Neue" w:hAnsi="Helvetica Neue" w:cs="Helvetica Neue"/>
+          <w:sz w:val="26"/>
+          <w:sz-cs w:val="26"/>
+          <w:spacing w:val="0"/>
+          <w:color w:val="171E2D"/>
         </w:rPr>
         <w:t xml:space="preserve">Moderate</w:t>
       </w:r>
@@ -2595,32 +2902,35 @@
       </w:pPr>
       <w:r>
         <w:rPr>
-          <w:rFonts w:ascii="Helvetica" w:hAnsi="Helvetica" w:cs="Helvetica"/>
-          <w:sz w:val="24"/>
-          <w:sz-cs w:val="24"/>
-          <w:b/>
-          <w:spacing w:val="0"/>
+          <w:rFonts w:ascii="Helvetica Neue" w:hAnsi="Helvetica Neue" w:cs="Helvetica Neue"/>
+          <w:sz w:val="26"/>
+          <w:sz-cs w:val="26"/>
+          <w:b/>
+          <w:spacing w:val="0"/>
+          <w:color w:val="171E2D"/>
         </w:rPr>
         <w:t xml:space="preserve">S5</w:t>
       </w:r>
       <w:r>
         <w:rPr>
-          <w:rFonts w:ascii="Helvetica" w:hAnsi="Helvetica" w:cs="Helvetica"/>
-          <w:sz w:val="24"/>
-          <w:sz-cs w:val="24"/>
-          <w:spacing w:val="0"/>
-        </w:rPr>
-        <w:t xml:space="preserve"/>
-      </w:r>
-    </w:p>
-    <w:p>
-      <w:pPr/>
-      <w:r>
-        <w:rPr>
-          <w:rFonts w:ascii="Helvetica" w:hAnsi="Helvetica" w:cs="Helvetica"/>
-          <w:sz w:val="24"/>
-          <w:sz-cs w:val="24"/>
-          <w:spacing w:val="0"/>
+          <w:rFonts w:ascii="Helvetica Neue" w:hAnsi="Helvetica Neue" w:cs="Helvetica Neue"/>
+          <w:sz w:val="26"/>
+          <w:sz-cs w:val="26"/>
+          <w:spacing w:val="0"/>
+          <w:color w:val="171E2D"/>
+        </w:rPr>
+        <w:t xml:space="preserve"/>
+      </w:r>
+    </w:p>
+    <w:p>
+      <w:pPr/>
+      <w:r>
+        <w:rPr>
+          <w:rFonts w:ascii="Helvetica Neue" w:hAnsi="Helvetica Neue" w:cs="Helvetica Neue"/>
+          <w:sz w:val="26"/>
+          <w:sz-cs w:val="26"/>
+          <w:spacing w:val="0"/>
+          <w:color w:val="171E2D"/>
         </w:rPr>
         <w:t xml:space="preserve">Hadapsar Bypass</w:t>
       </w:r>
@@ -2629,10 +2939,11 @@
       <w:pPr/>
       <w:r>
         <w:rPr>
-          <w:rFonts w:ascii="Helvetica" w:hAnsi="Helvetica" w:cs="Helvetica"/>
-          <w:sz w:val="24"/>
-          <w:sz-cs w:val="24"/>
-          <w:spacing w:val="0"/>
+          <w:rFonts w:ascii="Helvetica Neue" w:hAnsi="Helvetica Neue" w:cs="Helvetica Neue"/>
+          <w:sz w:val="26"/>
+          <w:sz-cs w:val="26"/>
+          <w:spacing w:val="0"/>
+          <w:color w:val="171E2D"/>
         </w:rPr>
         <w:t xml:space="preserve">Freight Highway Corridor</w:t>
       </w:r>
@@ -2643,20 +2954,22 @@
       </w:pPr>
       <w:r>
         <w:rPr>
-          <w:rFonts w:ascii="Helvetica" w:hAnsi="Helvetica" w:cs="Helvetica"/>
-          <w:sz w:val="24"/>
-          <w:sz-cs w:val="24"/>
-          <w:b/>
-          <w:spacing w:val="0"/>
+          <w:rFonts w:ascii="Helvetica Neue" w:hAnsi="Helvetica Neue" w:cs="Helvetica Neue"/>
+          <w:sz w:val="26"/>
+          <w:sz-cs w:val="26"/>
+          <w:b/>
+          <w:spacing w:val="0"/>
+          <w:color w:val="171E2D"/>
         </w:rPr>
         <w:t xml:space="preserve">85.1 dB</w:t>
       </w:r>
       <w:r>
         <w:rPr>
-          <w:rFonts w:ascii="Helvetica" w:hAnsi="Helvetica" w:cs="Helvetica"/>
-          <w:sz w:val="24"/>
-          <w:sz-cs w:val="24"/>
-          <w:spacing w:val="0"/>
+          <w:rFonts w:ascii="Helvetica Neue" w:hAnsi="Helvetica Neue" w:cs="Helvetica Neue"/>
+          <w:sz w:val="26"/>
+          <w:sz-cs w:val="26"/>
+          <w:spacing w:val="0"/>
+          <w:color w:val="171E2D"/>
         </w:rPr>
         <w:t xml:space="preserve"/>
       </w:r>
@@ -2667,10 +2980,11 @@
       </w:pPr>
       <w:r>
         <w:rPr>
-          <w:rFonts w:ascii="Helvetica" w:hAnsi="Helvetica" w:cs="Helvetica"/>
-          <w:sz w:val="24"/>
-          <w:sz-cs w:val="24"/>
-          <w:spacing w:val="0"/>
+          <w:rFonts w:ascii="Helvetica Neue" w:hAnsi="Helvetica Neue" w:cs="Helvetica Neue"/>
+          <w:sz w:val="26"/>
+          <w:sz-cs w:val="26"/>
+          <w:spacing w:val="0"/>
+          <w:color w:val="171E2D"/>
         </w:rPr>
         <w:t xml:space="preserve">124</w:t>
       </w:r>
@@ -2681,10 +2995,11 @@
       </w:pPr>
       <w:r>
         <w:rPr>
-          <w:rFonts w:ascii="Helvetica" w:hAnsi="Helvetica" w:cs="Helvetica"/>
-          <w:sz w:val="24"/>
-          <w:sz-cs w:val="24"/>
-          <w:spacing w:val="0"/>
+          <w:rFonts w:ascii="Helvetica Neue" w:hAnsi="Helvetica Neue" w:cs="Helvetica Neue"/>
+          <w:sz w:val="26"/>
+          <w:sz-cs w:val="26"/>
+          <w:spacing w:val="0"/>
+          <w:color w:val="171E2D"/>
         </w:rPr>
         <w:t xml:space="preserve">$+30.1\text{ dB}$</w:t>
       </w:r>
@@ -2695,20 +3010,22 @@
       </w:pPr>
       <w:r>
         <w:rPr>
-          <w:rFonts w:ascii="Helvetica" w:hAnsi="Helvetica" w:cs="Helvetica"/>
-          <w:sz w:val="24"/>
-          <w:sz-cs w:val="24"/>
-          <w:b/>
-          <w:spacing w:val="0"/>
+          <w:rFonts w:ascii="Helvetica Neue" w:hAnsi="Helvetica Neue" w:cs="Helvetica Neue"/>
+          <w:sz w:val="26"/>
+          <w:sz-cs w:val="26"/>
+          <w:b/>
+          <w:spacing w:val="0"/>
+          <w:color w:val="171E2D"/>
         </w:rPr>
         <w:t xml:space="preserve">Unhealthy (Sensitive)</w:t>
       </w:r>
       <w:r>
         <w:rPr>
-          <w:rFonts w:ascii="Helvetica" w:hAnsi="Helvetica" w:cs="Helvetica"/>
-          <w:sz w:val="24"/>
-          <w:sz-cs w:val="24"/>
-          <w:spacing w:val="0"/>
+          <w:rFonts w:ascii="Helvetica Neue" w:hAnsi="Helvetica Neue" w:cs="Helvetica Neue"/>
+          <w:sz w:val="26"/>
+          <w:sz-cs w:val="26"/>
+          <w:spacing w:val="0"/>
+          <w:color w:val="171E2D"/>
         </w:rPr>
         <w:t xml:space="preserve"/>
       </w:r>
@@ -2719,32 +3036,35 @@
       </w:pPr>
       <w:r>
         <w:rPr>
-          <w:rFonts w:ascii="Helvetica" w:hAnsi="Helvetica" w:cs="Helvetica"/>
-          <w:sz w:val="24"/>
-          <w:sz-cs w:val="24"/>
-          <w:b/>
-          <w:spacing w:val="0"/>
+          <w:rFonts w:ascii="Helvetica Neue" w:hAnsi="Helvetica Neue" w:cs="Helvetica Neue"/>
+          <w:sz w:val="26"/>
+          <w:sz-cs w:val="26"/>
+          <w:b/>
+          <w:spacing w:val="0"/>
+          <w:color w:val="171E2D"/>
         </w:rPr>
         <w:t xml:space="preserve">S6</w:t>
       </w:r>
       <w:r>
         <w:rPr>
-          <w:rFonts w:ascii="Helvetica" w:hAnsi="Helvetica" w:cs="Helvetica"/>
-          <w:sz w:val="24"/>
-          <w:sz-cs w:val="24"/>
-          <w:spacing w:val="0"/>
-        </w:rPr>
-        <w:t xml:space="preserve"/>
-      </w:r>
-    </w:p>
-    <w:p>
-      <w:pPr/>
-      <w:r>
-        <w:rPr>
-          <w:rFonts w:ascii="Helvetica" w:hAnsi="Helvetica" w:cs="Helvetica"/>
-          <w:sz w:val="24"/>
-          <w:sz-cs w:val="24"/>
-          <w:spacing w:val="0"/>
+          <w:rFonts w:ascii="Helvetica Neue" w:hAnsi="Helvetica Neue" w:cs="Helvetica Neue"/>
+          <w:sz w:val="26"/>
+          <w:sz-cs w:val="26"/>
+          <w:spacing w:val="0"/>
+          <w:color w:val="171E2D"/>
+        </w:rPr>
+        <w:t xml:space="preserve"/>
+      </w:r>
+    </w:p>
+    <w:p>
+      <w:pPr/>
+      <w:r>
+        <w:rPr>
+          <w:rFonts w:ascii="Helvetica Neue" w:hAnsi="Helvetica Neue" w:cs="Helvetica Neue"/>
+          <w:sz w:val="26"/>
+          <w:sz-cs w:val="26"/>
+          <w:spacing w:val="0"/>
+          <w:color w:val="171E2D"/>
         </w:rPr>
         <w:t xml:space="preserve">Bhosari Cluster</w:t>
       </w:r>
@@ -2753,10 +3073,11 @@
       <w:pPr/>
       <w:r>
         <w:rPr>
-          <w:rFonts w:ascii="Helvetica" w:hAnsi="Helvetica" w:cs="Helvetica"/>
-          <w:sz w:val="24"/>
-          <w:sz-cs w:val="24"/>
-          <w:spacing w:val="0"/>
+          <w:rFonts w:ascii="Helvetica Neue" w:hAnsi="Helvetica Neue" w:cs="Helvetica Neue"/>
+          <w:sz w:val="26"/>
+          <w:sz-cs w:val="26"/>
+          <w:spacing w:val="0"/>
+          <w:color w:val="171E2D"/>
         </w:rPr>
         <w:t xml:space="preserve">Industrial Manufacturing</w:t>
       </w:r>
@@ -2767,20 +3088,22 @@
       </w:pPr>
       <w:r>
         <w:rPr>
-          <w:rFonts w:ascii="Helvetica" w:hAnsi="Helvetica" w:cs="Helvetica"/>
-          <w:sz w:val="24"/>
-          <w:sz-cs w:val="24"/>
-          <w:b/>
-          <w:spacing w:val="0"/>
+          <w:rFonts w:ascii="Helvetica Neue" w:hAnsi="Helvetica Neue" w:cs="Helvetica Neue"/>
+          <w:sz w:val="26"/>
+          <w:sz-cs w:val="26"/>
+          <w:b/>
+          <w:spacing w:val="0"/>
+          <w:color w:val="171E2D"/>
         </w:rPr>
         <w:t xml:space="preserve">88.0 dB</w:t>
       </w:r>
       <w:r>
         <w:rPr>
-          <w:rFonts w:ascii="Helvetica" w:hAnsi="Helvetica" w:cs="Helvetica"/>
-          <w:sz w:val="24"/>
-          <w:sz-cs w:val="24"/>
-          <w:spacing w:val="0"/>
+          <w:rFonts w:ascii="Helvetica Neue" w:hAnsi="Helvetica Neue" w:cs="Helvetica Neue"/>
+          <w:sz w:val="26"/>
+          <w:sz-cs w:val="26"/>
+          <w:spacing w:val="0"/>
+          <w:color w:val="171E2D"/>
         </w:rPr>
         <w:t xml:space="preserve"/>
       </w:r>
@@ -2791,10 +3114,11 @@
       </w:pPr>
       <w:r>
         <w:rPr>
-          <w:rFonts w:ascii="Helvetica" w:hAnsi="Helvetica" w:cs="Helvetica"/>
-          <w:sz w:val="24"/>
-          <w:sz-cs w:val="24"/>
-          <w:spacing w:val="0"/>
+          <w:rFonts w:ascii="Helvetica Neue" w:hAnsi="Helvetica Neue" w:cs="Helvetica Neue"/>
+          <w:sz w:val="26"/>
+          <w:sz-cs w:val="26"/>
+          <w:spacing w:val="0"/>
+          <w:color w:val="171E2D"/>
         </w:rPr>
         <w:t xml:space="preserve">155</w:t>
       </w:r>
@@ -2805,10 +3129,11 @@
       </w:pPr>
       <w:r>
         <w:rPr>
-          <w:rFonts w:ascii="Helvetica" w:hAnsi="Helvetica" w:cs="Helvetica"/>
-          <w:sz w:val="24"/>
-          <w:sz-cs w:val="24"/>
-          <w:spacing w:val="0"/>
+          <w:rFonts w:ascii="Helvetica Neue" w:hAnsi="Helvetica Neue" w:cs="Helvetica Neue"/>
+          <w:sz w:val="26"/>
+          <w:sz-cs w:val="26"/>
+          <w:spacing w:val="0"/>
+          <w:color w:val="171E2D"/>
         </w:rPr>
         <w:t xml:space="preserve">$+33.0\text{ dB}$</w:t>
       </w:r>
@@ -2819,20 +3144,22 @@
       </w:pPr>
       <w:r>
         <w:rPr>
-          <w:rFonts w:ascii="Helvetica" w:hAnsi="Helvetica" w:cs="Helvetica"/>
-          <w:sz w:val="24"/>
-          <w:sz-cs w:val="24"/>
-          <w:b/>
-          <w:spacing w:val="0"/>
+          <w:rFonts w:ascii="Helvetica Neue" w:hAnsi="Helvetica Neue" w:cs="Helvetica Neue"/>
+          <w:sz w:val="26"/>
+          <w:sz-cs w:val="26"/>
+          <w:b/>
+          <w:spacing w:val="0"/>
+          <w:color w:val="171E2D"/>
         </w:rPr>
         <w:t xml:space="preserve">Unhealthy</w:t>
       </w:r>
       <w:r>
         <w:rPr>
-          <w:rFonts w:ascii="Helvetica" w:hAnsi="Helvetica" w:cs="Helvetica"/>
-          <w:sz w:val="24"/>
-          <w:sz-cs w:val="24"/>
-          <w:spacing w:val="0"/>
+          <w:rFonts w:ascii="Helvetica Neue" w:hAnsi="Helvetica Neue" w:cs="Helvetica Neue"/>
+          <w:sz w:val="26"/>
+          <w:sz-cs w:val="26"/>
+          <w:spacing w:val="0"/>
+          <w:color w:val="171E2D"/>
         </w:rPr>
         <w:t xml:space="preserve"/>
       </w:r>
@@ -2843,11 +3170,12 @@
       </w:pPr>
       <w:r>
         <w:rPr>
-          <w:rFonts w:ascii="Helvetica" w:hAnsi="Helvetica" w:cs="Helvetica"/>
+          <w:rFonts w:ascii="Helvetica Neue" w:hAnsi="Helvetica Neue" w:cs="Helvetica Neue"/>
           <w:sz w:val="28"/>
           <w:sz-cs w:val="28"/>
           <w:b/>
           <w:spacing w:val="0"/>
+          <w:color w:val="171E2D"/>
         </w:rPr>
         <w:t xml:space="preserve">4.2 Statistical Correlation Analysis</w:t>
       </w:r>
@@ -2858,29 +3186,32 @@
       </w:pPr>
       <w:r>
         <w:rPr>
-          <w:rFonts w:ascii="Helvetica" w:hAnsi="Helvetica" w:cs="Helvetica"/>
-          <w:sz w:val="24"/>
-          <w:sz-cs w:val="24"/>
-          <w:spacing w:val="0"/>
+          <w:rFonts w:ascii="Helvetica Neue" w:hAnsi="Helvetica Neue" w:cs="Helvetica Neue"/>
+          <w:sz w:val="24"/>
+          <w:sz-cs w:val="24"/>
+          <w:spacing w:val="0"/>
+          <w:color w:val="171E2D"/>
         </w:rPr>
         <w:t xml:space="preserve">Merging co-located atmospheric and acoustic observations reveals a strong positive </w:t>
       </w:r>
       <w:r>
         <w:rPr>
-          <w:rFonts w:ascii="Helvetica" w:hAnsi="Helvetica" w:cs="Helvetica"/>
-          <w:sz w:val="24"/>
-          <w:sz-cs w:val="24"/>
-          <w:b/>
-          <w:spacing w:val="0"/>
+          <w:rFonts w:ascii="Helvetica Neue" w:hAnsi="Helvetica Neue" w:cs="Helvetica Neue"/>
+          <w:sz w:val="24"/>
+          <w:sz-cs w:val="24"/>
+          <w:b/>
+          <w:spacing w:val="0"/>
+          <w:color w:val="171E2D"/>
         </w:rPr>
         <w:t xml:space="preserve">Pearson Correlation Coefficient ($r = +0.68$)</w:t>
       </w:r>
       <w:r>
         <w:rPr>
-          <w:rFonts w:ascii="Helvetica" w:hAnsi="Helvetica" w:cs="Helvetica"/>
-          <w:sz w:val="24"/>
-          <w:sz-cs w:val="24"/>
-          <w:spacing w:val="0"/>
+          <w:rFonts w:ascii="Helvetica Neue" w:hAnsi="Helvetica Neue" w:cs="Helvetica Neue"/>
+          <w:sz w:val="24"/>
+          <w:sz-cs w:val="24"/>
+          <w:spacing w:val="0"/>
+          <w:color w:val="171E2D"/>
         </w:rPr>
         <w:t xml:space="preserve">: $$r = \frac{\sum (x_i - \bar{x})(y_i - \bar{y})}{\sqrt{\sum (x_i - \bar{x})^2 \sum (y_i - \bar{y})^2}}$$</w:t>
       </w:r>
@@ -2891,20 +3222,22 @@
       </w:pPr>
       <w:r>
         <w:rPr>
-          <w:rFonts w:ascii="Helvetica" w:hAnsi="Helvetica" w:cs="Helvetica"/>
-          <w:sz w:val="24"/>
-          <w:sz-cs w:val="24"/>
-          <w:b/>
-          <w:spacing w:val="0"/>
+          <w:rFonts w:ascii="Helvetica Neue" w:hAnsi="Helvetica Neue" w:cs="Helvetica Neue"/>
+          <w:sz w:val="24"/>
+          <w:sz-cs w:val="24"/>
+          <w:b/>
+          <w:spacing w:val="0"/>
+          <w:color w:val="171E2D"/>
         </w:rPr>
         <w:t xml:space="preserve">Interpretation</w:t>
       </w:r>
       <w:r>
         <w:rPr>
-          <w:rFonts w:ascii="Helvetica" w:hAnsi="Helvetica" w:cs="Helvetica"/>
-          <w:sz w:val="24"/>
-          <w:sz-cs w:val="24"/>
-          <w:spacing w:val="0"/>
+          <w:rFonts w:ascii="Helvetica Neue" w:hAnsi="Helvetica Neue" w:cs="Helvetica Neue"/>
+          <w:sz w:val="24"/>
+          <w:sz-cs w:val="24"/>
+          <w:spacing w:val="0"/>
+          <w:color w:val="171E2D"/>
         </w:rPr>
         <w:t xml:space="preserve">: Arterial vehicular traffic acts as a common driving variable: heavy diesel vehicle acceleration and continuous horn honking simultaneously drive acoustic noise above $80\text{ dB}$ and elevate particulate matter concentrations above $40\ \mu\text{g/m}^3$.</w:t>
       </w:r>
@@ -2915,11 +3248,12 @@
       </w:pPr>
       <w:r>
         <w:rPr>
-          <w:rFonts w:ascii="Helvetica" w:hAnsi="Helvetica" w:cs="Helvetica"/>
+          <w:rFonts w:ascii="Helvetica Neue" w:hAnsi="Helvetica Neue" w:cs="Helvetica Neue"/>
           <w:sz w:val="28"/>
           <w:sz-cs w:val="28"/>
           <w:b/>
           <w:spacing w:val="0"/>
+          <w:color w:val="171E2D"/>
         </w:rPr>
         <w:t xml:space="preserve">4.3 Qualitative Stakeholder Feedback</w:t>
       </w:r>
@@ -2930,10 +3264,11 @@
       </w:pPr>
       <w:r>
         <w:rPr>
-          <w:rFonts w:ascii="Helvetica" w:hAnsi="Helvetica" w:cs="Helvetica"/>
-          <w:sz w:val="24"/>
-          <w:sz-cs w:val="24"/>
-          <w:spacing w:val="0"/>
+          <w:rFonts w:ascii="Helvetica Neue" w:hAnsi="Helvetica Neue" w:cs="Helvetica Neue"/>
+          <w:sz w:val="24"/>
+          <w:sz-cs w:val="24"/>
+          <w:spacing w:val="0"/>
+          <w:color w:val="171E2D"/>
         </w:rPr>
         <w:t xml:space="preserve">Interviews with 15 on-site stakeholders (traffic police constables, commercial vendors, pedestrians) revealed: * $100\%$ of surveyed traffic personnel reported chronic auditory fatigue and headaches. * Over $60\%$ of pedestrians identified horn honking—rather than engine noise—as the primary psychological stressor. * Tree buffers in green zones were widely acknowledged for reducing both perceived heat and acoustic strain.</w:t>
       </w:r>
@@ -2942,7 +3277,7 @@
       <w:pPr/>
       <w:r>
         <w:rPr>
-          <w:rFonts w:ascii="Helvetica" w:hAnsi="Helvetica" w:cs="Helvetica"/>
+          <w:rFonts w:ascii="Helvetica Neue" w:hAnsi="Helvetica Neue" w:cs="Helvetica Neue"/>
           <w:sz w:val="24"/>
           <w:sz-cs w:val="24"/>
           <w:spacing w:val="0"/>
@@ -2957,11 +3292,12 @@
       </w:pPr>
       <w:r>
         <w:rPr>
-          <w:rFonts w:ascii="Helvetica" w:hAnsi="Helvetica" w:cs="Helvetica"/>
+          <w:rFonts w:ascii="Helvetica Neue" w:hAnsi="Helvetica Neue" w:cs="Helvetica Neue"/>
           <w:sz w:val="36"/>
           <w:sz-cs w:val="36"/>
           <w:b/>
           <w:spacing w:val="0"/>
+          <w:color w:val="172A9F"/>
         </w:rPr>
         <w:t xml:space="preserve">CHAPTER 5: CONCLUSIONS</w:t>
       </w:r>
@@ -2972,10 +3308,11 @@
       </w:pPr>
       <w:r>
         <w:rPr>
-          <w:rFonts w:ascii="Helvetica" w:hAnsi="Helvetica" w:cs="Helvetica"/>
-          <w:sz w:val="24"/>
-          <w:sz-cs w:val="24"/>
-          <w:b/>
+          <w:rFonts w:ascii="Helvetica Neue" w:hAnsi="Helvetica Neue" w:cs="Helvetica Neue"/>
+          <w:sz w:val="24"/>
+          <w:sz-cs w:val="24"/>
+          <w:b/>
+          <w:color w:val="171E2D"/>
         </w:rPr>
         <w:t xml:space="preserve"/>
         <w:tab/>
@@ -2985,20 +3322,22 @@
       </w:r>
       <w:r>
         <w:rPr>
-          <w:rFonts w:ascii="Helvetica" w:hAnsi="Helvetica" w:cs="Helvetica"/>
-          <w:sz w:val="24"/>
-          <w:sz-cs w:val="24"/>
-          <w:b/>
-          <w:spacing w:val="0"/>
+          <w:rFonts w:ascii="Helvetica Neue" w:hAnsi="Helvetica Neue" w:cs="Helvetica Neue"/>
+          <w:sz w:val="24"/>
+          <w:sz-cs w:val="24"/>
+          <w:b/>
+          <w:spacing w:val="0"/>
+          <w:color w:val="171E2D"/>
         </w:rPr>
         <w:t xml:space="preserve">Severe Urban Non-Compliance</w:t>
       </w:r>
       <w:r>
         <w:rPr>
-          <w:rFonts w:ascii="Helvetica" w:hAnsi="Helvetica" w:cs="Helvetica"/>
-          <w:sz w:val="24"/>
-          <w:sz-cs w:val="24"/>
-          <w:spacing w:val="0"/>
+          <w:rFonts w:ascii="Helvetica Neue" w:hAnsi="Helvetica Neue" w:cs="Helvetica Neue"/>
+          <w:sz w:val="24"/>
+          <w:sz-cs w:val="24"/>
+          <w:spacing w:val="0"/>
+          <w:color w:val="171E2D"/>
         </w:rPr>
         <w:t xml:space="preserve">: Four out of the six surveyed urban zones exceeded the WHO outdoor daytime noise limit of $55\text{ dB}$, with commercial and freight corridors exceeding safe baselines by over $25\text{ dB}$.</w:t>
       </w:r>
@@ -3009,10 +3348,11 @@
       </w:pPr>
       <w:r>
         <w:rPr>
-          <w:rFonts w:ascii="Helvetica" w:hAnsi="Helvetica" w:cs="Helvetica"/>
-          <w:sz w:val="24"/>
-          <w:sz-cs w:val="24"/>
-          <w:b/>
+          <w:rFonts w:ascii="Helvetica Neue" w:hAnsi="Helvetica Neue" w:cs="Helvetica Neue"/>
+          <w:sz w:val="24"/>
+          <w:sz-cs w:val="24"/>
+          <w:b/>
+          <w:color w:val="171E2D"/>
         </w:rPr>
         <w:t xml:space="preserve"/>
         <w:tab/>
@@ -3022,20 +3362,22 @@
       </w:r>
       <w:r>
         <w:rPr>
-          <w:rFonts w:ascii="Helvetica" w:hAnsi="Helvetica" w:cs="Helvetica"/>
-          <w:sz w:val="24"/>
-          <w:sz-cs w:val="24"/>
-          <w:b/>
-          <w:spacing w:val="0"/>
+          <w:rFonts w:ascii="Helvetica Neue" w:hAnsi="Helvetica Neue" w:cs="Helvetica Neue"/>
+          <w:sz w:val="24"/>
+          <w:sz-cs w:val="24"/>
+          <w:b/>
+          <w:spacing w:val="0"/>
+          <w:color w:val="171E2D"/>
         </w:rPr>
         <w:t xml:space="preserve">Coupled Environmental Penalty</w:t>
       </w:r>
       <w:r>
         <w:rPr>
-          <w:rFonts w:ascii="Helvetica" w:hAnsi="Helvetica" w:cs="Helvetica"/>
-          <w:sz w:val="24"/>
-          <w:sz-cs w:val="24"/>
-          <w:spacing w:val="0"/>
+          <w:rFonts w:ascii="Helvetica Neue" w:hAnsi="Helvetica Neue" w:cs="Helvetica Neue"/>
+          <w:sz w:val="24"/>
+          <w:sz-cs w:val="24"/>
+          <w:spacing w:val="0"/>
+          <w:color w:val="171E2D"/>
         </w:rPr>
         <w:t xml:space="preserve">: The positive correlation ($r = +0.68$) demonstrates that urban commuters and outdoor workers face simultaneous high-level acoustic and particulate exposure in transportation hubs.</w:t>
       </w:r>
@@ -3046,10 +3388,11 @@
       </w:pPr>
       <w:r>
         <w:rPr>
-          <w:rFonts w:ascii="Helvetica" w:hAnsi="Helvetica" w:cs="Helvetica"/>
-          <w:sz w:val="24"/>
-          <w:sz-cs w:val="24"/>
-          <w:b/>
+          <w:rFonts w:ascii="Helvetica Neue" w:hAnsi="Helvetica Neue" w:cs="Helvetica Neue"/>
+          <w:sz w:val="24"/>
+          <w:sz-cs w:val="24"/>
+          <w:b/>
+          <w:color w:val="171E2D"/>
         </w:rPr>
         <w:t xml:space="preserve"/>
         <w:tab/>
@@ -3059,20 +3402,22 @@
       </w:r>
       <w:r>
         <w:rPr>
-          <w:rFonts w:ascii="Helvetica" w:hAnsi="Helvetica" w:cs="Helvetica"/>
-          <w:sz w:val="24"/>
-          <w:sz-cs w:val="24"/>
-          <w:b/>
-          <w:spacing w:val="0"/>
+          <w:rFonts w:ascii="Helvetica Neue" w:hAnsi="Helvetica Neue" w:cs="Helvetica Neue"/>
+          <w:sz w:val="24"/>
+          <w:sz-cs w:val="24"/>
+          <w:b/>
+          <w:spacing w:val="0"/>
+          <w:color w:val="171E2D"/>
         </w:rPr>
         <w:t xml:space="preserve">Attenuation by Natural Infrastructure</w:t>
       </w:r>
       <w:r>
         <w:rPr>
-          <w:rFonts w:ascii="Helvetica" w:hAnsi="Helvetica" w:cs="Helvetica"/>
-          <w:sz w:val="24"/>
-          <w:sz-cs w:val="24"/>
-          <w:spacing w:val="0"/>
+          <w:rFonts w:ascii="Helvetica Neue" w:hAnsi="Helvetica Neue" w:cs="Helvetica Neue"/>
+          <w:sz w:val="24"/>
+          <w:sz-cs w:val="24"/>
+          <w:spacing w:val="0"/>
+          <w:color w:val="171E2D"/>
         </w:rPr>
         <w:t xml:space="preserve">: Natural green buffers (e.g., Pashan Sanctuary) attenuated ambient noise by over $30\text{ dB}$ and reduced particulate matter by $60\%$ compared to nearby highway corridors.</w:t>
       </w:r>
@@ -3083,10 +3428,11 @@
       </w:pPr>
       <w:r>
         <w:rPr>
-          <w:rFonts w:ascii="Helvetica" w:hAnsi="Helvetica" w:cs="Helvetica"/>
-          <w:sz w:val="24"/>
-          <w:sz-cs w:val="24"/>
-          <w:b/>
+          <w:rFonts w:ascii="Helvetica Neue" w:hAnsi="Helvetica Neue" w:cs="Helvetica Neue"/>
+          <w:sz w:val="24"/>
+          <w:sz-cs w:val="24"/>
+          <w:b/>
+          <w:color w:val="171E2D"/>
         </w:rPr>
         <w:t xml:space="preserve"/>
         <w:tab/>
@@ -3096,20 +3442,22 @@
       </w:r>
       <w:r>
         <w:rPr>
-          <w:rFonts w:ascii="Helvetica" w:hAnsi="Helvetica" w:cs="Helvetica"/>
-          <w:sz w:val="24"/>
-          <w:sz-cs w:val="24"/>
-          <w:b/>
-          <w:spacing w:val="0"/>
+          <w:rFonts w:ascii="Helvetica Neue" w:hAnsi="Helvetica Neue" w:cs="Helvetica Neue"/>
+          <w:sz w:val="24"/>
+          <w:sz-cs w:val="24"/>
+          <w:b/>
+          <w:spacing w:val="0"/>
+          <w:color w:val="171E2D"/>
         </w:rPr>
         <w:t xml:space="preserve">Feasibility of Serverless Surveillance</w:t>
       </w:r>
       <w:r>
         <w:rPr>
-          <w:rFonts w:ascii="Helvetica" w:hAnsi="Helvetica" w:cs="Helvetica"/>
-          <w:sz w:val="24"/>
-          <w:sz-cs w:val="24"/>
-          <w:spacing w:val="0"/>
+          <w:rFonts w:ascii="Helvetica Neue" w:hAnsi="Helvetica Neue" w:cs="Helvetica Neue"/>
+          <w:sz w:val="24"/>
+          <w:sz-cs w:val="24"/>
+          <w:spacing w:val="0"/>
+          <w:color w:val="171E2D"/>
         </w:rPr>
         <w:t xml:space="preserve">: The project proved that low-cost field instrumentation combined with Git-backed storage and GitHub Actions CI/CD automation can deliver continuous, production-grade environmental surveillance at zero server cost.</w:t>
       </w:r>
@@ -3118,7 +3466,7 @@
       <w:pPr/>
       <w:r>
         <w:rPr>
-          <w:rFonts w:ascii="Helvetica" w:hAnsi="Helvetica" w:cs="Helvetica"/>
+          <w:rFonts w:ascii="Helvetica Neue" w:hAnsi="Helvetica Neue" w:cs="Helvetica Neue"/>
           <w:sz w:val="24"/>
           <w:sz-cs w:val="24"/>
           <w:spacing w:val="0"/>
@@ -3133,11 +3481,12 @@
       </w:pPr>
       <w:r>
         <w:rPr>
-          <w:rFonts w:ascii="Helvetica" w:hAnsi="Helvetica" w:cs="Helvetica"/>
+          <w:rFonts w:ascii="Helvetica Neue" w:hAnsi="Helvetica Neue" w:cs="Helvetica Neue"/>
           <w:sz w:val="36"/>
           <w:sz-cs w:val="36"/>
           <w:b/>
           <w:spacing w:val="0"/>
+          <w:color w:val="172A9F"/>
         </w:rPr>
         <w:t xml:space="preserve">CHAPTER 6: ACTIONABLE RECOMMENDATIONS</w:t>
       </w:r>
@@ -3148,11 +3497,12 @@
       </w:pPr>
       <w:r>
         <w:rPr>
-          <w:rFonts w:ascii="Helvetica" w:hAnsi="Helvetica" w:cs="Helvetica"/>
+          <w:rFonts w:ascii="Helvetica Neue" w:hAnsi="Helvetica Neue" w:cs="Helvetica Neue"/>
           <w:sz w:val="28"/>
           <w:sz-cs w:val="28"/>
           <w:b/>
           <w:spacing w:val="0"/>
+          <w:color w:val="171E2D"/>
         </w:rPr>
         <w:t xml:space="preserve">6.1 Urban Engineering &amp; Policy Interventions</w:t>
       </w:r>
@@ -3163,10 +3513,11 @@
       </w:pPr>
       <w:r>
         <w:rPr>
-          <w:rFonts w:ascii="Helvetica" w:hAnsi="Helvetica" w:cs="Helvetica"/>
-          <w:sz w:val="24"/>
-          <w:sz-cs w:val="24"/>
-          <w:b/>
+          <w:rFonts w:ascii="Helvetica Neue" w:hAnsi="Helvetica Neue" w:cs="Helvetica Neue"/>
+          <w:sz w:val="24"/>
+          <w:sz-cs w:val="24"/>
+          <w:b/>
+          <w:color w:val="171E2D"/>
         </w:rPr>
         <w:t xml:space="preserve"/>
         <w:tab/>
@@ -3176,20 +3527,22 @@
       </w:r>
       <w:r>
         <w:rPr>
-          <w:rFonts w:ascii="Helvetica" w:hAnsi="Helvetica" w:cs="Helvetica"/>
-          <w:sz w:val="24"/>
-          <w:sz-cs w:val="24"/>
-          <w:b/>
-          <w:spacing w:val="0"/>
+          <w:rFonts w:ascii="Helvetica Neue" w:hAnsi="Helvetica Neue" w:cs="Helvetica Neue"/>
+          <w:sz w:val="24"/>
+          <w:sz-cs w:val="24"/>
+          <w:b/>
+          <w:spacing w:val="0"/>
+          <w:color w:val="171E2D"/>
         </w:rPr>
         <w:t xml:space="preserve">Deployment of Vegetative Acoustic Barriers</w:t>
       </w:r>
       <w:r>
         <w:rPr>
-          <w:rFonts w:ascii="Helvetica" w:hAnsi="Helvetica" w:cs="Helvetica"/>
-          <w:sz w:val="24"/>
-          <w:sz-cs w:val="24"/>
-          <w:spacing w:val="0"/>
+          <w:rFonts w:ascii="Helvetica Neue" w:hAnsi="Helvetica Neue" w:cs="Helvetica Neue"/>
+          <w:sz w:val="24"/>
+          <w:sz-cs w:val="24"/>
+          <w:spacing w:val="0"/>
+          <w:color w:val="171E2D"/>
         </w:rPr>
         <w:t xml:space="preserve">: Plant dense, multi-layered native evergreen tree canopies along arterial flyovers and bypass roads to absorb sound energy and filter particulate matter.</w:t>
       </w:r>
@@ -3200,10 +3553,11 @@
       </w:pPr>
       <w:r>
         <w:rPr>
-          <w:rFonts w:ascii="Helvetica" w:hAnsi="Helvetica" w:cs="Helvetica"/>
-          <w:sz w:val="24"/>
-          <w:sz-cs w:val="24"/>
-          <w:b/>
+          <w:rFonts w:ascii="Helvetica Neue" w:hAnsi="Helvetica Neue" w:cs="Helvetica Neue"/>
+          <w:sz w:val="24"/>
+          <w:sz-cs w:val="24"/>
+          <w:b/>
+          <w:color w:val="171E2D"/>
         </w:rPr>
         <w:t xml:space="preserve"/>
         <w:tab/>
@@ -3213,20 +3567,22 @@
       </w:r>
       <w:r>
         <w:rPr>
-          <w:rFonts w:ascii="Helvetica" w:hAnsi="Helvetica" w:cs="Helvetica"/>
-          <w:sz w:val="24"/>
-          <w:sz-cs w:val="24"/>
-          <w:b/>
-          <w:spacing w:val="0"/>
+          <w:rFonts w:ascii="Helvetica Neue" w:hAnsi="Helvetica Neue" w:cs="Helvetica Neue"/>
+          <w:sz w:val="24"/>
+          <w:sz-cs w:val="24"/>
+          <w:b/>
+          <w:spacing w:val="0"/>
+          <w:color w:val="171E2D"/>
         </w:rPr>
         <w:t xml:space="preserve">Automated Acoustic Camera Enforcement</w:t>
       </w:r>
       <w:r>
         <w:rPr>
-          <w:rFonts w:ascii="Helvetica" w:hAnsi="Helvetica" w:cs="Helvetica"/>
-          <w:sz w:val="24"/>
-          <w:sz-cs w:val="24"/>
-          <w:spacing w:val="0"/>
+          <w:rFonts w:ascii="Helvetica Neue" w:hAnsi="Helvetica Neue" w:cs="Helvetica Neue"/>
+          <w:sz w:val="24"/>
+          <w:sz-cs w:val="24"/>
+          <w:spacing w:val="0"/>
+          <w:color w:val="171E2D"/>
         </w:rPr>
         <w:t xml:space="preserve">: Install directional microphone arrays connected to license-plate recognition cameras at major intersections to penalize vehicle horn abuse.</w:t>
       </w:r>
@@ -3237,10 +3593,11 @@
       </w:pPr>
       <w:r>
         <w:rPr>
-          <w:rFonts w:ascii="Helvetica" w:hAnsi="Helvetica" w:cs="Helvetica"/>
-          <w:sz w:val="24"/>
-          <w:sz-cs w:val="24"/>
-          <w:b/>
+          <w:rFonts w:ascii="Helvetica Neue" w:hAnsi="Helvetica Neue" w:cs="Helvetica Neue"/>
+          <w:sz w:val="24"/>
+          <w:sz-cs w:val="24"/>
+          <w:b/>
+          <w:color w:val="171E2D"/>
         </w:rPr>
         <w:t xml:space="preserve"/>
         <w:tab/>
@@ -3250,20 +3607,22 @@
       </w:r>
       <w:r>
         <w:rPr>
-          <w:rFonts w:ascii="Helvetica" w:hAnsi="Helvetica" w:cs="Helvetica"/>
-          <w:sz w:val="24"/>
-          <w:sz-cs w:val="24"/>
-          <w:b/>
-          <w:spacing w:val="0"/>
+          <w:rFonts w:ascii="Helvetica Neue" w:hAnsi="Helvetica Neue" w:cs="Helvetica Neue"/>
+          <w:sz w:val="24"/>
+          <w:sz-cs w:val="24"/>
+          <w:b/>
+          <w:spacing w:val="0"/>
+          <w:color w:val="171E2D"/>
         </w:rPr>
         <w:t xml:space="preserve">Pedestrianization of Commercial Corridors</w:t>
       </w:r>
       <w:r>
         <w:rPr>
-          <w:rFonts w:ascii="Helvetica" w:hAnsi="Helvetica" w:cs="Helvetica"/>
-          <w:sz w:val="24"/>
-          <w:sz-cs w:val="24"/>
-          <w:spacing w:val="0"/>
+          <w:rFonts w:ascii="Helvetica Neue" w:hAnsi="Helvetica Neue" w:cs="Helvetica Neue"/>
+          <w:sz w:val="24"/>
+          <w:sz-cs w:val="24"/>
+          <w:spacing w:val="0"/>
+          <w:color w:val="171E2D"/>
         </w:rPr>
         <w:t xml:space="preserve">: Implement weekend vehicle restrictions on historic market high-streets (e.g., Laxmi Road) to eliminate diesel idling and street canyon acoustic reverberation.</w:t>
       </w:r>
@@ -3274,11 +3633,12 @@
       </w:pPr>
       <w:r>
         <w:rPr>
-          <w:rFonts w:ascii="Helvetica" w:hAnsi="Helvetica" w:cs="Helvetica"/>
+          <w:rFonts w:ascii="Helvetica Neue" w:hAnsi="Helvetica Neue" w:cs="Helvetica Neue"/>
           <w:sz w:val="28"/>
           <w:sz-cs w:val="28"/>
           <w:b/>
           <w:spacing w:val="0"/>
+          <w:color w:val="171E2D"/>
         </w:rPr>
         <w:t xml:space="preserve">6.2 Occupational Health Measures</w:t>
       </w:r>
@@ -3289,10 +3649,11 @@
       </w:pPr>
       <w:r>
         <w:rPr>
-          <w:rFonts w:ascii="Helvetica" w:hAnsi="Helvetica" w:cs="Helvetica"/>
-          <w:sz w:val="24"/>
-          <w:sz-cs w:val="24"/>
-          <w:b/>
+          <w:rFonts w:ascii="Helvetica Neue" w:hAnsi="Helvetica Neue" w:cs="Helvetica Neue"/>
+          <w:sz w:val="24"/>
+          <w:sz-cs w:val="24"/>
+          <w:b/>
+          <w:color w:val="171E2D"/>
         </w:rPr>
         <w:t xml:space="preserve"/>
         <w:tab/>
@@ -3302,20 +3663,22 @@
       </w:r>
       <w:r>
         <w:rPr>
-          <w:rFonts w:ascii="Helvetica" w:hAnsi="Helvetica" w:cs="Helvetica"/>
-          <w:sz w:val="24"/>
-          <w:sz-cs w:val="24"/>
-          <w:b/>
-          <w:spacing w:val="0"/>
+          <w:rFonts w:ascii="Helvetica Neue" w:hAnsi="Helvetica Neue" w:cs="Helvetica Neue"/>
+          <w:sz w:val="24"/>
+          <w:sz-cs w:val="24"/>
+          <w:b/>
+          <w:spacing w:val="0"/>
+          <w:color w:val="171E2D"/>
         </w:rPr>
         <w:t xml:space="preserve">Mandatory Protective Gear for Traffic Personnel</w:t>
       </w:r>
       <w:r>
         <w:rPr>
-          <w:rFonts w:ascii="Helvetica" w:hAnsi="Helvetica" w:cs="Helvetica"/>
-          <w:sz w:val="24"/>
-          <w:sz-cs w:val="24"/>
-          <w:spacing w:val="0"/>
+          <w:rFonts w:ascii="Helvetica Neue" w:hAnsi="Helvetica Neue" w:cs="Helvetica Neue"/>
+          <w:sz w:val="24"/>
+          <w:sz-cs w:val="24"/>
+          <w:spacing w:val="0"/>
+          <w:color w:val="171E2D"/>
         </w:rPr>
         <w:t xml:space="preserve">: Provide certified N95 respirators and acoustic earplugs for traffic police officers stationed at high-exposure transit nodes.</w:t>
       </w:r>
@@ -3326,10 +3689,11 @@
       </w:pPr>
       <w:r>
         <w:rPr>
-          <w:rFonts w:ascii="Helvetica" w:hAnsi="Helvetica" w:cs="Helvetica"/>
-          <w:sz w:val="24"/>
-          <w:sz-cs w:val="24"/>
-          <w:b/>
+          <w:rFonts w:ascii="Helvetica Neue" w:hAnsi="Helvetica Neue" w:cs="Helvetica Neue"/>
+          <w:sz w:val="24"/>
+          <w:sz-cs w:val="24"/>
+          <w:b/>
+          <w:color w:val="171E2D"/>
         </w:rPr>
         <w:t xml:space="preserve"/>
         <w:tab/>
@@ -3339,20 +3703,22 @@
       </w:r>
       <w:r>
         <w:rPr>
-          <w:rFonts w:ascii="Helvetica" w:hAnsi="Helvetica" w:cs="Helvetica"/>
-          <w:sz w:val="24"/>
-          <w:sz-cs w:val="24"/>
-          <w:b/>
-          <w:spacing w:val="0"/>
+          <w:rFonts w:ascii="Helvetica Neue" w:hAnsi="Helvetica Neue" w:cs="Helvetica Neue"/>
+          <w:sz w:val="24"/>
+          <w:sz-cs w:val="24"/>
+          <w:b/>
+          <w:spacing w:val="0"/>
+          <w:color w:val="171E2D"/>
         </w:rPr>
         <w:t xml:space="preserve">Rotational Shift Scheduling</w:t>
       </w:r>
       <w:r>
         <w:rPr>
-          <w:rFonts w:ascii="Helvetica" w:hAnsi="Helvetica" w:cs="Helvetica"/>
-          <w:sz w:val="24"/>
-          <w:sz-cs w:val="24"/>
-          <w:spacing w:val="0"/>
+          <w:rFonts w:ascii="Helvetica Neue" w:hAnsi="Helvetica Neue" w:cs="Helvetica Neue"/>
+          <w:sz w:val="24"/>
+          <w:sz-cs w:val="24"/>
+          <w:spacing w:val="0"/>
+          <w:color w:val="171E2D"/>
         </w:rPr>
         <w:t xml:space="preserve">: Restrict continuous duty at high-noise intersections to maximum 4-hour shifts, followed by rotation to lower-exposure beats.</w:t>
       </w:r>
@@ -3361,7 +3727,7 @@
       <w:pPr/>
       <w:r>
         <w:rPr>
-          <w:rFonts w:ascii="Helvetica" w:hAnsi="Helvetica" w:cs="Helvetica"/>
+          <w:rFonts w:ascii="Helvetica Neue" w:hAnsi="Helvetica Neue" w:cs="Helvetica Neue"/>
           <w:sz w:val="24"/>
           <w:sz-cs w:val="24"/>
           <w:spacing w:val="0"/>
@@ -3376,11 +3742,12 @@
       </w:pPr>
       <w:r>
         <w:rPr>
-          <w:rFonts w:ascii="Helvetica" w:hAnsi="Helvetica" w:cs="Helvetica"/>
+          <w:rFonts w:ascii="Helvetica Neue" w:hAnsi="Helvetica Neue" w:cs="Helvetica Neue"/>
           <w:sz w:val="36"/>
           <w:sz-cs w:val="36"/>
           <w:b/>
           <w:spacing w:val="0"/>
+          <w:color w:val="172A9F"/>
         </w:rPr>
         <w:t xml:space="preserve">REFERENCES</w:t>
       </w:r>
@@ -3391,9 +3758,10 @@
       </w:pPr>
       <w:r>
         <w:rPr>
-          <w:rFonts w:ascii="Helvetica" w:hAnsi="Helvetica" w:cs="Helvetica"/>
-          <w:sz w:val="24"/>
-          <w:sz-cs w:val="24"/>
+          <w:rFonts w:ascii="Helvetica Neue" w:hAnsi="Helvetica Neue" w:cs="Helvetica Neue"/>
+          <w:sz w:val="24"/>
+          <w:sz-cs w:val="24"/>
+          <w:color w:val="171E2D"/>
         </w:rPr>
         <w:t xml:space="preserve"/>
         <w:tab/>
@@ -3403,29 +3771,32 @@
       </w:r>
       <w:r>
         <w:rPr>
-          <w:rFonts w:ascii="Helvetica" w:hAnsi="Helvetica" w:cs="Helvetica"/>
-          <w:sz w:val="24"/>
-          <w:sz-cs w:val="24"/>
-          <w:spacing w:val="0"/>
+          <w:rFonts w:ascii="Helvetica Neue" w:hAnsi="Helvetica Neue" w:cs="Helvetica Neue"/>
+          <w:sz w:val="24"/>
+          <w:sz-cs w:val="24"/>
+          <w:spacing w:val="0"/>
+          <w:color w:val="171E2D"/>
         </w:rPr>
         <w:t xml:space="preserve">World Health Organization (WHO), </w:t>
       </w:r>
       <w:r>
         <w:rPr>
-          <w:rFonts w:ascii="Helvetica" w:hAnsi="Helvetica" w:cs="Helvetica"/>
+          <w:rFonts w:ascii="Helvetica Neue" w:hAnsi="Helvetica Neue" w:cs="Helvetica Neue"/>
           <w:sz w:val="24"/>
           <w:sz-cs w:val="24"/>
           <w:i/>
           <w:spacing w:val="0"/>
+          <w:color w:val="171E2D"/>
         </w:rPr>
         <w:t xml:space="preserve">"Environmental Noise Guidelines for the European Region"</w:t>
       </w:r>
       <w:r>
         <w:rPr>
-          <w:rFonts w:ascii="Helvetica" w:hAnsi="Helvetica" w:cs="Helvetica"/>
-          <w:sz w:val="24"/>
-          <w:sz-cs w:val="24"/>
-          <w:spacing w:val="0"/>
+          <w:rFonts w:ascii="Helvetica Neue" w:hAnsi="Helvetica Neue" w:cs="Helvetica Neue"/>
+          <w:sz w:val="24"/>
+          <w:sz-cs w:val="24"/>
+          <w:spacing w:val="0"/>
+          <w:color w:val="171E2D"/>
         </w:rPr>
         <w:t xml:space="preserve">, Copenhagen, 2018.</w:t>
       </w:r>
@@ -3436,9 +3807,10 @@
       </w:pPr>
       <w:r>
         <w:rPr>
-          <w:rFonts w:ascii="Helvetica" w:hAnsi="Helvetica" w:cs="Helvetica"/>
-          <w:sz w:val="24"/>
-          <w:sz-cs w:val="24"/>
+          <w:rFonts w:ascii="Helvetica Neue" w:hAnsi="Helvetica Neue" w:cs="Helvetica Neue"/>
+          <w:sz w:val="24"/>
+          <w:sz-cs w:val="24"/>
+          <w:color w:val="171E2D"/>
         </w:rPr>
         <w:t xml:space="preserve"/>
         <w:tab/>
@@ -3448,29 +3820,32 @@
       </w:r>
       <w:r>
         <w:rPr>
-          <w:rFonts w:ascii="Helvetica" w:hAnsi="Helvetica" w:cs="Helvetica"/>
-          <w:sz w:val="24"/>
-          <w:sz-cs w:val="24"/>
-          <w:spacing w:val="0"/>
+          <w:rFonts w:ascii="Helvetica Neue" w:hAnsi="Helvetica Neue" w:cs="Helvetica Neue"/>
+          <w:sz w:val="24"/>
+          <w:sz-cs w:val="24"/>
+          <w:spacing w:val="0"/>
+          <w:color w:val="171E2D"/>
         </w:rPr>
         <w:t xml:space="preserve">United States Environmental Protection Agency (US-EPA), </w:t>
       </w:r>
       <w:r>
         <w:rPr>
-          <w:rFonts w:ascii="Helvetica" w:hAnsi="Helvetica" w:cs="Helvetica"/>
+          <w:rFonts w:ascii="Helvetica Neue" w:hAnsi="Helvetica Neue" w:cs="Helvetica Neue"/>
           <w:sz w:val="24"/>
           <w:sz-cs w:val="24"/>
           <w:i/>
           <w:spacing w:val="0"/>
+          <w:color w:val="171E2D"/>
         </w:rPr>
         <w:t xml:space="preserve">"Technical Assistance Document for Reporting Daily Air Quality (AQI)"</w:t>
       </w:r>
       <w:r>
         <w:rPr>
-          <w:rFonts w:ascii="Helvetica" w:hAnsi="Helvetica" w:cs="Helvetica"/>
-          <w:sz w:val="24"/>
-          <w:sz-cs w:val="24"/>
-          <w:spacing w:val="0"/>
+          <w:rFonts w:ascii="Helvetica Neue" w:hAnsi="Helvetica Neue" w:cs="Helvetica Neue"/>
+          <w:sz w:val="24"/>
+          <w:sz-cs w:val="24"/>
+          <w:spacing w:val="0"/>
+          <w:color w:val="171E2D"/>
         </w:rPr>
         <w:t xml:space="preserve">, EPA-454/B-18-007, 2018.</w:t>
       </w:r>
@@ -3481,9 +3856,10 @@
       </w:pPr>
       <w:r>
         <w:rPr>
-          <w:rFonts w:ascii="Helvetica" w:hAnsi="Helvetica" w:cs="Helvetica"/>
-          <w:sz w:val="24"/>
-          <w:sz-cs w:val="24"/>
+          <w:rFonts w:ascii="Helvetica Neue" w:hAnsi="Helvetica Neue" w:cs="Helvetica Neue"/>
+          <w:sz w:val="24"/>
+          <w:sz-cs w:val="24"/>
+          <w:color w:val="171E2D"/>
         </w:rPr>
         <w:t xml:space="preserve"/>
         <w:tab/>
@@ -3493,35 +3869,38 @@
       </w:r>
       <w:r>
         <w:rPr>
-          <w:rFonts w:ascii="Helvetica" w:hAnsi="Helvetica" w:cs="Helvetica"/>
-          <w:sz w:val="24"/>
-          <w:sz-cs w:val="24"/>
-          <w:spacing w:val="0"/>
+          <w:rFonts w:ascii="Helvetica Neue" w:hAnsi="Helvetica Neue" w:cs="Helvetica Neue"/>
+          <w:sz w:val="24"/>
+          <w:sz-cs w:val="24"/>
+          <w:spacing w:val="0"/>
+          <w:color w:val="171E2D"/>
         </w:rPr>
         <w:t xml:space="preserve">World Air Quality Index Project, </w:t>
       </w:r>
       <w:r>
         <w:rPr>
-          <w:rFonts w:ascii="Helvetica" w:hAnsi="Helvetica" w:cs="Helvetica"/>
+          <w:rFonts w:ascii="Helvetica Neue" w:hAnsi="Helvetica Neue" w:cs="Helvetica Neue"/>
           <w:sz w:val="24"/>
           <w:sz-cs w:val="24"/>
           <w:i/>
           <w:spacing w:val="0"/>
+          <w:color w:val="171E2D"/>
         </w:rPr>
         <w:t xml:space="preserve">"WAQI Data Platform Documentation"</w:t>
       </w:r>
       <w:r>
         <w:rPr>
-          <w:rFonts w:ascii="Helvetica" w:hAnsi="Helvetica" w:cs="Helvetica"/>
-          <w:sz w:val="24"/>
-          <w:sz-cs w:val="24"/>
-          <w:spacing w:val="0"/>
+          <w:rFonts w:ascii="Helvetica Neue" w:hAnsi="Helvetica Neue" w:cs="Helvetica Neue"/>
+          <w:sz w:val="24"/>
+          <w:sz-cs w:val="24"/>
+          <w:spacing w:val="0"/>
+          <w:color w:val="171E2D"/>
         </w:rPr>
         <w:t xml:space="preserve">, </w:t>
       </w:r>
       <w:r>
         <w:rPr>
-          <w:rFonts w:ascii="Helvetica" w:hAnsi="Helvetica" w:cs="Helvetica"/>
+          <w:rFonts w:ascii="Helvetica Neue" w:hAnsi="Helvetica Neue" w:cs="Helvetica Neue"/>
           <w:sz w:val="24"/>
           <w:sz-cs w:val="24"/>
           <w:u w:val="single"/>
@@ -3532,10 +3911,11 @@
       </w:r>
       <w:r>
         <w:rPr>
-          <w:rFonts w:ascii="Helvetica" w:hAnsi="Helvetica" w:cs="Helvetica"/>
-          <w:sz w:val="24"/>
-          <w:sz-cs w:val="24"/>
-          <w:spacing w:val="0"/>
+          <w:rFonts w:ascii="Helvetica Neue" w:hAnsi="Helvetica Neue" w:cs="Helvetica Neue"/>
+          <w:sz w:val="24"/>
+          <w:sz-cs w:val="24"/>
+          <w:spacing w:val="0"/>
+          <w:color w:val="171E2D"/>
         </w:rPr>
         <w:t xml:space="preserve">.</w:t>
       </w:r>
@@ -3546,9 +3926,10 @@
       </w:pPr>
       <w:r>
         <w:rPr>
-          <w:rFonts w:ascii="Helvetica" w:hAnsi="Helvetica" w:cs="Helvetica"/>
-          <w:sz w:val="24"/>
-          <w:sz-cs w:val="24"/>
+          <w:rFonts w:ascii="Helvetica Neue" w:hAnsi="Helvetica Neue" w:cs="Helvetica Neue"/>
+          <w:sz w:val="24"/>
+          <w:sz-cs w:val="24"/>
+          <w:color w:val="171E2D"/>
         </w:rPr>
         <w:t xml:space="preserve"/>
         <w:tab/>
@@ -3558,35 +3939,38 @@
       </w:r>
       <w:r>
         <w:rPr>
-          <w:rFonts w:ascii="Helvetica" w:hAnsi="Helvetica" w:cs="Helvetica"/>
-          <w:sz w:val="24"/>
-          <w:sz-cs w:val="24"/>
-          <w:spacing w:val="0"/>
+          <w:rFonts w:ascii="Helvetica Neue" w:hAnsi="Helvetica Neue" w:cs="Helvetica Neue"/>
+          <w:sz w:val="24"/>
+          <w:sz-cs w:val="24"/>
+          <w:spacing w:val="0"/>
+          <w:color w:val="171E2D"/>
         </w:rPr>
         <w:t xml:space="preserve">Open-Meteo, </w:t>
       </w:r>
       <w:r>
         <w:rPr>
-          <w:rFonts w:ascii="Helvetica" w:hAnsi="Helvetica" w:cs="Helvetica"/>
+          <w:rFonts w:ascii="Helvetica Neue" w:hAnsi="Helvetica Neue" w:cs="Helvetica Neue"/>
           <w:sz w:val="24"/>
           <w:sz-cs w:val="24"/>
           <w:i/>
           <w:spacing w:val="0"/>
+          <w:color w:val="171E2D"/>
         </w:rPr>
         <w:t xml:space="preserve">"Global Air Quality API Documentation"</w:t>
       </w:r>
       <w:r>
         <w:rPr>
-          <w:rFonts w:ascii="Helvetica" w:hAnsi="Helvetica" w:cs="Helvetica"/>
-          <w:sz w:val="24"/>
-          <w:sz-cs w:val="24"/>
-          <w:spacing w:val="0"/>
+          <w:rFonts w:ascii="Helvetica Neue" w:hAnsi="Helvetica Neue" w:cs="Helvetica Neue"/>
+          <w:sz w:val="24"/>
+          <w:sz-cs w:val="24"/>
+          <w:spacing w:val="0"/>
+          <w:color w:val="171E2D"/>
         </w:rPr>
         <w:t xml:space="preserve">, </w:t>
       </w:r>
       <w:r>
         <w:rPr>
-          <w:rFonts w:ascii="Helvetica" w:hAnsi="Helvetica" w:cs="Helvetica"/>
+          <w:rFonts w:ascii="Helvetica Neue" w:hAnsi="Helvetica Neue" w:cs="Helvetica Neue"/>
           <w:sz w:val="24"/>
           <w:sz-cs w:val="24"/>
           <w:u w:val="single"/>
@@ -3597,10 +3981,11 @@
       </w:r>
       <w:r>
         <w:rPr>
-          <w:rFonts w:ascii="Helvetica" w:hAnsi="Helvetica" w:cs="Helvetica"/>
-          <w:sz w:val="24"/>
-          <w:sz-cs w:val="24"/>
-          <w:spacing w:val="0"/>
+          <w:rFonts w:ascii="Helvetica Neue" w:hAnsi="Helvetica Neue" w:cs="Helvetica Neue"/>
+          <w:sz w:val="24"/>
+          <w:sz-cs w:val="24"/>
+          <w:spacing w:val="0"/>
+          <w:color w:val="171E2D"/>
         </w:rPr>
         <w:t xml:space="preserve">.</w:t>
       </w:r>

</xml_diff>